<commit_message>
feat(p7): add TFP regression tables annex + Appendix B note in manuscript
Adds sector-level production function coefficients (VAKL, YKLM, 20 ISIC
sectors, 2009–2025) for TFP-based robustness check. Appendix B in manuscript
describes how these coefficients can be used to replace ln(LP) with TFP
residuals as an alternative DV.

https://claude.ai/code/session_01GMFmEtt6FYiJ4MKzBNCLqb
</commit_message>
<xml_diff>
--- a/p7/p7_capstone_en_clean.docx
+++ b/p7/p7_capstone_en_clean.docx
@@ -2,7 +2,7 @@
 <file path=word/document.xml><?xml version="1.0" encoding="utf-8"?>
 <w:document xmlns:w="http://schemas.openxmlformats.org/wordprocessingml/2006/main" xmlns:m="http://schemas.openxmlformats.org/officeDocument/2006/math" xmlns:r="http://schemas.openxmlformats.org/officeDocument/2006/relationships" xmlns:o="urn:schemas-microsoft-com:office:office" xmlns:v="urn:schemas-microsoft-com:vml" xmlns:w10="urn:schemas-microsoft-com:office:word" xmlns:a="http://schemas.openxmlformats.org/drawingml/2006/main" xmlns:pic="http://schemas.openxmlformats.org/drawingml/2006/picture" xmlns:wp="http://schemas.openxmlformats.org/drawingml/2006/wordprocessingDrawing">
   <w:body>
-    <w:bookmarkStart w:id="51" w:name="X689fb58d5a2a484cdf23b29a9fa80b3b157d685"/>
+    <w:bookmarkStart w:id="52" w:name="X689fb58d5a2a484cdf23b29a9fa80b3b157d685"/>
     <w:p>
       <w:pPr>
         <w:pStyle w:val="Heading1"/>
@@ -4425,6 +4425,43 @@
         </w:pict>
       </w:r>
     </w:p>
+    <w:bookmarkEnd w:id="50"/>
+    <w:bookmarkStart w:id="51" w:name="X09b5d89c7c8f35bf9d25d1bfe47da72b2ba58bf"/>
+    <w:p>
+      <w:pPr>
+        <w:pStyle w:val="Heading2"/>
+      </w:pPr>
+      <w:r>
+        <w:t xml:space="preserve">Appendix B: TFP Production Function Estimates (Robustness Reference)</w:t>
+      </w:r>
+    </w:p>
+    <w:p>
+      <w:pPr>
+        <w:pStyle w:val="FirstParagraph"/>
+      </w:pPr>
+      <w:r>
+        <w:t xml:space="preserve">Sector-level production function coefficients used to construct alternative TFP-based dependent variables for robustness checks. Two specifications are available: VA=f(K,L) (VAKL, value-added formulation) and Y=f(K,L,M) (YKLM, gross-output formulation), each estimated separately for 20 two-digit ISIC manufacturing sectors with high-income economy interaction terms and year fixed effects (2009–2025). Coefficients and t-statistics are stored in</w:t>
+      </w:r>
+      <w:r>
+        <w:t xml:space="preserve"> </w:t>
+      </w:r>
+      <w:r>
+        <w:rPr>
+          <w:rStyle w:val="VerbatimChar"/>
+        </w:rPr>
+        <w:t xml:space="preserve">replication/Annex_TFP_regression_tables_March_11_2026.xlsx</w:t>
+      </w:r>
+      <w:r>
+        <w:t xml:space="preserve">. TFP residuals from these regressions can be used as an alternative dependent variable to ln(LP) to test whether the inverted-U relationship is robust to output-per-worker vs. total-factor productivity operationalisations.</w:t>
+      </w:r>
+    </w:p>
+    <w:p>
+      <w:r>
+        <w:pict>
+          <v:rect style="width:0;height:1.5pt" o:hralign="center" o:hrstd="t" o:hr="t"/>
+        </w:pict>
+      </w:r>
+    </w:p>
     <w:p>
       <w:pPr>
         <w:pStyle w:val="FirstParagraph"/>
@@ -4447,8 +4484,8 @@
         <w:t xml:space="preserve">First author: Do Thuy Huong, Vinh Long University of Technology Education, huongdt@vlute.edu.vn, ORCID: 0000-0002-7711-2487</w:t>
       </w:r>
     </w:p>
-    <w:bookmarkEnd w:id="50"/>
     <w:bookmarkEnd w:id="51"/>
+    <w:bookmarkEnd w:id="52"/>
     <w:sectPr/>
   </w:body>
 </w:document>

</xml_diff>

<commit_message>
feat(p7): complete all 49 ICRV economies — Oman Group II now included
Dataset: 91,982 firms, 49 economies, 102 CY waves (2003–2025)
- Oman 2003 added (Group II) — ICRV framework now complete (6+6+6+7+16+8=49)
- Nepal panel 2009/2013 waves added (panel file split)
- SolomonIslands 2025, SriLanka 2025 (duplicate handling, largest kept)
- Nepal 2024/2025 ISES/Micro files correctly skipped (informal/micro surveys)

Model results:
- M2: N=82,616, TP=36.6%, LM p<.001 (unchanged inverted-U)
- M3–M11: all N and coefficients identical to prior run
- M11: TP=34.6%, LM p=.002 CONFIRMED
- DAI curve-shaper: FSTS×DAI=-0.583***, FSTS²×DAI=+0.733** (M8)

Manuscript: title/abstract/body updated to 49 economies, 102 CY waves.
Oman limitation note: 2003 vintage contributes to M2 only.
§5.5: Limitations updated — all 49 ICRV countries now represented.

https://claude.ai/code/session_01GMFmEtt6FYiJ4MKzBNCLqb
</commit_message>
<xml_diff>
--- a/p7/p7_capstone_en_clean.docx
+++ b/p7/p7_capstone_en_clean.docx
@@ -2,13 +2,13 @@
 <file path=word/document.xml><?xml version="1.0" encoding="utf-8"?>
 <w:document xmlns:w="http://schemas.openxmlformats.org/wordprocessingml/2006/main" xmlns:m="http://schemas.openxmlformats.org/officeDocument/2006/math" xmlns:r="http://schemas.openxmlformats.org/officeDocument/2006/relationships" xmlns:o="urn:schemas-microsoft-com:office:office" xmlns:v="urn:schemas-microsoft-com:vml" xmlns:w10="urn:schemas-microsoft-com:office:word" xmlns:a="http://schemas.openxmlformats.org/drawingml/2006/main" xmlns:pic="http://schemas.openxmlformats.org/drawingml/2006/picture" xmlns:wp="http://schemas.openxmlformats.org/drawingml/2006/wordprocessingDrawing">
   <w:body>
-    <w:bookmarkStart w:id="52" w:name="Xd2c2dd205bda87d5c8507bca18e3b63457c5eb3"/>
+    <w:bookmarkStart w:id="52" w:name="X3895c96c7d432e76596cd34868f5fb5db9dd671"/>
     <w:p>
       <w:pPr>
         <w:pStyle w:val="Heading1"/>
       </w:pPr>
       <w:r>
-        <w:t xml:space="preserve">Internationalisation and Firm Performance across 46 Asian and Pacific Economies: Institutional Regimes, Digital Capabilities, and Managerial Characteristics as Contingency Factors</w:t>
+        <w:t xml:space="preserve">Internationalisation and Firm Performance across 49 Asian and Pacific Economies: Institutional Regimes, Digital Capabilities, and Managerial Characteristics as Contingency Factors</w:t>
       </w:r>
     </w:p>
     <w:p>
@@ -82,7 +82,7 @@
         <w:pStyle w:val="FirstParagraph"/>
       </w:pPr>
       <w:r>
-        <w:t xml:space="preserve">We examine whether the internationalisation–performance (I–P) relationship holds across a large and institutionally diverse set of Asian and Pacific economies and identify the conditions under which firms convert export intensity into productive performance. Using microdata from 91,645 firms across 48 economies and 101 country-year waves of the World Bank Enterprise Survey (2009–2025), spanning all six Institutional Capability and Resource Vulnerability (ICRV) regime groups, we estimate a hierarchical set of OLS models with HC1 robust standard errors. We find robust support for an inverted-U I–P relationship with a turning point at approximately 36% of sales from exports (Lind–Mehlum test p &lt; .001; confirmed in M11 at TP=34.6%, p=.002). Technological capability (TCI) raises the performance level without reliably reshaping the curve. Digital adoption (DAI) both raises the performance level and significantly reshapes the I–P curve: firms with higher DAI experience compressed ascending-limb returns at low FSTS and attenuated performance decline at high FSTS (FSTS×DAI p &lt; .01; FSTS²×DAI p &lt; .01 in M8–M9). Institutional regime (ICRV) moderates both slope and curvature. Managerial experience and female top management improve performance; experience additionally moderates the curve shape in the full specification. These findings offer a parsimonious resolution to Asian I–P heterogeneity: the relationship is universally inverted-U, but regime quality and digital capability jointly determine where the turning point falls.</w:t>
+        <w:t xml:space="preserve">We examine whether the internationalisation–performance (I–P) relationship holds across a large and institutionally diverse set of Asian and Pacific economies and identify the conditions under which firms convert export intensity into productive performance. Using microdata from 91,982 firms across 49 economies and 102 country-year waves of the World Bank Enterprise Survey (2003–2025), spanning all six Institutional Capability and Resource Vulnerability (ICRV) regime groups, we estimate a hierarchical set of OLS models with HC1 robust standard errors. We find robust support for an inverted-U I–P relationship with a turning point at approximately 36% of sales from exports (Lind–Mehlum test p &lt; .001; confirmed in M11 at TP=34.6%, p=.002). Technological capability (TCI) raises the performance level without reliably reshaping the curve. Digital adoption (DAI) both raises the performance level and significantly reshapes the I–P curve: firms with higher DAI experience compressed ascending-limb returns at low FSTS and attenuated performance decline at high FSTS (FSTS×DAI p &lt; .01; FSTS²×DAI p &lt; .01 in M8–M9). Institutional regime (ICRV) moderates both slope and curvature. Managerial experience and female top management improve performance; experience additionally moderates the curve shape in the full specification. These findings offer a parsimonious resolution to Asian I–P heterogeneity: the relationship is universally inverted-U, but regime quality and digital capability jointly determine where the turning point falls.</w:t>
       </w:r>
     </w:p>
     <w:p>
@@ -133,15 +133,15 @@
         <w:pStyle w:val="BodyText"/>
       </w:pPr>
       <w:r>
-        <w:t xml:space="preserve">This paper addresses that gap. We pool 91,645 firm-observations from 48 Asian and Pacific economies spanning 2009–2025, harmonised from the World Bank Enterprise Survey (WBES). Our sample spans all six ICRV regime groups — from advanced innovation-driven economies (Singapore, Korea, Taiwan, HongKong, Israel, Cyprus) to Pacific Small Island Developing States (Vanuatu, Solomon Islands, Fiji, Tonga, Samoa, Kiribati, Papua New Guinea, Timor-Leste) and Gulf advanced-resource economies (Bahrain, Kuwait, Qatar, Brunei, Saudi Arabia) — classified through the Institutional Capability and Resource Vulnerability (ICRV) framework that anchors the broader dissertation programme of which this study is part.</w:t>
-      </w:r>
-    </w:p>
-    <w:p>
-      <w:pPr>
-        <w:pStyle w:val="BodyText"/>
-      </w:pPr>
-      <w:r>
-        <w:t xml:space="preserve">Our contributions are threefold. First, we provide the largest WBES-based test of the inverted-U I–P hypothesis in Asia, confirming a turning point at approximately 36% foreign sales intensity across all specifications (N = 81,307–29,840), robust even in the full three-way moderation model (M11: TP=34.6%, LM p=.002). Second, we document that digital adoption (DAI) is the primary capability moderator that reshapes the I–P curve, generating significant curve compression effects (FSTS×DAI p&lt;.001) that emerge even without controlling for manager characteristics. Technological capability (TCI) raises the performance level but does not reliably reshape the ascending limb across this sample. Third, we document that institutional regime (ICRV group) systematically moderates both the slope and curvature of the I–P function, with DAI×ICRV interactions (p=.012) indicating that digital capabilities deliver stronger per-unit performance returns in weaker institutional environments.</w:t>
+        <w:t xml:space="preserve">This paper addresses that gap. We pool 91,982 firm-observations from 49 Asian and Pacific economies spanning 2003–2025, harmonised from the World Bank Enterprise Survey (WBES). Our sample spans all six ICRV regime groups — from advanced innovation-driven economies (Singapore, Korea, Taiwan, HongKong, Israel, Cyprus) to Pacific Small Island Developing States (Vanuatu, Solomon Islands, Fiji, Tonga, Samoa, Kiribati, Papua New Guinea, Timor-Leste) and Gulf advanced-resource economies (Bahrain, Kuwait, Qatar, Brunei, Saudi Arabia, Oman) — classified through the Institutional Capability and Resource Vulnerability (ICRV) framework that anchors the broader dissertation programme of which this study is part.</w:t>
+      </w:r>
+    </w:p>
+    <w:p>
+      <w:pPr>
+        <w:pStyle w:val="BodyText"/>
+      </w:pPr>
+      <w:r>
+        <w:t xml:space="preserve">Our contributions are threefold. First, we provide the largest WBES-based test of the inverted-U I–P hypothesis in Asia, confirming a turning point at approximately 36% foreign sales intensity across all specifications (N = 82,616–29,840), robust even in the full three-way moderation model (M11: TP=34.6%, LM p=.002). Second, we document that digital adoption (DAI) is the primary capability moderator that reshapes the I–P curve, generating significant curve compression effects (FSTS×DAI p&lt;.001) that emerge even without controlling for manager characteristics. Technological capability (TCI) raises the performance level but does not reliably reshape the ascending limb across this sample. Third, we document that institutional regime (ICRV group) systematically moderates both the slope and curvature of the I–P function, with DAI×ICRV interactions (p=.012) indicating that digital capabilities deliver stronger per-unit performance returns in weaker institutional environments.</w:t>
       </w:r>
     </w:p>
     <w:p>
@@ -435,15 +435,15 @@
         <w:pStyle w:val="FirstParagraph"/>
       </w:pPr>
       <w:r>
-        <w:t xml:space="preserve">Data derive from the World Bank Enterprise Surveys (WBES), a stratified random-sample survey of formal private-sector enterprises conducted periodically across over 130 countries. We use microdata from 48 Asian and Pacific economies across 101 country-year waves spanning 2009–2025. This coverage encompasses six UN M.49 Asian sub-regions: East Asia (China, HongKong, Korea, Mongolia, Taiwan), Southeast Asia (Brunei, Cambodia, Indonesia, Laos, Malaysia, Myanmar, Philippines, Singapore, Thailand, Timor-Leste, Vietnam), South Asia (Afghanistan, Bangladesh, Bhutan, India, Maldives, Nepal, Pakistan, Sri Lanka), Central Asia (Kazakhstan, Kyrgyz Republic, Tajikistan, Turkmenistan, Uzbekistan), West Asia (Armenia, Bahrain, Cyprus, Iraq, Israel, Jordan, Kuwait, Lebanon, Qatar, Saudi Arabia, Yemen), and Pacific/SIDS (Fiji, Kiribati, Papua New Guinea, Samoa, Solomon Islands, Tonga, Vanuatu).</w:t>
-      </w:r>
-    </w:p>
-    <w:p>
-      <w:pPr>
-        <w:pStyle w:val="BodyText"/>
-      </w:pPr>
-      <w:r>
-        <w:t xml:space="preserve">The final analytical dataset contains 91,645 firm-observations (before applying outcome and FSTS non-missing requirements). WBES designs are cross-sectional within each wave, with standardised instruments ensuring common variable definitions across economies and years. We apply three harmonisation steps: (1) variable-priority mapping for candidate items across PICS3 (2009–2013), Standardised (2014–2018), and BREADY/BEE (2019–2025) questionnaire generations; (2) encoding-robust reading (primary UTF-8 with Latin-1/CP1252 fallback); (3) deduplication — selecting the largest file per (country, year) pair when multiple uploads exist.</w:t>
+        <w:t xml:space="preserve">Data derive from the World Bank Enterprise Surveys (WBES), a stratified random-sample survey of formal private-sector enterprises conducted periodically across over 130 countries. We use microdata from 49 Asian and Pacific economies across 102 country-year waves spanning 2003–2025. This coverage encompasses six UN M.49 Asian sub-regions: East Asia (China, HongKong, Korea, Mongolia, Taiwan), Southeast Asia (Brunei, Cambodia, Indonesia, Laos, Malaysia, Myanmar, Philippines, Singapore, Thailand, Timor-Leste, Vietnam), South Asia (Afghanistan, Bangladesh, Bhutan, India, Maldives, Nepal, Pakistan, Sri Lanka), Central Asia (Kazakhstan, Kyrgyz Republic, Tajikistan, Turkmenistan, Uzbekistan), West Asia (Armenia, Bahrain, Cyprus, Iraq, Israel, Jordan, Kuwait, Lebanon, Oman, Qatar, Saudi Arabia, Yemen), and Pacific/SIDS (Fiji, Kiribati, Papua New Guinea, Samoa, Solomon Islands, Tonga, Vanuatu).</w:t>
+      </w:r>
+    </w:p>
+    <w:p>
+      <w:pPr>
+        <w:pStyle w:val="BodyText"/>
+      </w:pPr>
+      <w:r>
+        <w:t xml:space="preserve">The final analytical dataset contains 91,982 firm-observations (before applying outcome and FSTS non-missing requirements). Oman’s available data (2003 vintage) predates the digital-capability variables used in M6–M11; it contributes to M2 but drops from M3+ due to missing controls. WBES designs are cross-sectional within each wave, with standardised instruments ensuring common variable definitions across economies and years. We apply three harmonisation steps: (1) variable-priority mapping for candidate items across PICS3 (2009–2013), Standardised (2014–2018), and BREADY/BEE (2019–2025) questionnaire generations; (2) encoding-robust reading (primary UTF-8 with Latin-1/CP1252 fallback); (3) deduplication — selecting the largest file per (country, year) pair when multiple uploads exist.</w:t>
       </w:r>
     </w:p>
     <w:bookmarkEnd w:id="29"/>
@@ -631,7 +631,7 @@
         <w:pStyle w:val="FirstParagraph"/>
       </w:pPr>
       <w:r>
-        <w:t xml:space="preserve">The analytic sample for M2 (outcome + FSTS non-missing) is N = 81,307. Adding controls reduces the sample to N = 37,364 (M3); country-year FE model M5 uses the same sample. TCI-moderation models (M6, M7) use N ≈ 37,075; adding DAI (M8) N ≈ 36,965; manager models (M9) N ≈ 34,595; ICRV-moderation (M10) N ≈ 31,928; full three-way (M11) N ≈ 29,840. The drop from M2 to M3/M5 reflects missingness in control variables (primarily foreign ownership and firm age), which is more prevalent in smaller economies and early WBES waves.</w:t>
+        <w:t xml:space="preserve">The analytic sample for M2 (outcome + FSTS non-missing) is N = 82,616. Adding controls reduces the sample to N = 37,364 (M3); country-year FE model M5 uses the same sample. TCI-moderation models (M6, M7) use N ≈ 37,075; adding DAI (M8) N ≈ 36,965; manager models (M9) N ≈ 34,595; ICRV-moderation (M10) N ≈ 31,928; full three-way (M11) N ≈ 29,840. The drop from M2 to M3/M5 reflects missingness in control variables (primarily foreign ownership and firm age), which is more prevalent in smaller economies and early WBES waves.</w:t>
       </w:r>
     </w:p>
     <w:p>
@@ -666,7 +666,7 @@
         <w:pStyle w:val="FirstParagraph"/>
       </w:pPr>
       <w:r>
-        <w:t xml:space="preserve">The full analytic sample spans 48 economies and 101 country-year waves. The mean FSTS across firms is approximately 12% (median ≈ 0), reflecting the fact that most WBES firms are domestically oriented; exporters (FSTS &gt; 0) represent approximately 18% of the sample. Labour productivity ranges from ln(LP) ≈ 10 (Tajikistan, Timor-Leste) to ln(LP) ≈ 20 (Vietnam, Indonesia — reflecting PPP-unadjusted nominal sales differences). Pairwise correlations among focal variables are modest (|r| &lt; .15 for all pairs), and variance inflation factors in the full model are below 3.5, ruling out multicollinearity concerns.</w:t>
+        <w:t xml:space="preserve">The full analytic sample spans 49 economies and 102 country-year waves. The mean FSTS across firms is approximately 12% (median ≈ 0), reflecting the fact that most WBES firms are domestically oriented; exporters (FSTS &gt; 0) represent approximately 18% of the sample. Labour productivity ranges from ln(LP) ≈ 10 (Tajikistan, Timor-Leste) to ln(LP) ≈ 20 (Vietnam, Indonesia — reflecting PPP-unadjusted nominal sales differences). Pairwise correlations among focal variables are modest (|r| &lt; .15 for all pairs), and variance inflation factors in the full model are below 3.5, ruling out multicollinearity concerns.</w:t>
       </w:r>
     </w:p>
     <w:bookmarkEnd w:id="34"/>
@@ -730,7 +730,7 @@
         <w:t xml:space="preserve"> </w:t>
       </w:r>
       <w:r>
-        <w:t xml:space="preserve">The I–P relationship is robustly inverted-U in the pooled sample of 46 Asian and Pacific economies, with a turning point of approximately 36% foreign sales intensity.</w:t>
+        <w:t xml:space="preserve">The I–P relationship is robustly inverted-U in the pooled sample of 49 Asian and Pacific economies, with a turning point of approximately 36% foreign sales intensity.</w:t>
       </w:r>
     </w:p>
     <w:bookmarkEnd w:id="35"/>
@@ -1125,7 +1125,7 @@
         <w:pStyle w:val="FirstParagraph"/>
       </w:pPr>
       <w:r>
-        <w:t xml:space="preserve">The central finding — an inverted-U with a turning point at approximately 36% foreign sales intensity, robust across 48 economies and six ICRV groups — offers a parsimonious resolution to apparent inconsistencies in the Asian I–P literature. Studies finding positive linear effects (Pangarkar, 2008: Singapore; Cho et al., 2023: Korea) are working with samples centred well below the 36% turning point; their firms are on the ascending limb. Studies finding null or negative results (Mondal et al., 2022: India family firms) may be capturing firms above the turning point in a high-WBES-wave year. Our ICRV moderation result provides a further refinement: the turning point itself varies from approximately 28% (Group I) to 55% (Group V–VI), so studies in institutionally advanced economies are likely to find earlier-peaking effects than studies in frontier economies.</w:t>
+        <w:t xml:space="preserve">The central finding — an inverted-U with a turning point at approximately 36% foreign sales intensity, robust across 49 economies and six ICRV groups — offers a parsimonious resolution to apparent inconsistencies in the Asian I–P literature. Studies finding positive linear effects (Pangarkar, 2008: Singapore; Cho et al., 2023: Korea) are working with samples centred well below the 36% turning point; their firms are on the ascending limb. Studies finding null or negative results (Mondal et al., 2022: India family firms) may be capturing firms above the turning point in a high-WBES-wave year. Our ICRV moderation result provides a further refinement: the turning point itself varies from approximately 28% (Group I) to 55% (Group V–VI), so studies in institutionally advanced economies are likely to find earlier-peaking effects than studies in frontier economies.</w:t>
       </w:r>
     </w:p>
     <w:bookmarkEnd w:id="42"/>
@@ -1215,7 +1215,7 @@
         <w:t xml:space="preserve"> </w:t>
       </w:r>
       <w:r>
-        <w:t xml:space="preserve">throughout refers to a contemporaneous association between FSTS and labour productivity in a given survey year, not a panel-tracked causal effect. The IV strategy used in P3 Vietnam to address selection into exporting is not available at scale across 34 economies. Second, the DAI measure is limited to Tier 1 (website) and Tier 2 (e-payment) capabilities in most WBES waves; the richer digital capability dimensions captured in more recent BEE-schema waves are not yet available for the majority of economies. Third, although the current dataset covers 48 economies across all six ICRV groups, only Oman (Group II, Advanced resource-driven) remains unavailable at the time of dataset assembly; its inclusion may further refine the Group II estimates.</w:t>
+        <w:t xml:space="preserve">throughout refers to a contemporaneous association between FSTS and labour productivity in a given survey year, not a panel-tracked causal effect. The IV strategy used in P3 Vietnam to address selection into exporting is not available at scale across 34 economies. Second, the DAI measure is limited to Tier 1 (website) and Tier 2 (e-payment) capabilities in most WBES waves; the richer digital capability dimensions captured in more recent BEE-schema waves are not yet available for the majority of economies. Third, the dataset now covers all 49 ICRV-mapped economies across six regime groups; however, Oman’s available wave (2003) predates the digital-capability variables, limiting its contribution to baseline models only. Future waves of the Oman WBES would sharpen Group II estimates.</w:t>
       </w:r>
     </w:p>
     <w:p>
@@ -1241,7 +1241,7 @@
         <w:pStyle w:val="FirstParagraph"/>
       </w:pPr>
       <w:r>
-        <w:t xml:space="preserve">We find that the inverted-U I–P relationship holds robustly across a 48-economy, 101-wave WBES sample, with a turning point of approximately 36% foreign sales intensity. Three conclusions are policy-relevant. First, for firms in the ascending phase (FSTS &lt; 36%), intensifying internationalisation is productivity-enhancing; the priority is removing barriers to export expansion. For firms beyond the turning point, the constraint is not market access but coordination capacity. Second, building technological capability raises the performance level across all FSTS levels without reliably reshaping the curve; policy should target capability building as a baseline performance lever rather than as a curve-shifting intervention. Third, digital adoption is both a universal performance enhancer and a primary curve reshaper: DAI compresses ascending-limb returns and attenuates descending-limb performance decline, with stronger returns in weaker institutional environments (DAI×ICRV, p = .012). Future research should leverage the growing panel dimensions of WBES to establish causality, and incorporate Tier 3–4 digital capability measures (AI adoption, cloud computing, platform participation) as these items become available in the 2025+ WBES waves.</w:t>
+        <w:t xml:space="preserve">We find that the inverted-U I–P relationship holds robustly across a 49-economy, 102-wave WBES sample, with a turning point of approximately 36% foreign sales intensity. Three conclusions are policy-relevant. First, for firms in the ascending phase (FSTS &lt; 36%), intensifying internationalisation is productivity-enhancing; the priority is removing barriers to export expansion. For firms beyond the turning point, the constraint is not market access but coordination capacity. Second, building technological capability raises the performance level across all FSTS levels without reliably reshaping the curve; policy should target capability building as a baseline performance lever rather than as a curve-shifting intervention. Third, digital adoption is both a universal performance enhancer and a primary curve reshaper: DAI compresses ascending-limb returns and attenuates descending-limb performance decline, with stronger returns in weaker institutional environments (DAI×ICRV, p = .012). Future research should leverage the growing panel dimensions of WBES to establish causality, and incorporate Tier 3–4 digital capability measures (AI adoption, cloud computing, platform participation) as these items become available in the 2025+ WBES waves.</w:t>
       </w:r>
     </w:p>
     <w:p>
@@ -2710,7 +2710,7 @@
               <w:jc w:val="left"/>
             </w:pPr>
             <w:r>
-              <w:t xml:space="preserve">81,307</w:t>
+              <w:t xml:space="preserve">82,616</w:t>
             </w:r>
           </w:p>
         </w:tc>
@@ -2784,7 +2784,7 @@
               <w:jc w:val="left"/>
             </w:pPr>
             <w:r>
-              <w:t xml:space="preserve">81,307</w:t>
+              <w:t xml:space="preserve">82,616</w:t>
             </w:r>
           </w:p>
         </w:tc>
@@ -2858,7 +2858,7 @@
               <w:jc w:val="left"/>
             </w:pPr>
             <w:r>
-              <w:t xml:space="preserve">81,307</w:t>
+              <w:t xml:space="preserve">82,616</w:t>
             </w:r>
           </w:p>
         </w:tc>
@@ -4637,7 +4637,7 @@
               <w:jc w:val="left"/>
             </w:pPr>
             <w:r>
-              <w:t xml:space="preserve">81,307</w:t>
+              <w:t xml:space="preserve">82,616</w:t>
             </w:r>
           </w:p>
         </w:tc>

</xml_diff>

<commit_message>
feat(p7): update model results to N=84,910 after Vietnam/Mongolia/Kiribati wave expansion
Dataset now includes Vietnam 2009/2015/2023, Mongolia 2025, Kiribati 2025,
and all previously added ICRV economies (49 total). Key changes:

Model sample sizes: M2 N=84,910 (was 82,616); M3/M5 N=38,342; M6/M7 N=38,051;
M8 N=37,940; M9 N=35,568. M10/M11 unchanged at 31,928/29,840.

Turning points stable: M2=36.4%, M3=33.8%, M5=40.0%, M11=34.6% (LM p=.002).

DAI×ICRV in M11 now significant at p=.012 (was marginal); TCI curvature
moderation confirmed NS across all specifications in expanded sample.

mgr_female premium updated to +0.185*** (~20%); §5 discussion revised
to reflect TCI null-curvature result across 49-economy institutional diversity.

https://claude.ai/code/session_01GMFmEtt6FYiJ4MKzBNCLqb
</commit_message>
<xml_diff>
--- a/p7/p7_capstone_en_clean.docx
+++ b/p7/p7_capstone_en_clean.docx
@@ -141,7 +141,7 @@
         <w:pStyle w:val="BodyText"/>
       </w:pPr>
       <w:r>
-        <w:t xml:space="preserve">Our contributions are threefold. First, we provide the largest WBES-based test of the inverted-U I–P hypothesis in Asia, confirming a turning point at approximately 36% foreign sales intensity across all specifications (N = 82,616–29,840), robust even in the full three-way moderation model (M11: TP=34.6%, LM p=.002). Second, we document that digital adoption (DAI) is the primary capability moderator that reshapes the I–P curve, generating significant curve compression effects (FSTS×DAI p&lt;.001) that emerge even without controlling for manager characteristics. Technological capability (TCI) raises the performance level but does not reliably reshape the ascending limb across this sample. Third, we document that institutional regime (ICRV group) systematically moderates both the slope and curvature of the I–P function, with DAI×ICRV interactions (p=.012) indicating that digital capabilities deliver stronger per-unit performance returns in weaker institutional environments.</w:t>
+        <w:t xml:space="preserve">Our contributions are threefold. First, we provide the largest WBES-based test of the inverted-U I–P hypothesis in Asia, confirming a turning point at approximately 36% foreign sales intensity across all specifications (N = 84,910–29,840), robust even in the full three-way moderation model (M11: TP=34.6%, LM p=.002). Second, we document that digital adoption (DAI) is the primary capability moderator that reshapes the I–P curve, generating significant curve compression effects (FSTS×DAI p&lt;.001) that emerge even without controlling for manager characteristics. Technological capability (TCI) raises the performance level but does not reliably reshape the ascending limb across this sample. Third, we document that institutional regime (ICRV group) systematically moderates both the slope and curvature of the I–P function, with DAI×ICRV interactions (p=.012) indicating that digital capabilities deliver stronger per-unit performance returns in weaker institutional environments.</w:t>
       </w:r>
     </w:p>
     <w:p>
@@ -631,7 +631,7 @@
         <w:pStyle w:val="FirstParagraph"/>
       </w:pPr>
       <w:r>
-        <w:t xml:space="preserve">The analytic sample for M2 (outcome + FSTS non-missing) is N = 82,616. Adding controls reduces the sample to N = 37,364 (M3); country-year FE model M5 uses the same sample. TCI-moderation models (M6, M7) use N ≈ 37,075; adding DAI (M8) N ≈ 36,965; manager models (M9) N ≈ 34,595; ICRV-moderation (M10) N ≈ 31,928; full three-way (M11) N ≈ 29,840. The drop from M2 to M3/M5 reflects missingness in control variables (primarily foreign ownership and firm age), which is more prevalent in smaller economies and early WBES waves.</w:t>
+        <w:t xml:space="preserve">The analytic sample for M2 (outcome + FSTS non-missing) is N = 84,910. Adding controls reduces the sample to N = 38,342 (M3); country-year FE model M5 uses the same sample. TCI-moderation models (M6, M7) use N ≈ 38,051; adding DAI (M8) N ≈ 37,940; manager models (M9) N ≈ 35,568; ICRV-moderation (M10) N ≈ 31,928; full three-way (M11) N ≈ 29,840. The drop from M2 to M3/M5 reflects missingness in control variables (primarily foreign ownership and firm age), which is more prevalent in smaller economies and early WBES waves.</w:t>
       </w:r>
     </w:p>
     <w:p>
@@ -696,7 +696,7 @@
         <w:pStyle w:val="BodyText"/>
       </w:pPr>
       <w:r>
-        <w:t xml:space="preserve">The baseline linear model (M0) confirms that FSTS alone adds no explanatory power (adjR² = .000). Adding the quadratic term FSTS² (M2) yields β₁ = +1.395 (p &lt; .001) and β₂ = −1.914 (p &lt; .001), consistent with an inverted-U. The Lind–Mehlum test confirms concavity (joint p &lt; .001) with a turning point at</w:t>
+        <w:t xml:space="preserve">The baseline linear model (M0) confirms that FSTS alone adds no explanatory power (adjR² = .000). Adding the quadratic term FSTS² (M2) yields β₁ = +1.316 (p &lt; .001) and β₂ = −1.810 (p &lt; .001), consistent with an inverted-U. The Lind–Mehlum test confirms concavity (joint p &lt; .001) with a turning point at</w:t>
       </w:r>
       <w:r>
         <w:t xml:space="preserve"> </w:t>
@@ -712,7 +712,7 @@
         <w:t xml:space="preserve"> </w:t>
       </w:r>
       <w:r>
-        <w:t xml:space="preserve">of sales from exports. The inverted-U remains significant when controls are added (M3: TP = 34.6%, LM p &lt; .001) and when country-year fixed effects absorb all unobserved time-varying country heterogeneity (M5: TP = 39.4%, LM p &lt; .001, adjR² = .694). The consistency of the turning point across M2, M3, and M5 — ranging from 34.6% to 39.4% — provides strong evidence that the inverted-U is not an artefact of omitted country-level confounders. Crucially, the inverted-U is also confirmed in the full three-way moderation model M11 (TP = 35.4%, LM p = .001), establishing robustness to the most demanding specification.</w:t>
+        <w:t xml:space="preserve">of sales from exports. The inverted-U remains significant when controls are added (M3: TP = 33.8%, LM p &lt; .001) and when country-year fixed effects absorb all unobserved time-varying country heterogeneity (M5: TP = 40.0%, LM p &lt; .001, adjR² = .677). The consistency of the turning point across M2, M3, and M5 — ranging from 33.8% to 40.0% — provides strong evidence that the inverted-U is not an artefact of omitted country-level confounders. Crucially, the inverted-U is also confirmed in the full three-way moderation model M11 (TP = 34.6%, LM p = .002), establishing robustness to the most demanding specification.</w:t>
       </w:r>
     </w:p>
     <w:p>
@@ -760,7 +760,7 @@
         <w:pStyle w:val="BodyText"/>
       </w:pPr>
       <w:r>
-        <w:t xml:space="preserve">Adding TCI as a main effect (M6: β = +0.365, p &lt; .001) raises adjR² from .014 to .022. The interaction model M7 adds FSTS×TCI and FSTS²×TCI. Results show:</w:t>
+        <w:t xml:space="preserve">Adding TCI as a main effect (M6: β = +0.321, p &lt; .001) raises adjR² from .015 to .024. The interaction model M7 adds FSTS×TCI and FSTS²×TCI. Results show:</w:t>
       </w:r>
     </w:p>
     <w:p>
@@ -772,7 +772,7 @@
         <w:pStyle w:val="Compact"/>
       </w:pPr>
       <w:r>
-        <w:t xml:space="preserve">TCI main effect: β = +0.365 (p &lt; .001) — higher TCI raises baseline performance</w:t>
+        <w:t xml:space="preserve">TCI main effect: β = +0.344 (p &lt; .001) — higher TCI raises baseline performance</w:t>
       </w:r>
     </w:p>
     <w:p>
@@ -784,7 +784,7 @@
         <w:pStyle w:val="Compact"/>
       </w:pPr>
       <w:r>
-        <w:t xml:space="preserve">FSTS×TCI: β = +0.037 (NS) — the ascending limb interaction is not significant</w:t>
+        <w:t xml:space="preserve">FSTS×TCI: β = −0.144 (NS) — the ascending limb interaction is not significant</w:t>
       </w:r>
     </w:p>
     <w:p>
@@ -796,7 +796,7 @@
         <w:pStyle w:val="Compact"/>
       </w:pPr>
       <w:r>
-        <w:t xml:space="preserve">FSTS²×TCI: β = −0.430 (NS in M7; becomes −0.688, p=.023 in M8 with DAI included)</w:t>
+        <w:t xml:space="preserve">FSTS²×TCI: β = −0.137 (NS in M7; remains NS in M8, p=.129)</w:t>
       </w:r>
     </w:p>
     <w:p>
@@ -804,7 +804,7 @@
         <w:pStyle w:val="FirstParagraph"/>
       </w:pPr>
       <w:r>
-        <w:t xml:space="preserve">The joint F-test for the two TCI interaction terms is not significant in M7 alone, though FSTS²×TCI achieves marginal significance in M8 and M9 (*). The inverted-U remains confirmed in M7 (TP = 35.0%, LM p &lt; .001). A one-SD increase in TCI raises labour productivity by exp(0.365) − 1 ≈ 44% at mean FSTS — a large and practically meaningful level effect. The curvature steepening found in M8/M9 suggests TCI does amplify performance declines at high FSTS, consistent with H2’s mechanism, but the ascending limb amplification does not reach significance in this sample.</w:t>
+        <w:t xml:space="preserve">The joint F-test for the two TCI interaction terms is not significant across M7–M9. The inverted-U remains confirmed in M7 (TP = 33.9%, LM p &lt; .001). A one-SD increase in TCI raises labour productivity by exp(0.344) − 1 ≈ 41% at mean FSTS — a large and practically meaningful level effect. The curvature steepening predicted by H2 does not emerge in this expanded sample.</w:t>
       </w:r>
     </w:p>
     <w:p>
@@ -816,13 +816,13 @@
           <w:bCs/>
           <w:b/>
         </w:rPr>
-        <w:t xml:space="preserve">H2 is partially supported (level effect confirmed; curvature steepening marginal; ascending limb NS).</w:t>
-      </w:r>
-      <w:r>
-        <w:t xml:space="preserve"> </w:t>
-      </w:r>
-      <w:r>
-        <w:t xml:space="preserve">TCI raises the performance level, and marginally steepens the descending limb of the inverted-U in larger specifications. The full amplification of both limbs predicted by H2 is not confirmed, likely reflecting heterogeneous TCI effects across the expanded institutionally diverse sample.</w:t>
+        <w:t xml:space="preserve">H2 is partially supported (level effect confirmed; curvature effects NS).</w:t>
+      </w:r>
+      <w:r>
+        <w:t xml:space="preserve"> </w:t>
+      </w:r>
+      <w:r>
+        <w:t xml:space="preserve">TCI raises the performance level consistently across specifications, but neither the ascending nor descending limb amplification reaches significance. The null curvature moderation likely reflects heterogeneous TCI effects across the institutionally diverse 49-economy sample, attenuating individual-country patterns documented in P3/P5.</w:t>
       </w:r>
     </w:p>
     <w:bookmarkEnd w:id="36"/>
@@ -852,7 +852,7 @@
         <w:pStyle w:val="BodyText"/>
       </w:pPr>
       <w:r>
-        <w:t xml:space="preserve">When DAI is added to M7, the DAI main effect is positive and significant (β = +0.151, p &lt; .001), consistent with approximately a 16% performance premium for digitally active firms (exp(0.151) − 1 ≈ 16%). Strikingly, both DAI interaction terms are significant in M8: FSTS×DAI = −0.562 (p = .001,</w:t>
+        <w:t xml:space="preserve">When DAI is added to M7, the DAI main effect is positive and significant (β = +0.155, p &lt; .001), consistent with approximately a 17% performance premium for digitally active firms (exp(0.155) − 1 ≈ 17%). Strikingly, both DAI interaction terms are significant in M8: FSTS×DAI = −0.614 (p &lt; .001,</w:t>
       </w:r>
       <w:r>
         <w:t xml:space="preserve"> </w:t>
@@ -861,42 +861,170 @@
         <w:rPr>
           <w:bCs/>
           <w:b/>
-        </w:rPr>
-        <w:t xml:space="preserve">) and FSTS²×DAI = +0.688 (p = .004,</w:t>
+          <w:iCs/>
+          <w:i/>
+        </w:rPr>
+        <w:t xml:space="preserve">) and FSTS²×DAI = +0.766 (p = .001,</w:t>
       </w:r>
       <w:r>
         <w:rPr>
           <w:bCs/>
           <w:b/>
-        </w:rPr>
-        <w:t xml:space="preserve"> </w:t>
-      </w:r>
-      <w:r>
-        <w:t xml:space="preserve">). The interaction pattern — negative FSTS×DAI and positive FSTS²×DAI — means that high-DAI firms experience a flatter, shifted I–P curve: lower productivity gains per unit of FSTS at low export intensities (sunk adoption costs, or selection of productivity-constrained firms into digital adoption), but significantly smaller performance declines at high FSTS (digital infrastructure supporting cross-border coordination at scale). This result strengthens further in M9 with manager controls: FSTS×DAI = −0.731 (p &lt; .001,</w:t>
-      </w:r>
-      <w:r>
-        <w:t xml:space="preserve"> </w:t>
-      </w:r>
-      <w:r>
-        <w:rPr>
           <w:iCs/>
           <w:i/>
+        </w:rPr>
+        <w:t xml:space="preserve"> </w:t>
+      </w:r>
+      <w:r>
+        <w:rPr>
+          <w:iCs/>
+          <w:i/>
+        </w:rPr>
+        <w:t xml:space="preserve">). The interaction pattern — negative FSTS×DAI and positive FSTS²×DAI — means that high-DAI firms experience a flatter, shifted I–P curve: lower productivity gains per unit of FSTS at low export intensities (sunk adoption costs, or selection of productivity-constrained firms into digital adoption), but significantly smaller performance declines at high FSTS (digital infrastructure supporting cross-border coordination at scale). This result strengthens further in M9 with manager controls: FSTS×DAI = −0.780 (p &lt; .001,</w:t>
+      </w:r>
+      <w:r>
+        <w:rPr>
+          <w:iCs/>
+          <w:i/>
+        </w:rPr>
+        <w:t xml:space="preserve"> </w:t>
+      </w:r>
+      <w:r>
+        <w:rPr>
           <w:bCs/>
           <w:b/>
         </w:rPr>
-        <w:t xml:space="preserve">) and FSTS²×DAI = +0.923 (p &lt; .001,</w:t>
-      </w:r>
+        <w:t xml:space="preserve">) and FSTS²×DAI = +0.994 (p &lt; .001,</w:t>
+      </w:r>
+      <w:r>
+        <w:rPr>
+          <w:bCs/>
+          <w:b/>
+        </w:rPr>
+        <w:t xml:space="preserve"> </w:t>
+      </w:r>
+      <w:r>
+        <w:t xml:space="preserve">*). The inverted-U is maintained in both specifications (M8: TP = 33.8%; M9: TP = 36.1%).</w:t>
+      </w:r>
+    </w:p>
+    <w:p>
+      <w:pPr>
+        <w:pStyle w:val="BodyText"/>
+      </w:pPr>
+      <w:r>
+        <w:rPr>
+          <w:bCs/>
+          <w:b/>
+        </w:rPr>
+        <w:t xml:space="preserve">H3 is supported.</w:t>
+      </w:r>
+      <w:r>
+        <w:t xml:space="preserve"> </w:t>
+      </w:r>
+      <w:r>
+        <w:t xml:space="preserve">DAI raises firm performance by approximately 16% and significantly reshapes the I–P curve — compressing the ascending limb and attenuating the performance decline at high FSTS — even before controlling for managerial characteristics. This is the primary capability-moderating finding of the study.</w:t>
+      </w:r>
+    </w:p>
+    <w:bookmarkEnd w:id="37"/>
+    <w:bookmarkStart w:id="38" w:name="managerial-characteristics-h4-1"/>
+    <w:p>
+      <w:pPr>
+        <w:pStyle w:val="Heading3"/>
+      </w:pPr>
+      <w:r>
+        <w:t xml:space="preserve">4.5 Managerial Characteristics (H4)</w:t>
+      </w:r>
+    </w:p>
+    <w:p>
+      <w:pPr>
+        <w:pStyle w:val="FirstParagraph"/>
+      </w:pPr>
       <w:r>
         <w:rPr>
           <w:iCs/>
           <w:i/>
+        </w:rPr>
+        <w:t xml:space="preserve">Table 2, Model M9.</w:t>
+      </w:r>
+    </w:p>
+    <w:p>
+      <w:pPr>
+        <w:pStyle w:val="BodyText"/>
+      </w:pPr>
+      <w:r>
+        <w:t xml:space="preserve">Manager experience (β = +0.007, p = .026) and female top manager (β = +0.185, p &lt; .001) both raise firm performance independently of FSTS in M9. The experience effect implies approximately 0.7% higher labour productivity per additional year of sectoral experience; the female top manager effect implies approximately a 20% performance premium (exp(0.185) − 1 ≈ 20%). The FSTS×manager_experience interaction is not significant in M9 (β = −0.012, p = .133), but is marginally significant in M11 (β = −0.019, p = .053, †) — suggesting that, in the full specification, more experienced managers navigate the high-FSTS coordination challenges more effectively (negative interaction = smaller performance decline above the turning point).</w:t>
+      </w:r>
+    </w:p>
+    <w:p>
+      <w:pPr>
+        <w:pStyle w:val="BodyText"/>
+      </w:pPr>
+      <w:r>
+        <w:rPr>
           <w:bCs/>
           <w:b/>
         </w:rPr>
-        <w:t xml:space="preserve"> </w:t>
-      </w:r>
-      <w:r>
-        <w:t xml:space="preserve">). The inverted-U is maintained in both specifications (M8: TP = 34.9%; M9: TP = 38.1%).</w:t>
+        <w:t xml:space="preserve">H4 is partially supported.</w:t>
+      </w:r>
+      <w:r>
+        <w:t xml:space="preserve"> </w:t>
+      </w:r>
+      <w:r>
+        <w:t xml:space="preserve">Top manager experience and female management improve firm performance (level effects confirmed). The curve-moderating effect of manager experience is marginally present in M11 but absent in M9; we interpret this as a secondary finding requiring replication.</w:t>
+      </w:r>
+    </w:p>
+    <w:bookmarkEnd w:id="38"/>
+    <w:bookmarkStart w:id="39" w:name="institutional-regime-moderation-h5"/>
+    <w:p>
+      <w:pPr>
+        <w:pStyle w:val="Heading3"/>
+      </w:pPr>
+      <w:r>
+        <w:t xml:space="preserve">4.6 Institutional Regime Moderation (H5)</w:t>
+      </w:r>
+    </w:p>
+    <w:p>
+      <w:pPr>
+        <w:pStyle w:val="FirstParagraph"/>
+      </w:pPr>
+      <w:r>
+        <w:rPr>
+          <w:iCs/>
+          <w:i/>
+        </w:rPr>
+        <w:t xml:space="preserve">Table 2, Model M10.</w:t>
+      </w:r>
+    </w:p>
+    <w:p>
+      <w:pPr>
+        <w:pStyle w:val="BodyText"/>
+      </w:pPr>
+      <w:r>
+        <w:t xml:space="preserve">The ICRV group main effect (β = +0.763, p &lt; .001) indicates that — controlling for TCI, DAI, and firm characteristics — each step up the ICRV scale (from Group I to VI, i.e., from stronger to weaker institutions) is associated with approximately a 115% higher labour productivity level (exp(0.763) − 1 ≈ 115%). This counter-intuitive</w:t>
+      </w:r>
+      <w:r>
+        <w:t xml:space="preserve"> </w:t>
+      </w:r>
+      <w:r>
+        <w:rPr>
+          <w:iCs/>
+          <w:i/>
+        </w:rPr>
+        <w:t xml:space="preserve">positive</w:t>
+      </w:r>
+      <w:r>
+        <w:t xml:space="preserve"> </w:t>
+      </w:r>
+      <w:r>
+        <w:t xml:space="preserve">ICRV coefficient reflects that nominal sales-per-worker is higher in economies with lower price levels (typical of frontier/emerging economies), and country-year fixed effects were not included in M10 to preserve the institutional regime as the key moderator of interest.</w:t>
+      </w:r>
+    </w:p>
+    <w:p>
+      <w:pPr>
+        <w:pStyle w:val="BodyText"/>
+      </w:pPr>
+      <w:r>
+        <w:t xml:space="preserve">More relevant for H5 are the interaction terms: FSTS×ICRV (β = +1.762, p &lt; .001) and FSTS²×ICRV (β = −2.746, p &lt; .001). These indicate that the ascending slope of the I–P curve is steeper in weaker-institution economies (higher ICRV group), but so is the descending slope — meaning that the inverted-U peak occurs at lower export intensities in stronger-institution economies (lower ICRV number), and is more pronounced in weaker-institution economies. Decomposing by ICRV group: for Group I economies (Advanced innovation-driven), the estimated turning point is approximately 28%; for Group V–VI (Frontier/SIDS), the estimated turning point is approximately 55%. This pattern is consistent with firms in institutionally advanced economies recouping internationalisation costs at lower export intensities, while firms in institutionally weaker environments require greater export commitment to reach the performance peak.</w:t>
       </w:r>
     </w:p>
     <w:p>
@@ -908,23 +1036,23 @@
           <w:bCs/>
           <w:b/>
         </w:rPr>
-        <w:t xml:space="preserve">H3 is supported.</w:t>
-      </w:r>
-      <w:r>
-        <w:t xml:space="preserve"> </w:t>
-      </w:r>
-      <w:r>
-        <w:t xml:space="preserve">DAI raises firm performance by approximately 16% and significantly reshapes the I–P curve — compressing the ascending limb and attenuating the performance decline at high FSTS — even before controlling for managerial characteristics. This is the primary capability-moderating finding of the study.</w:t>
-      </w:r>
-    </w:p>
-    <w:bookmarkEnd w:id="37"/>
-    <w:bookmarkStart w:id="38" w:name="managerial-characteristics-h4-1"/>
+        <w:t xml:space="preserve">H5 is supported.</w:t>
+      </w:r>
+      <w:r>
+        <w:t xml:space="preserve"> </w:t>
+      </w:r>
+      <w:r>
+        <w:t xml:space="preserve">The ICRV institutional regime systematically moderates both the slope and curvature of the I–P function, with stronger institutions associated with earlier (lower FSTS) performance peaks.</w:t>
+      </w:r>
+    </w:p>
+    <w:bookmarkEnd w:id="39"/>
+    <w:bookmarkStart w:id="40" w:name="full-three-way-moderation-h7-p7"/>
     <w:p>
       <w:pPr>
         <w:pStyle w:val="Heading3"/>
       </w:pPr>
       <w:r>
-        <w:t xml:space="preserve">4.5 Managerial Characteristics (H4)</w:t>
+        <w:t xml:space="preserve">4.7 Full Three-Way Moderation (H7-P7)</w:t>
       </w:r>
     </w:p>
     <w:p>
@@ -936,15 +1064,23 @@
           <w:iCs/>
           <w:i/>
         </w:rPr>
-        <w:t xml:space="preserve">Table 2, Model M9.</w:t>
-      </w:r>
-    </w:p>
-    <w:p>
-      <w:pPr>
-        <w:pStyle w:val="BodyText"/>
-      </w:pPr>
-      <w:r>
-        <w:t xml:space="preserve">Manager experience (β = +0.007, p = .020) and female top manager (β = +0.152, p &lt; .001) both raise firm performance independently of FSTS in M9. The experience effect implies approximately 0.7% higher labour productivity per additional year of sectoral experience; the female top manager effect implies approximately a 16% performance premium (exp(0.152) − 1 ≈ 16%). The FSTS×manager_experience interaction is not significant in M9 (β = −0.014, p = .206), but reaches significance in M11 (β = −0.020, p = .029) — suggesting that, in the full specification, more experienced managers navigate the high-FSTS coordination challenges more effectively (negative interaction = flatter ascending limb, less over-internationalisation penalty).</w:t>
+        <w:t xml:space="preserve">Table 2, Model M11.</w:t>
+      </w:r>
+    </w:p>
+    <w:p>
+      <w:pPr>
+        <w:pStyle w:val="BodyText"/>
+      </w:pPr>
+      <w:r>
+        <w:t xml:space="preserve">The capstone model adds all three-way interactions (FSTS×DAI×ICRV, plus constituent lower-order interactions). The Lind–Mehlum test in M11 confirms the inverted-U (TP = 34.6%, LM p = .002), establishing that the inverted-U shape holds even in the most demanding specification. The DAI×ICRV interaction (β = +0.060, p = .012, *) is significant, consistent with the CDCM prediction that digital capabilities provide stronger per-unit performance effects in weaker institutional environments. The three-way FSTS×DAI×ICRV term (β = −0.001, NS) is not significant, indicating that the DAI curve-reshaping effect documented in M8/M9 does not systematically vary across the ICRV regime gradient in this specification.</w:t>
+      </w:r>
+    </w:p>
+    <w:p>
+      <w:pPr>
+        <w:pStyle w:val="BodyText"/>
+      </w:pPr>
+      <w:r>
+        <w:t xml:space="preserve">AdjR² = .067 in M11 (vs. .049 in M10) indicates meaningful incremental fit from adding the three-way moderation structure.</w:t>
       </w:r>
     </w:p>
     <w:p>
@@ -956,141 +1092,13 @@
           <w:bCs/>
           <w:b/>
         </w:rPr>
-        <w:t xml:space="preserve">H4 is partially supported.</w:t>
-      </w:r>
-      <w:r>
-        <w:t xml:space="preserve"> </w:t>
-      </w:r>
-      <w:r>
-        <w:t xml:space="preserve">Top manager experience and female management improve firm performance (level effects confirmed). The curve-moderating effect of manager experience is marginally present in M11 but absent in M9; we interpret this as a secondary finding requiring replication.</w:t>
-      </w:r>
-    </w:p>
-    <w:bookmarkEnd w:id="38"/>
-    <w:bookmarkStart w:id="39" w:name="institutional-regime-moderation-h5"/>
-    <w:p>
-      <w:pPr>
-        <w:pStyle w:val="Heading3"/>
-      </w:pPr>
-      <w:r>
-        <w:t xml:space="preserve">4.6 Institutional Regime Moderation (H5)</w:t>
-      </w:r>
-    </w:p>
-    <w:p>
-      <w:pPr>
-        <w:pStyle w:val="FirstParagraph"/>
-      </w:pPr>
-      <w:r>
-        <w:rPr>
-          <w:iCs/>
-          <w:i/>
-        </w:rPr>
-        <w:t xml:space="preserve">Table 2, Model M10.</w:t>
-      </w:r>
-    </w:p>
-    <w:p>
-      <w:pPr>
-        <w:pStyle w:val="BodyText"/>
-      </w:pPr>
-      <w:r>
-        <w:t xml:space="preserve">The ICRV group main effect (β = +0.763, p &lt; .001) indicates that — controlling for TCI, DAI, and firm characteristics — each step up the ICRV scale (from Group I to VI, i.e., from stronger to weaker institutions) is associated with approximately a 115% higher labour productivity level (exp(0.763) − 1 ≈ 115%). This counter-intuitive</w:t>
-      </w:r>
-      <w:r>
-        <w:t xml:space="preserve"> </w:t>
-      </w:r>
-      <w:r>
-        <w:rPr>
-          <w:iCs/>
-          <w:i/>
-        </w:rPr>
-        <w:t xml:space="preserve">positive</w:t>
-      </w:r>
-      <w:r>
-        <w:t xml:space="preserve"> </w:t>
-      </w:r>
-      <w:r>
-        <w:t xml:space="preserve">ICRV coefficient reflects that nominal sales-per-worker is higher in economies with lower price levels (typical of frontier/emerging economies), and country-year fixed effects were not included in M10 to preserve the institutional regime as the key moderator of interest.</w:t>
-      </w:r>
-    </w:p>
-    <w:p>
-      <w:pPr>
-        <w:pStyle w:val="BodyText"/>
-      </w:pPr>
-      <w:r>
-        <w:t xml:space="preserve">More relevant for H5 are the interaction terms: FSTS×ICRV (β = +1.762, p &lt; .001) and FSTS²×ICRV (β = −2.746, p &lt; .001). These indicate that the ascending slope of the I–P curve is steeper in weaker-institution economies (higher ICRV group), but so is the descending slope — meaning that the inverted-U peak occurs at lower export intensities in stronger-institution economies (lower ICRV number), and is more pronounced in weaker-institution economies. Decomposing by ICRV group: for Group I economies (Advanced innovation-driven), the estimated turning point is approximately 28%; for Group V–VI (Frontier/SIDS), the estimated turning point is approximately 55%. This pattern is consistent with firms in institutionally advanced economies recouping internationalisation costs at lower export intensities, while firms in institutionally weaker environments require greater export commitment to reach the performance peak.</w:t>
-      </w:r>
-    </w:p>
-    <w:p>
-      <w:pPr>
-        <w:pStyle w:val="BodyText"/>
-      </w:pPr>
-      <w:r>
-        <w:rPr>
-          <w:bCs/>
-          <w:b/>
-        </w:rPr>
-        <w:t xml:space="preserve">H5 is supported.</w:t>
-      </w:r>
-      <w:r>
-        <w:t xml:space="preserve"> </w:t>
-      </w:r>
-      <w:r>
-        <w:t xml:space="preserve">The ICRV institutional regime systematically moderates both the slope and curvature of the I–P function, with stronger institutions associated with earlier (lower FSTS) performance peaks.</w:t>
-      </w:r>
-    </w:p>
-    <w:bookmarkEnd w:id="39"/>
-    <w:bookmarkStart w:id="40" w:name="full-three-way-moderation-h7-p7"/>
-    <w:p>
-      <w:pPr>
-        <w:pStyle w:val="Heading3"/>
-      </w:pPr>
-      <w:r>
-        <w:t xml:space="preserve">4.7 Full Three-Way Moderation (H7-P7)</w:t>
-      </w:r>
-    </w:p>
-    <w:p>
-      <w:pPr>
-        <w:pStyle w:val="FirstParagraph"/>
-      </w:pPr>
-      <w:r>
-        <w:rPr>
-          <w:iCs/>
-          <w:i/>
-        </w:rPr>
-        <w:t xml:space="preserve">Table 2, Model M11.</w:t>
-      </w:r>
-    </w:p>
-    <w:p>
-      <w:pPr>
-        <w:pStyle w:val="BodyText"/>
-      </w:pPr>
-      <w:r>
-        <w:t xml:space="preserve">The capstone model adds all three-way interactions (FSTS×DAI×ICRV, plus constituent lower-order interactions). The Lind–Mehlum test in M11 confirms the inverted-U (TP = 35.4%, LM p = .001), establishing that the inverted-U shape holds even in the most demanding specification. The DAI×ICRV interaction (β = +0.046, p = .063, †) is marginally significant, consistent with the CDCM prediction that digital capabilities provide stronger per-unit performance effects in weaker institutional environments. The three-way FSTS×DAI×ICRV term (β = −0.024, NS) is not significant, indicating that the DAI curve-reshaping effect documented in M8/M9 does not systematically vary across the ICRV regime gradient in this specification.</w:t>
-      </w:r>
-    </w:p>
-    <w:p>
-      <w:pPr>
-        <w:pStyle w:val="BodyText"/>
-      </w:pPr>
-      <w:r>
-        <w:t xml:space="preserve">AdjR² = .070 in M11 (vs. .051 in M10) indicates meaningful incremental fit from adding the three-way moderation structure.</w:t>
-      </w:r>
-    </w:p>
-    <w:p>
-      <w:pPr>
-        <w:pStyle w:val="BodyText"/>
-      </w:pPr>
-      <w:r>
-        <w:rPr>
-          <w:bCs/>
-          <w:b/>
-        </w:rPr>
         <w:t xml:space="preserve">H7-P7 (three-way interaction) is not confirmed; M11 inverted-U is confirmed.</w:t>
       </w:r>
       <w:r>
         <w:t xml:space="preserve"> </w:t>
       </w:r>
       <w:r>
-        <w:t xml:space="preserve">The DAI×ICRV main interaction is marginally significant (p = .063), suggesting regime-contingent digital effects. The three-way FSTS curve-reshaping via DAI×ICRV does not reach significance — the WBES DAI measure’s limited dimensionality (Tier 1–2 only) likely constrains detection of the full CDCM-predicted interaction.</w:t>
+        <w:t xml:space="preserve">The DAI×ICRV main interaction is significant (p = .012), supporting regime-contingent digital effects. The three-way FSTS curve-reshaping via DAI×ICRV does not reach significance — the WBES DAI measure’s limited dimensionality (Tier 1–2 only) likely constrains detection of the full CDCM-predicted interaction.</w:t>
       </w:r>
     </w:p>
     <w:p>
@@ -1143,7 +1151,7 @@
         <w:pStyle w:val="FirstParagraph"/>
       </w:pPr>
       <w:r>
-        <w:t xml:space="preserve">The finding that TCI steepens both limbs of the I–P curve — rather than simply shifting it upward — has important implications for theory and practice. It implies that technological capability is not simply a performance complement to internationalisation; it is a risk amplifier that accelerates the payoff at moderate FSTS and accelerates the performance decline at excessive FSTS. Firms with high TCI derive disproportionate returns from moderate export commitments (the ascending limb premium) but also suffer disproportionate losses from over-internationalisation. This is consistent with the absorptive capacity argument (Cohen &amp; Levinthal, 1990): high-TCI firms are better at processing international market signals, but precisely because they are more active in cross-border engagement, they also face greater coordination demands when export share exceeds capacity.</w:t>
+        <w:t xml:space="preserve">The finding that TCI raises the performance level without reliably reshaping the I–P curve in the pooled sample distinguishes the cross-economy result from country-specific evidence. In P3 Vietnam and P5 China, TCI moderated the curve shape; in the 49-economy pool, institutional heterogeneity attenuates that moderation signal. This is consistent with the absorptive capacity argument (Cohen &amp; Levinthal, 1990): high-TCI firms process international market signals more effectively, but the curve-shaping benefit requires institutional complementarity (e.g., strong IP protection, technology transfer infrastructure) that is inconsistently present across the full ICRV spectrum. The practical implication is that technological capability raises the performance floor universally, but its curve-reshaping role is context-contingent and cannot be assumed at scale.</w:t>
       </w:r>
     </w:p>
     <w:bookmarkEnd w:id="43"/>
@@ -1161,7 +1169,7 @@
         <w:pStyle w:val="FirstParagraph"/>
       </w:pPr>
       <w:r>
-        <w:t xml:space="preserve">The capability-complementarity curve reshaping found for DAI in M9 — and the marginally significant DAI×ICRV interaction (p = .063) in M11 — provides the first multi-economy evidence for the CDCM prediction that digital capabilities’ performance effects are context-contingent. In institutionally stronger economies (Group I–II), digital infrastructure is near-universal and therefore provides competitive advantage only to early adopters at the margin; in weaker institutional environments (Group IV–VI), digital adoption remains differentiating. The implication is that policies promoting digitalisation in frontier economies are likely to generate stronger firm-level returns per unit of adoption than equivalent policies in advanced economies.</w:t>
+        <w:t xml:space="preserve">The capability-complementarity curve reshaping found for DAI in M9 — and the significant DAI×ICRV interaction (β = +0.060, p = .012) in M11 — provides the first multi-economy evidence for the CDCM prediction that digital capabilities’ performance effects are context-contingent. In institutionally stronger economies (Group I–II), digital infrastructure is near-universal and therefore provides competitive advantage only to early adopters at the margin; in weaker institutional environments (Group IV–VI), digital adoption remains differentiating. The implication is that policies promoting digitalisation in frontier economies are likely to generate stronger firm-level returns per unit of adoption than equivalent policies in advanced economies.</w:t>
       </w:r>
     </w:p>
     <w:bookmarkEnd w:id="44"/>
@@ -1179,7 +1187,7 @@
         <w:pStyle w:val="FirstParagraph"/>
       </w:pPr>
       <w:r>
-        <w:t xml:space="preserve">The consistent and significant performance premium for female top managers (approximately 12–18% across specifications) is notable given the diversity of economies in our sample, from conservative Gulf economies (Bahrain, Iraq) to progressive innovation hubs (Korea, Singapore, Israel). This cross-context robustness supports the view that female top management is a genuine resource (Hambrick &amp; Mason, 1984; Richard et al., 2019), not merely a proxy for firm governance quality. The null curve-moderation result (FSTS×female_manager not significant) suggests that the performance premium is universal across FSTS levels — female managers improve absolute performance but do not help firms navigate internationalisation more efficiently.</w:t>
+        <w:t xml:space="preserve">The consistent and significant performance premium for female top managers (approximately 17–20% across specifications) is notable given the diversity of economies in our sample, from conservative Gulf economies (Bahrain, Iraq) to progressive innovation hubs (Korea, Singapore, Israel). This cross-context robustness supports the view that female top management is a genuine resource (Hambrick &amp; Mason, 1984; Richard et al., 2019), not merely a proxy for firm governance quality. The null curve-moderation result (FSTS×female_manager not significant) suggests that the performance premium is universal across FSTS levels — female managers improve absolute performance but do not help firms navigate internationalisation more efficiently.</w:t>
       </w:r>
     </w:p>
     <w:bookmarkEnd w:id="45"/>
@@ -2710,7 +2718,7 @@
               <w:jc w:val="left"/>
             </w:pPr>
             <w:r>
-              <w:t xml:space="preserve">82,616</w:t>
+              <w:t xml:space="preserve">84,910</w:t>
             </w:r>
           </w:p>
         </w:tc>
@@ -2784,7 +2792,7 @@
               <w:jc w:val="left"/>
             </w:pPr>
             <w:r>
-              <w:t xml:space="preserve">82,616</w:t>
+              <w:t xml:space="preserve">84,910</w:t>
             </w:r>
           </w:p>
         </w:tc>
@@ -2858,7 +2866,7 @@
               <w:jc w:val="left"/>
             </w:pPr>
             <w:r>
-              <w:t xml:space="preserve">82,616</w:t>
+              <w:t xml:space="preserve">84,910</w:t>
             </w:r>
           </w:p>
         </w:tc>
@@ -2886,7 +2894,7 @@
                 <w:bCs/>
                 <w:b/>
               </w:rPr>
-              <w:t xml:space="preserve">36.6</w:t>
+              <w:t xml:space="preserve">36.4</w:t>
             </w:r>
           </w:p>
         </w:tc>
@@ -2936,19 +2944,19 @@
               <w:jc w:val="left"/>
             </w:pPr>
             <w:r>
-              <w:t xml:space="preserve">37,364</w:t>
-            </w:r>
-          </w:p>
-        </w:tc>
-        <w:tc>
-          <w:tcPr/>
-          <w:p>
-            <w:pPr>
-              <w:pStyle w:val="Compact"/>
-              <w:jc w:val="left"/>
-            </w:pPr>
-            <w:r>
-              <w:t xml:space="preserve">.014</w:t>
+              <w:t xml:space="preserve">38,342</w:t>
+            </w:r>
+          </w:p>
+        </w:tc>
+        <w:tc>
+          <w:tcPr/>
+          <w:p>
+            <w:pPr>
+              <w:pStyle w:val="Compact"/>
+              <w:jc w:val="left"/>
+            </w:pPr>
+            <w:r>
+              <w:t xml:space="preserve">.015</w:t>
             </w:r>
           </w:p>
         </w:tc>
@@ -2964,7 +2972,7 @@
                 <w:bCs/>
                 <w:b/>
               </w:rPr>
-              <w:t xml:space="preserve">34.2</w:t>
+              <w:t xml:space="preserve">33.8</w:t>
             </w:r>
           </w:p>
         </w:tc>
@@ -3014,7 +3022,7 @@
               <w:jc w:val="left"/>
             </w:pPr>
             <w:r>
-              <w:t xml:space="preserve">37,364</w:t>
+              <w:t xml:space="preserve">38,342</w:t>
             </w:r>
           </w:p>
         </w:tc>
@@ -3042,7 +3050,7 @@
                 <w:bCs/>
                 <w:b/>
               </w:rPr>
-              <w:t xml:space="preserve">40.1</w:t>
+              <w:t xml:space="preserve">40.0</w:t>
             </w:r>
           </w:p>
         </w:tc>
@@ -3092,31 +3100,31 @@
               <w:jc w:val="left"/>
             </w:pPr>
             <w:r>
-              <w:t xml:space="preserve">37,075</w:t>
-            </w:r>
-          </w:p>
-        </w:tc>
-        <w:tc>
-          <w:tcPr/>
-          <w:p>
-            <w:pPr>
-              <w:pStyle w:val="Compact"/>
-              <w:jc w:val="left"/>
-            </w:pPr>
-            <w:r>
-              <w:t xml:space="preserve">.023</w:t>
-            </w:r>
-          </w:p>
-        </w:tc>
-        <w:tc>
-          <w:tcPr/>
-          <w:p>
-            <w:pPr>
-              <w:pStyle w:val="Compact"/>
-              <w:jc w:val="left"/>
-            </w:pPr>
-            <w:r>
-              <w:t xml:space="preserve">32.9</w:t>
+              <w:t xml:space="preserve">38,051</w:t>
+            </w:r>
+          </w:p>
+        </w:tc>
+        <w:tc>
+          <w:tcPr/>
+          <w:p>
+            <w:pPr>
+              <w:pStyle w:val="Compact"/>
+              <w:jc w:val="left"/>
+            </w:pPr>
+            <w:r>
+              <w:t xml:space="preserve">.024</w:t>
+            </w:r>
+          </w:p>
+        </w:tc>
+        <w:tc>
+          <w:tcPr/>
+          <w:p>
+            <w:pPr>
+              <w:pStyle w:val="Compact"/>
+              <w:jc w:val="left"/>
+            </w:pPr>
+            <w:r>
+              <w:t xml:space="preserve">32.7</w:t>
             </w:r>
           </w:p>
         </w:tc>
@@ -3166,19 +3174,19 @@
               <w:jc w:val="left"/>
             </w:pPr>
             <w:r>
-              <w:t xml:space="preserve">37,075</w:t>
-            </w:r>
-          </w:p>
-        </w:tc>
-        <w:tc>
-          <w:tcPr/>
-          <w:p>
-            <w:pPr>
-              <w:pStyle w:val="Compact"/>
-              <w:jc w:val="left"/>
-            </w:pPr>
-            <w:r>
-              <w:t xml:space="preserve">.024</w:t>
+              <w:t xml:space="preserve">38,051</w:t>
+            </w:r>
+          </w:p>
+        </w:tc>
+        <w:tc>
+          <w:tcPr/>
+          <w:p>
+            <w:pPr>
+              <w:pStyle w:val="Compact"/>
+              <w:jc w:val="left"/>
+            </w:pPr>
+            <w:r>
+              <w:t xml:space="preserve">.025</w:t>
             </w:r>
           </w:p>
         </w:tc>
@@ -3194,7 +3202,7 @@
                 <w:bCs/>
                 <w:b/>
               </w:rPr>
-              <w:t xml:space="preserve">34.3</w:t>
+              <w:t xml:space="preserve">33.9</w:t>
             </w:r>
           </w:p>
         </w:tc>
@@ -3244,19 +3252,19 @@
               <w:jc w:val="left"/>
             </w:pPr>
             <w:r>
-              <w:t xml:space="preserve">36,965</w:t>
-            </w:r>
-          </w:p>
-        </w:tc>
-        <w:tc>
-          <w:tcPr/>
-          <w:p>
-            <w:pPr>
-              <w:pStyle w:val="Compact"/>
-              <w:jc w:val="left"/>
-            </w:pPr>
-            <w:r>
-              <w:t xml:space="preserve">.029</w:t>
+              <w:t xml:space="preserve">37,940</w:t>
+            </w:r>
+          </w:p>
+        </w:tc>
+        <w:tc>
+          <w:tcPr/>
+          <w:p>
+            <w:pPr>
+              <w:pStyle w:val="Compact"/>
+              <w:jc w:val="left"/>
+            </w:pPr>
+            <w:r>
+              <w:t xml:space="preserve">.030</w:t>
             </w:r>
           </w:p>
         </w:tc>
@@ -3272,7 +3280,7 @@
                 <w:bCs/>
                 <w:b/>
               </w:rPr>
-              <w:t xml:space="preserve">34.3</w:t>
+              <w:t xml:space="preserve">33.8</w:t>
             </w:r>
           </w:p>
         </w:tc>
@@ -3322,19 +3330,19 @@
               <w:jc w:val="left"/>
             </w:pPr>
             <w:r>
-              <w:t xml:space="preserve">34,595</w:t>
-            </w:r>
-          </w:p>
-        </w:tc>
-        <w:tc>
-          <w:tcPr/>
-          <w:p>
-            <w:pPr>
-              <w:pStyle w:val="Compact"/>
-              <w:jc w:val="left"/>
-            </w:pPr>
-            <w:r>
-              <w:t xml:space="preserve">.033</w:t>
+              <w:t xml:space="preserve">35,568</w:t>
+            </w:r>
+          </w:p>
+        </w:tc>
+        <w:tc>
+          <w:tcPr/>
+          <w:p>
+            <w:pPr>
+              <w:pStyle w:val="Compact"/>
+              <w:jc w:val="left"/>
+            </w:pPr>
+            <w:r>
+              <w:t xml:space="preserve">.035</w:t>
             </w:r>
           </w:p>
         </w:tc>
@@ -3350,7 +3358,7 @@
                 <w:bCs/>
                 <w:b/>
               </w:rPr>
-              <w:t xml:space="preserve">36.6</w:t>
+              <w:t xml:space="preserve">36.1</w:t>
             </w:r>
           </w:p>
         </w:tc>
@@ -3675,43 +3683,43 @@
               <w:jc w:val="left"/>
             </w:pPr>
             <w:r>
-              <w:t xml:space="preserve">+1.400***</w:t>
-            </w:r>
-          </w:p>
-        </w:tc>
-        <w:tc>
-          <w:tcPr/>
-          <w:p>
-            <w:pPr>
-              <w:pStyle w:val="Compact"/>
-              <w:jc w:val="left"/>
-            </w:pPr>
-            <w:r>
-              <w:t xml:space="preserve">+1.830***</w:t>
-            </w:r>
-          </w:p>
-        </w:tc>
-        <w:tc>
-          <w:tcPr/>
-          <w:p>
-            <w:pPr>
-              <w:pStyle w:val="Compact"/>
-              <w:jc w:val="left"/>
-            </w:pPr>
-            <w:r>
-              <w:t xml:space="preserve">+1.746***</w:t>
-            </w:r>
-          </w:p>
-        </w:tc>
-        <w:tc>
-          <w:tcPr/>
-          <w:p>
-            <w:pPr>
-              <w:pStyle w:val="Compact"/>
-              <w:jc w:val="left"/>
-            </w:pPr>
-            <w:r>
-              <w:t xml:space="preserve">+2.269***</w:t>
+              <w:t xml:space="preserve">+1.316***</w:t>
+            </w:r>
+          </w:p>
+        </w:tc>
+        <w:tc>
+          <w:tcPr/>
+          <w:p>
+            <w:pPr>
+              <w:pStyle w:val="Compact"/>
+              <w:jc w:val="left"/>
+            </w:pPr>
+            <w:r>
+              <w:t xml:space="preserve">+2.083***</w:t>
+            </w:r>
+          </w:p>
+        </w:tc>
+        <w:tc>
+          <w:tcPr/>
+          <w:p>
+            <w:pPr>
+              <w:pStyle w:val="Compact"/>
+              <w:jc w:val="left"/>
+            </w:pPr>
+            <w:r>
+              <w:t xml:space="preserve">+2.000***</w:t>
+            </w:r>
+          </w:p>
+        </w:tc>
+        <w:tc>
+          <w:tcPr/>
+          <w:p>
+            <w:pPr>
+              <w:pStyle w:val="Compact"/>
+              <w:jc w:val="left"/>
+            </w:pPr>
+            <w:r>
+              <w:t xml:space="preserve">+2.522***</w:t>
             </w:r>
           </w:p>
         </w:tc>
@@ -3749,43 +3757,43 @@
               <w:jc w:val="left"/>
             </w:pPr>
             <w:r>
-              <w:t xml:space="preserve">−1.915***</w:t>
-            </w:r>
-          </w:p>
-        </w:tc>
-        <w:tc>
-          <w:tcPr/>
-          <w:p>
-            <w:pPr>
-              <w:pStyle w:val="Compact"/>
-              <w:jc w:val="left"/>
-            </w:pPr>
-            <w:r>
-              <w:t xml:space="preserve">−2.664***</w:t>
-            </w:r>
-          </w:p>
-        </w:tc>
-        <w:tc>
-          <w:tcPr/>
-          <w:p>
-            <w:pPr>
-              <w:pStyle w:val="Compact"/>
-              <w:jc w:val="left"/>
-            </w:pPr>
-            <w:r>
-              <w:t xml:space="preserve">−2.546***</w:t>
-            </w:r>
-          </w:p>
-        </w:tc>
-        <w:tc>
-          <w:tcPr/>
-          <w:p>
-            <w:pPr>
-              <w:pStyle w:val="Compact"/>
-              <w:jc w:val="left"/>
-            </w:pPr>
-            <w:r>
-              <w:t xml:space="preserve">−3.098***</w:t>
+              <w:t xml:space="preserve">−1.810***</w:t>
+            </w:r>
+          </w:p>
+        </w:tc>
+        <w:tc>
+          <w:tcPr/>
+          <w:p>
+            <w:pPr>
+              <w:pStyle w:val="Compact"/>
+              <w:jc w:val="left"/>
+            </w:pPr>
+            <w:r>
+              <w:t xml:space="preserve">−3.074***</w:t>
+            </w:r>
+          </w:p>
+        </w:tc>
+        <w:tc>
+          <w:tcPr/>
+          <w:p>
+            <w:pPr>
+              <w:pStyle w:val="Compact"/>
+              <w:jc w:val="left"/>
+            </w:pPr>
+            <w:r>
+              <w:t xml:space="preserve">−2.954***</w:t>
+            </w:r>
+          </w:p>
+        </w:tc>
+        <w:tc>
+          <w:tcPr/>
+          <w:p>
+            <w:pPr>
+              <w:pStyle w:val="Compact"/>
+              <w:jc w:val="left"/>
+            </w:pPr>
+            <w:r>
+              <w:t xml:space="preserve">−3.497***</w:t>
             </w:r>
           </w:p>
         </w:tc>
@@ -3835,31 +3843,31 @@
               <w:jc w:val="left"/>
             </w:pPr>
             <w:r>
-              <w:t xml:space="preserve">+0.358***</w:t>
-            </w:r>
-          </w:p>
-        </w:tc>
-        <w:tc>
-          <w:tcPr/>
-          <w:p>
-            <w:pPr>
-              <w:pStyle w:val="Compact"/>
-              <w:jc w:val="left"/>
-            </w:pPr>
-            <w:r>
-              <w:t xml:space="preserve">+0.321***</w:t>
-            </w:r>
-          </w:p>
-        </w:tc>
-        <w:tc>
-          <w:tcPr/>
-          <w:p>
-            <w:pPr>
-              <w:pStyle w:val="Compact"/>
-              <w:jc w:val="left"/>
-            </w:pPr>
-            <w:r>
-              <w:t xml:space="preserve">+0.320***</w:t>
+              <w:t xml:space="preserve">+0.344***</w:t>
+            </w:r>
+          </w:p>
+        </w:tc>
+        <w:tc>
+          <w:tcPr/>
+          <w:p>
+            <w:pPr>
+              <w:pStyle w:val="Compact"/>
+              <w:jc w:val="left"/>
+            </w:pPr>
+            <w:r>
+              <w:t xml:space="preserve">+0.307***</w:t>
+            </w:r>
+          </w:p>
+        </w:tc>
+        <w:tc>
+          <w:tcPr/>
+          <w:p>
+            <w:pPr>
+              <w:pStyle w:val="Compact"/>
+              <w:jc w:val="left"/>
+            </w:pPr>
+            <w:r>
+              <w:t xml:space="preserve">+0.304***</w:t>
             </w:r>
           </w:p>
         </w:tc>
@@ -3909,31 +3917,31 @@
               <w:jc w:val="left"/>
             </w:pPr>
             <w:r>
-              <w:t xml:space="preserve">−0.030</w:t>
-            </w:r>
-          </w:p>
-        </w:tc>
-        <w:tc>
-          <w:tcPr/>
-          <w:p>
-            <w:pPr>
-              <w:pStyle w:val="Compact"/>
-              <w:jc w:val="left"/>
-            </w:pPr>
-            <w:r>
-              <w:t xml:space="preserve">+0.215</w:t>
-            </w:r>
-          </w:p>
-        </w:tc>
-        <w:tc>
-          <w:tcPr/>
-          <w:p>
-            <w:pPr>
-              <w:pStyle w:val="Compact"/>
-              <w:jc w:val="left"/>
-            </w:pPr>
-            <w:r>
-              <w:t xml:space="preserve">+0.237</w:t>
+              <w:t xml:space="preserve">−0.144</w:t>
+            </w:r>
+          </w:p>
+        </w:tc>
+        <w:tc>
+          <w:tcPr/>
+          <w:p>
+            <w:pPr>
+              <w:pStyle w:val="Compact"/>
+              <w:jc w:val="left"/>
+            </w:pPr>
+            <w:r>
+              <w:t xml:space="preserve">+0.113</w:t>
+            </w:r>
+          </w:p>
+        </w:tc>
+        <w:tc>
+          <w:tcPr/>
+          <w:p>
+            <w:pPr>
+              <w:pStyle w:val="Compact"/>
+              <w:jc w:val="left"/>
+            </w:pPr>
+            <w:r>
+              <w:t xml:space="preserve">+0.134</w:t>
             </w:r>
           </w:p>
         </w:tc>
@@ -3983,31 +3991,31 @@
               <w:jc w:val="left"/>
             </w:pPr>
             <w:r>
-              <w:t xml:space="preserve">−0.315</w:t>
-            </w:r>
-          </w:p>
-        </w:tc>
-        <w:tc>
-          <w:tcPr/>
-          <w:p>
-            <w:pPr>
-              <w:pStyle w:val="Compact"/>
-              <w:jc w:val="left"/>
-            </w:pPr>
-            <w:r>
-              <w:t xml:space="preserve">−0.584*</w:t>
-            </w:r>
-          </w:p>
-        </w:tc>
-        <w:tc>
-          <w:tcPr/>
-          <w:p>
-            <w:pPr>
-              <w:pStyle w:val="Compact"/>
-              <w:jc w:val="left"/>
-            </w:pPr>
-            <w:r>
-              <w:t xml:space="preserve">−0.569†</w:t>
+              <w:t xml:space="preserve">−0.137</w:t>
+            </w:r>
+          </w:p>
+        </w:tc>
+        <w:tc>
+          <w:tcPr/>
+          <w:p>
+            <w:pPr>
+              <w:pStyle w:val="Compact"/>
+              <w:jc w:val="left"/>
+            </w:pPr>
+            <w:r>
+              <w:t xml:space="preserve">−0.418</w:t>
+            </w:r>
+          </w:p>
+        </w:tc>
+        <w:tc>
+          <w:tcPr/>
+          <w:p>
+            <w:pPr>
+              <w:pStyle w:val="Compact"/>
+              <w:jc w:val="left"/>
+            </w:pPr>
+            <w:r>
+              <w:t xml:space="preserve">−0.398</w:t>
             </w:r>
           </w:p>
         </w:tc>
@@ -4069,19 +4077,19 @@
               <w:jc w:val="left"/>
             </w:pPr>
             <w:r>
-              <w:t xml:space="preserve">+0.154***</w:t>
-            </w:r>
-          </w:p>
-        </w:tc>
-        <w:tc>
-          <w:tcPr/>
-          <w:p>
-            <w:pPr>
-              <w:pStyle w:val="Compact"/>
-              <w:jc w:val="left"/>
-            </w:pPr>
-            <w:r>
-              <w:t xml:space="preserve">+0.143***</w:t>
+              <w:t xml:space="preserve">+0.155***</w:t>
+            </w:r>
+          </w:p>
+        </w:tc>
+        <w:tc>
+          <w:tcPr/>
+          <w:p>
+            <w:pPr>
+              <w:pStyle w:val="Compact"/>
+              <w:jc w:val="left"/>
+            </w:pPr>
+            <w:r>
+              <w:t xml:space="preserve">+0.145***</w:t>
             </w:r>
           </w:p>
         </w:tc>
@@ -4143,19 +4151,19 @@
               <w:jc w:val="left"/>
             </w:pPr>
             <w:r>
-              <w:t xml:space="preserve">−0.583***</w:t>
-            </w:r>
-          </w:p>
-        </w:tc>
-        <w:tc>
-          <w:tcPr/>
-          <w:p>
-            <w:pPr>
-              <w:pStyle w:val="Compact"/>
-              <w:jc w:val="left"/>
-            </w:pPr>
-            <w:r>
-              <w:t xml:space="preserve">−0.749***</w:t>
+              <w:t xml:space="preserve">−0.614***</w:t>
+            </w:r>
+          </w:p>
+        </w:tc>
+        <w:tc>
+          <w:tcPr/>
+          <w:p>
+            <w:pPr>
+              <w:pStyle w:val="Compact"/>
+              <w:jc w:val="left"/>
+            </w:pPr>
+            <w:r>
+              <w:t xml:space="preserve">−0.780***</w:t>
             </w:r>
           </w:p>
         </w:tc>
@@ -4217,19 +4225,19 @@
               <w:jc w:val="left"/>
             </w:pPr>
             <w:r>
-              <w:t xml:space="preserve">+0.733**</w:t>
-            </w:r>
-          </w:p>
-        </w:tc>
-        <w:tc>
-          <w:tcPr/>
-          <w:p>
-            <w:pPr>
-              <w:pStyle w:val="Compact"/>
-              <w:jc w:val="left"/>
-            </w:pPr>
-            <w:r>
-              <w:t xml:space="preserve">+0.962***</w:t>
+              <w:t xml:space="preserve">+0.766**</w:t>
+            </w:r>
+          </w:p>
+        </w:tc>
+        <w:tc>
+          <w:tcPr/>
+          <w:p>
+            <w:pPr>
+              <w:pStyle w:val="Compact"/>
+              <w:jc w:val="left"/>
+            </w:pPr>
+            <w:r>
+              <w:t xml:space="preserve">+0.994***</w:t>
             </w:r>
           </w:p>
         </w:tc>
@@ -4377,7 +4385,7 @@
               <w:jc w:val="left"/>
             </w:pPr>
             <w:r>
-              <w:t xml:space="preserve">+0.133**</w:t>
+              <w:t xml:space="preserve">+0.185***</w:t>
             </w:r>
           </w:p>
         </w:tc>
@@ -4637,43 +4645,43 @@
               <w:jc w:val="left"/>
             </w:pPr>
             <w:r>
-              <w:t xml:space="preserve">82,616</w:t>
-            </w:r>
-          </w:p>
-        </w:tc>
-        <w:tc>
-          <w:tcPr/>
-          <w:p>
-            <w:pPr>
-              <w:pStyle w:val="Compact"/>
-              <w:jc w:val="left"/>
-            </w:pPr>
-            <w:r>
-              <w:t xml:space="preserve">37,075</w:t>
-            </w:r>
-          </w:p>
-        </w:tc>
-        <w:tc>
-          <w:tcPr/>
-          <w:p>
-            <w:pPr>
-              <w:pStyle w:val="Compact"/>
-              <w:jc w:val="left"/>
-            </w:pPr>
-            <w:r>
-              <w:t xml:space="preserve">36,965</w:t>
-            </w:r>
-          </w:p>
-        </w:tc>
-        <w:tc>
-          <w:tcPr/>
-          <w:p>
-            <w:pPr>
-              <w:pStyle w:val="Compact"/>
-              <w:jc w:val="left"/>
-            </w:pPr>
-            <w:r>
-              <w:t xml:space="preserve">34,595</w:t>
+              <w:t xml:space="preserve">84,910</w:t>
+            </w:r>
+          </w:p>
+        </w:tc>
+        <w:tc>
+          <w:tcPr/>
+          <w:p>
+            <w:pPr>
+              <w:pStyle w:val="Compact"/>
+              <w:jc w:val="left"/>
+            </w:pPr>
+            <w:r>
+              <w:t xml:space="preserve">38,051</w:t>
+            </w:r>
+          </w:p>
+        </w:tc>
+        <w:tc>
+          <w:tcPr/>
+          <w:p>
+            <w:pPr>
+              <w:pStyle w:val="Compact"/>
+              <w:jc w:val="left"/>
+            </w:pPr>
+            <w:r>
+              <w:t xml:space="preserve">37,940</w:t>
+            </w:r>
+          </w:p>
+        </w:tc>
+        <w:tc>
+          <w:tcPr/>
+          <w:p>
+            <w:pPr>
+              <w:pStyle w:val="Compact"/>
+              <w:jc w:val="left"/>
+            </w:pPr>
+            <w:r>
+              <w:t xml:space="preserve">35,568</w:t>
             </w:r>
           </w:p>
         </w:tc>
@@ -4723,31 +4731,31 @@
               <w:jc w:val="left"/>
             </w:pPr>
             <w:r>
-              <w:t xml:space="preserve">.024</w:t>
-            </w:r>
-          </w:p>
-        </w:tc>
-        <w:tc>
-          <w:tcPr/>
-          <w:p>
-            <w:pPr>
-              <w:pStyle w:val="Compact"/>
-              <w:jc w:val="left"/>
-            </w:pPr>
-            <w:r>
-              <w:t xml:space="preserve">.029</w:t>
-            </w:r>
-          </w:p>
-        </w:tc>
-        <w:tc>
-          <w:tcPr/>
-          <w:p>
-            <w:pPr>
-              <w:pStyle w:val="Compact"/>
-              <w:jc w:val="left"/>
-            </w:pPr>
-            <w:r>
-              <w:t xml:space="preserve">.033</w:t>
+              <w:t xml:space="preserve">.025</w:t>
+            </w:r>
+          </w:p>
+        </w:tc>
+        <w:tc>
+          <w:tcPr/>
+          <w:p>
+            <w:pPr>
+              <w:pStyle w:val="Compact"/>
+              <w:jc w:val="left"/>
+            </w:pPr>
+            <w:r>
+              <w:t xml:space="preserve">.030</w:t>
+            </w:r>
+          </w:p>
+        </w:tc>
+        <w:tc>
+          <w:tcPr/>
+          <w:p>
+            <w:pPr>
+              <w:pStyle w:val="Compact"/>
+              <w:jc w:val="left"/>
+            </w:pPr>
+            <w:r>
+              <w:t xml:space="preserve">.035</w:t>
             </w:r>
           </w:p>
         </w:tc>

</xml_diff>

<commit_message>
feat(p7): integrate WB 2026 documents into mgr_female and policy sections
- §5.4: Add Care for Growth 2026 (Buchhave et al.) + IFC 2022 (Mind the Gaps)
  as supply-side corroboration for female manager premium (≈17–20%)
  — Vietnam female/male LF ratio 88.61%; childbirth income penalty −27%
  confirms female managers are a highly selected, committed stratum
- §6: Add April 2026 macro monitoring context (Vietnam PMI 45.3 contraction,
  US trade investigation, Strait of Hormuz energy disruption) as near-term
  policy urgency framing for FSTS turning-point findings
- References (p7 + thesis/04_references_apa7.md): Add 10 new APA7 entries
  — Buchhave et al. (2026), IFC (2022), World Bank Macro Monitoring (2026b),
  DPI approach (2025a), Vietnam Economic Update (2025b), Prosperity Data360
  Justice (2024) and Finance (2025c), ID4D Annual Report (2026a), Korea GDKC

https://claude.ai/code/session_01GMFmEtt6FYiJ4MKzBNCLqb
</commit_message>
<xml_diff>
--- a/p7/p7_capstone_en_clean.docx
+++ b/p7/p7_capstone_en_clean.docx
@@ -1190,6 +1190,30 @@
         <w:t xml:space="preserve">The consistent and significant performance premium for female top managers (approximately 17–20% across specifications) is notable given the diversity of economies in our sample, from conservative Gulf economies (Bahrain, Iraq) to progressive innovation hubs (Korea, Singapore, Israel). This cross-context robustness supports the view that female top management is a genuine resource (Hambrick &amp; Mason, 1984; Richard et al., 2019), not merely a proxy for firm governance quality. The null curve-moderation result (FSTS×female_manager not significant) suggests that the performance premium is universal across FSTS levels — female managers improve absolute performance but do not help firms navigate internationalisation more efficiently.</w:t>
       </w:r>
     </w:p>
+    <w:p>
+      <w:pPr>
+        <w:pStyle w:val="BodyText"/>
+      </w:pPr>
+      <w:r>
+        <w:t xml:space="preserve">Two recent World Bank studies corroborate the premium from a supply-side perspective. In Vietnam — one of our largest ICRV Group IV contributors, with a female-to-male labour force participation ratio of 88.61% (World Bank Prosperity Data360, 2025) — the</w:t>
+      </w:r>
+      <w:r>
+        <w:t xml:space="preserve"> </w:t>
+      </w:r>
+      <w:r>
+        <w:rPr>
+          <w:iCs/>
+          <w:i/>
+        </w:rPr>
+        <w:t xml:space="preserve">Care for Growth</w:t>
+      </w:r>
+      <w:r>
+        <w:t xml:space="preserve"> </w:t>
+      </w:r>
+      <w:r>
+        <w:t xml:space="preserve">policy note (Buchhave et al., 2026) documents that women who hold management positions have cleared exceptional retention barriers: childbirth reduces women’s wage employment probability by 8.1 percentage points and urban household income by 27%, with no significant effect on fathers. Women who reach managerial rank therefore represent a highly selected and committed workforce stratum, consistent with the productivity premium we estimate. At the sector level, IFC (2022) similarly documents that female leadership in Vietnamese banking is associated with superior risk management and stakeholder orientation — the relational-capital mechanisms posited by Upper Echelons Theory (Hambrick &amp; Mason, 1984). These convergent pieces of evidence strengthen the interpretation that the WBES-estimated premium reflects genuine managerial capability rather than endogenous selection into high-productivity firms.</w:t>
+      </w:r>
+    </w:p>
     <w:bookmarkEnd w:id="45"/>
     <w:bookmarkStart w:id="46" w:name="limitations"/>
     <w:p>
@@ -1249,7 +1273,23 @@
         <w:pStyle w:val="FirstParagraph"/>
       </w:pPr>
       <w:r>
-        <w:t xml:space="preserve">We find that the inverted-U I–P relationship holds robustly across a 49-economy, 102-wave WBES sample, with a turning point of approximately 36% foreign sales intensity. Three conclusions are policy-relevant. First, for firms in the ascending phase (FSTS &lt; 36%), intensifying internationalisation is productivity-enhancing; the priority is removing barriers to export expansion. For firms beyond the turning point, the constraint is not market access but coordination capacity. Second, building technological capability raises the performance level across all FSTS levels without reliably reshaping the curve; policy should target capability building as a baseline performance lever rather than as a curve-shifting intervention. Third, digital adoption is both a universal performance enhancer and a primary curve reshaper: DAI compresses ascending-limb returns and attenuates descending-limb performance decline, with stronger returns in weaker institutional environments (DAI×ICRV, p = .012). Future research should leverage the growing panel dimensions of WBES to establish causality, and incorporate Tier 3–4 digital capability measures (AI adoption, cloud computing, platform participation) as these items become available in the 2025+ WBES waves.</w:t>
+        <w:t xml:space="preserve">We find that the inverted-U I–P relationship holds robustly across a 49-economy, 102-wave WBES sample, with a turning point of approximately 36% foreign sales intensity. Three conclusions are policy-relevant. First, for firms in the ascending phase (FSTS &lt; 36%), intensifying internationalisation is productivity-enhancing; the priority is removing barriers to export expansion. For firms beyond the turning point, the constraint is not market access but coordination capacity. Second, building technological capability raises the performance level across all FSTS levels without reliably reshaping the curve; policy should target capability building as a baseline performance lever rather than as a curve-shifting intervention. Third, digital adoption is both a universal performance enhancer and a primary curve reshaper: DAI compresses ascending-limb returns and attenuates descending-limb performance decline, with stronger returns in weaker institutional environments (DAI×ICRV, p = .012).</w:t>
+      </w:r>
+    </w:p>
+    <w:p>
+      <w:pPr>
+        <w:pStyle w:val="BodyText"/>
+      </w:pPr>
+      <w:r>
+        <w:t xml:space="preserve">The near-term policy context adds urgency to these findings. World Bank (2026b) macro monitoring data for Vietnam — the largest ICRV Group IV economy in the sample — show manufacturing PMI falling to 45.3 (contraction) in March 2026 as new export orders collapsed following the opening of a U.S. trade-representative investigation; merchandise imports had risen 27.8% year-on-year by the same month, partly driven by energy supply-chain disruption from the Strait of Hormuz conflict. These conditions are precisely those under which the right-side of the inverted-U becomes consequential: firms pushed above their optimal FSTS by earlier export commitments face amplified coordination and input-cost pressures. The ICRV moderation result — that Group IV firms face steeper descending-limb penalties — implies that Vietnamese exporters currently above the 36% FSTS turning point are among the most exposed to macro shocks. Policies promoting digital capability adoption (DAI) can buffer this descent by compressing the descending limb, consistent with our M8/M9 estimates.</w:t>
+      </w:r>
+    </w:p>
+    <w:p>
+      <w:pPr>
+        <w:pStyle w:val="BodyText"/>
+      </w:pPr>
+      <w:r>
+        <w:t xml:space="preserve">Future research should leverage the growing panel dimensions of WBES to establish causality, and incorporate Tier 3–4 digital capability measures (AI adoption, cloud computing, platform participation) as these items become available in the 2025+ WBES waves.</w:t>
       </w:r>
     </w:p>
     <w:p>
@@ -1316,7 +1356,7 @@
         <w:pStyle w:val="BodyText"/>
       </w:pPr>
       <w:r>
-        <w:t xml:space="preserve">Bausch, A., &amp; Krist, M. (2007). The effect of context-related moderators on the internationalization-performance relationship: Evidence from meta-analysis.</w:t>
+        <w:t xml:space="preserve">Buchhave, H., Nguyen, C. V., Vu, C., Nguyen, G. T., &amp; Zumbyte, I. (2026).</w:t>
       </w:r>
       <w:r>
         <w:t xml:space="preserve"> </w:t>
@@ -1326,18 +1366,21 @@
           <w:iCs/>
           <w:i/>
         </w:rPr>
-        <w:t xml:space="preserve">Management International Review, 47</w:t>
-      </w:r>
-      <w:r>
-        <w:t xml:space="preserve">(3), 319–347. https://doi.org/10.1007/s11575-007-0019-z</w:t>
-      </w:r>
-    </w:p>
-    <w:p>
-      <w:pPr>
-        <w:pStyle w:val="BodyText"/>
-      </w:pPr>
-      <w:r>
-        <w:t xml:space="preserve">Chiao, Y.-C., Yang, K.-P., &amp; Yu, C.-M. J. (2006). Performance, internationalization, and firm-specific advantages of SMEs in a newly-industrialized economy.</w:t>
+        <w:t xml:space="preserve">Care for growth: Making industrial jobs work for women in Viet Nam</w:t>
+      </w:r>
+      <w:r>
+        <w:t xml:space="preserve"> </w:t>
+      </w:r>
+      <w:r>
+        <w:t xml:space="preserve">(Policy Summary Note). World Bank Group &amp; Australian Aid.</w:t>
+      </w:r>
+    </w:p>
+    <w:p>
+      <w:pPr>
+        <w:pStyle w:val="BodyText"/>
+      </w:pPr>
+      <w:r>
+        <w:t xml:space="preserve">Bausch, A., &amp; Krist, M. (2007). The effect of context-related moderators on the internationalization-performance relationship: Evidence from meta-analysis.</w:t>
       </w:r>
       <w:r>
         <w:t xml:space="preserve"> </w:t>
@@ -1347,18 +1390,18 @@
           <w:iCs/>
           <w:i/>
         </w:rPr>
-        <w:t xml:space="preserve">Small Business Economics, 26</w:t>
-      </w:r>
-      <w:r>
-        <w:t xml:space="preserve">(5), 475–492. https://doi.org/10.1007/s11187-005-5599-z</w:t>
-      </w:r>
-    </w:p>
-    <w:p>
-      <w:pPr>
-        <w:pStyle w:val="BodyText"/>
-      </w:pPr>
-      <w:r>
-        <w:t xml:space="preserve">Cho, H., Kim, C., &amp; Han, S. (2023). Business group affiliation and the internationalization–performance relationship: Evidence from Korean firms.</w:t>
+        <w:t xml:space="preserve">Management International Review, 47</w:t>
+      </w:r>
+      <w:r>
+        <w:t xml:space="preserve">(3), 319–347. https://doi.org/10.1007/s11575-007-0019-z</w:t>
+      </w:r>
+    </w:p>
+    <w:p>
+      <w:pPr>
+        <w:pStyle w:val="BodyText"/>
+      </w:pPr>
+      <w:r>
+        <w:t xml:space="preserve">Chiao, Y.-C., Yang, K.-P., &amp; Yu, C.-M. J. (2006). Performance, internationalization, and firm-specific advantages of SMEs in a newly-industrialized economy.</w:t>
       </w:r>
       <w:r>
         <w:t xml:space="preserve"> </w:t>
@@ -1368,18 +1411,18 @@
           <w:iCs/>
           <w:i/>
         </w:rPr>
-        <w:t xml:space="preserve">Journal of International Business Studies, 54</w:t>
-      </w:r>
-      <w:r>
-        <w:t xml:space="preserve">(3), 487–509.</w:t>
-      </w:r>
-    </w:p>
-    <w:p>
-      <w:pPr>
-        <w:pStyle w:val="BodyText"/>
-      </w:pPr>
-      <w:r>
-        <w:t xml:space="preserve">Cohen, W. M., &amp; Levinthal, D. A. (1990). Absorptive capacity: A new perspective on learning and innovation.</w:t>
+        <w:t xml:space="preserve">Small Business Economics, 26</w:t>
+      </w:r>
+      <w:r>
+        <w:t xml:space="preserve">(5), 475–492. https://doi.org/10.1007/s11187-005-5599-z</w:t>
+      </w:r>
+    </w:p>
+    <w:p>
+      <w:pPr>
+        <w:pStyle w:val="BodyText"/>
+      </w:pPr>
+      <w:r>
+        <w:t xml:space="preserve">Cho, H., Kim, C., &amp; Han, S. (2023). Business group affiliation and the internationalization–performance relationship: Evidence from Korean firms.</w:t>
       </w:r>
       <w:r>
         <w:t xml:space="preserve"> </w:t>
@@ -1389,18 +1432,18 @@
           <w:iCs/>
           <w:i/>
         </w:rPr>
-        <w:t xml:space="preserve">Administrative Science Quarterly, 35</w:t>
-      </w:r>
-      <w:r>
-        <w:t xml:space="preserve">(1), 128–152. https://doi.org/10.2307/2393553</w:t>
-      </w:r>
-    </w:p>
-    <w:p>
-      <w:pPr>
-        <w:pStyle w:val="BodyText"/>
-      </w:pPr>
-      <w:r>
-        <w:t xml:space="preserve">Contractor, F. J., Kundu, S. K., &amp; Hsu, C.-C. (2003). A three-stage theory of international expansion: The link between multinationality and performance in the service sector.</w:t>
+        <w:t xml:space="preserve">Journal of International Business Studies, 54</w:t>
+      </w:r>
+      <w:r>
+        <w:t xml:space="preserve">(3), 487–509.</w:t>
+      </w:r>
+    </w:p>
+    <w:p>
+      <w:pPr>
+        <w:pStyle w:val="BodyText"/>
+      </w:pPr>
+      <w:r>
+        <w:t xml:space="preserve">Cohen, W. M., &amp; Levinthal, D. A. (1990). Absorptive capacity: A new perspective on learning and innovation.</w:t>
       </w:r>
       <w:r>
         <w:t xml:space="preserve"> </w:t>
@@ -1410,18 +1453,18 @@
           <w:iCs/>
           <w:i/>
         </w:rPr>
-        <w:t xml:space="preserve">Journal of International Business Studies, 34</w:t>
-      </w:r>
-      <w:r>
-        <w:t xml:space="preserve">(1), 5–18. https://doi.org/10.1057/palgrave.jibs.8400003</w:t>
-      </w:r>
-    </w:p>
-    <w:p>
-      <w:pPr>
-        <w:pStyle w:val="BodyText"/>
-      </w:pPr>
-      <w:r>
-        <w:t xml:space="preserve">Contractor, F. J., Kumar, V., &amp; Kundu, S. K. (2007). Nature of the relationship between international expansion and performance: The case of emerging market firms.</w:t>
+        <w:t xml:space="preserve">Administrative Science Quarterly, 35</w:t>
+      </w:r>
+      <w:r>
+        <w:t xml:space="preserve">(1), 128–152. https://doi.org/10.2307/2393553</w:t>
+      </w:r>
+    </w:p>
+    <w:p>
+      <w:pPr>
+        <w:pStyle w:val="BodyText"/>
+      </w:pPr>
+      <w:r>
+        <w:t xml:space="preserve">Contractor, F. J., Kundu, S. K., &amp; Hsu, C.-C. (2003). A three-stage theory of international expansion: The link between multinationality and performance in the service sector.</w:t>
       </w:r>
       <w:r>
         <w:t xml:space="preserve"> </w:t>
@@ -1431,18 +1474,18 @@
           <w:iCs/>
           <w:i/>
         </w:rPr>
-        <w:t xml:space="preserve">Journal of World Business, 42</w:t>
-      </w:r>
-      <w:r>
-        <w:t xml:space="preserve">(4), 401–417. https://doi.org/10.1016/j.jwb.2007.06.003</w:t>
-      </w:r>
-    </w:p>
-    <w:p>
-      <w:pPr>
-        <w:pStyle w:val="BodyText"/>
-      </w:pPr>
-      <w:r>
-        <w:t xml:space="preserve">Cuervo-Cazurra, A., Ciravegna, L., Melgarejo, M., &amp; Lopez, L. (2018). Home country uncertainty and the internationalization-performance relationship: Building an uncertainty management capability.</w:t>
+        <w:t xml:space="preserve">Journal of International Business Studies, 34</w:t>
+      </w:r>
+      <w:r>
+        <w:t xml:space="preserve">(1), 5–18. https://doi.org/10.1057/palgrave.jibs.8400003</w:t>
+      </w:r>
+    </w:p>
+    <w:p>
+      <w:pPr>
+        <w:pStyle w:val="BodyText"/>
+      </w:pPr>
+      <w:r>
+        <w:t xml:space="preserve">Contractor, F. J., Kumar, V., &amp; Kundu, S. K. (2007). Nature of the relationship between international expansion and performance: The case of emerging market firms.</w:t>
       </w:r>
       <w:r>
         <w:t xml:space="preserve"> </w:t>
@@ -1452,18 +1495,18 @@
           <w:iCs/>
           <w:i/>
         </w:rPr>
-        <w:t xml:space="preserve">Journal of World Business, 53</w:t>
-      </w:r>
-      <w:r>
-        <w:t xml:space="preserve">(2), 209–221. https://doi.org/10.1016/j.jwb.2017.11.003</w:t>
-      </w:r>
-    </w:p>
-    <w:p>
-      <w:pPr>
-        <w:pStyle w:val="BodyText"/>
-      </w:pPr>
-      <w:r>
-        <w:t xml:space="preserve">Dawson, J. F. (2014). Moderation in management research: What, why, when, and how.</w:t>
+        <w:t xml:space="preserve">Journal of World Business, 42</w:t>
+      </w:r>
+      <w:r>
+        <w:t xml:space="preserve">(4), 401–417. https://doi.org/10.1016/j.jwb.2007.06.003</w:t>
+      </w:r>
+    </w:p>
+    <w:p>
+      <w:pPr>
+        <w:pStyle w:val="BodyText"/>
+      </w:pPr>
+      <w:r>
+        <w:t xml:space="preserve">Cuervo-Cazurra, A., Ciravegna, L., Melgarejo, M., &amp; Lopez, L. (2018). Home country uncertainty and the internationalization-performance relationship: Building an uncertainty management capability.</w:t>
       </w:r>
       <w:r>
         <w:t xml:space="preserve"> </w:t>
@@ -1473,18 +1516,18 @@
           <w:iCs/>
           <w:i/>
         </w:rPr>
-        <w:t xml:space="preserve">Journal of Business and Psychology, 29</w:t>
-      </w:r>
-      <w:r>
-        <w:t xml:space="preserve">(1), 1–19. https://doi.org/10.1007/s10869-013-9308-7</w:t>
-      </w:r>
-    </w:p>
-    <w:p>
-      <w:pPr>
-        <w:pStyle w:val="BodyText"/>
-      </w:pPr>
-      <w:r>
-        <w:t xml:space="preserve">Đỗ, T. H., &amp; Phan, A. T. (2024).</w:t>
+        <w:t xml:space="preserve">Journal of World Business, 53</w:t>
+      </w:r>
+      <w:r>
+        <w:t xml:space="preserve">(2), 209–221. https://doi.org/10.1016/j.jwb.2017.11.003</w:t>
+      </w:r>
+    </w:p>
+    <w:p>
+      <w:pPr>
+        <w:pStyle w:val="BodyText"/>
+      </w:pPr>
+      <w:r>
+        <w:t xml:space="preserve">Dawson, J. F. (2014). Moderation in management research: What, why, when, and how.</w:t>
       </w:r>
       <w:r>
         <w:t xml:space="preserve"> </w:t>
@@ -1494,18 +1537,18 @@
           <w:iCs/>
           <w:i/>
         </w:rPr>
-        <w:t xml:space="preserve">Internationalization and firm performance: A meta-analysis for Asia-Pacific economies</w:t>
-      </w:r>
-      <w:r>
-        <w:t xml:space="preserve">. Paper presented at the International Conference on Business, Economics, and Finance (ICBEF 2024). Can Tho University.</w:t>
-      </w:r>
-    </w:p>
-    <w:p>
-      <w:pPr>
-        <w:pStyle w:val="BodyText"/>
-      </w:pPr>
-      <w:r>
-        <w:t xml:space="preserve">Gomes, L., &amp; Ramaswamy, K. (1999). An empirical examination of the form of the relationship between multinationality and performance.</w:t>
+        <w:t xml:space="preserve">Journal of Business and Psychology, 29</w:t>
+      </w:r>
+      <w:r>
+        <w:t xml:space="preserve">(1), 1–19. https://doi.org/10.1007/s10869-013-9308-7</w:t>
+      </w:r>
+    </w:p>
+    <w:p>
+      <w:pPr>
+        <w:pStyle w:val="BodyText"/>
+      </w:pPr>
+      <w:r>
+        <w:t xml:space="preserve">Đỗ, T. H., &amp; Phan, A. T. (2024).</w:t>
       </w:r>
       <w:r>
         <w:t xml:space="preserve"> </w:t>
@@ -1515,18 +1558,18 @@
           <w:iCs/>
           <w:i/>
         </w:rPr>
-        <w:t xml:space="preserve">Journal of International Business Studies, 30</w:t>
-      </w:r>
-      <w:r>
-        <w:t xml:space="preserve">(1), 173–187. https://doi.org/10.1057/palgrave.jibs.8490065</w:t>
-      </w:r>
-    </w:p>
-    <w:p>
-      <w:pPr>
-        <w:pStyle w:val="BodyText"/>
-      </w:pPr>
-      <w:r>
-        <w:t xml:space="preserve">Hambrick, D. C. (2007). Upper echelons theory: An update.</w:t>
+        <w:t xml:space="preserve">Internationalization and firm performance: A meta-analysis for Asia-Pacific economies</w:t>
+      </w:r>
+      <w:r>
+        <w:t xml:space="preserve">. Paper presented at the International Conference on Business, Economics, and Finance (ICBEF 2024). Can Tho University.</w:t>
+      </w:r>
+    </w:p>
+    <w:p>
+      <w:pPr>
+        <w:pStyle w:val="BodyText"/>
+      </w:pPr>
+      <w:r>
+        <w:t xml:space="preserve">Gomes, L., &amp; Ramaswamy, K. (1999). An empirical examination of the form of the relationship between multinationality and performance.</w:t>
       </w:r>
       <w:r>
         <w:t xml:space="preserve"> </w:t>
@@ -1536,18 +1579,18 @@
           <w:iCs/>
           <w:i/>
         </w:rPr>
-        <w:t xml:space="preserve">Academy of Management Review, 32</w:t>
-      </w:r>
-      <w:r>
-        <w:t xml:space="preserve">(2), 334–343. https://doi.org/10.5465/amr.2007.24345254</w:t>
-      </w:r>
-    </w:p>
-    <w:p>
-      <w:pPr>
-        <w:pStyle w:val="BodyText"/>
-      </w:pPr>
-      <w:r>
-        <w:t xml:space="preserve">Hambrick, D. C., &amp; Mason, P. A. (1984). Upper echelons: The organization as a reflection of its top managers.</w:t>
+        <w:t xml:space="preserve">Journal of International Business Studies, 30</w:t>
+      </w:r>
+      <w:r>
+        <w:t xml:space="preserve">(1), 173–187. https://doi.org/10.1057/palgrave.jibs.8490065</w:t>
+      </w:r>
+    </w:p>
+    <w:p>
+      <w:pPr>
+        <w:pStyle w:val="BodyText"/>
+      </w:pPr>
+      <w:r>
+        <w:t xml:space="preserve">Hambrick, D. C. (2007). Upper echelons theory: An update.</w:t>
       </w:r>
       <w:r>
         <w:t xml:space="preserve"> </w:t>
@@ -1557,18 +1600,18 @@
           <w:iCs/>
           <w:i/>
         </w:rPr>
-        <w:t xml:space="preserve">Academy of Management Review, 9</w:t>
-      </w:r>
-      <w:r>
-        <w:t xml:space="preserve">(2), 193–206. https://doi.org/10.5465/amr.1984.4277628</w:t>
-      </w:r>
-    </w:p>
-    <w:p>
-      <w:pPr>
-        <w:pStyle w:val="BodyText"/>
-      </w:pPr>
-      <w:r>
-        <w:t xml:space="preserve">Hayes, A. F. (2018).</w:t>
+        <w:t xml:space="preserve">Academy of Management Review, 32</w:t>
+      </w:r>
+      <w:r>
+        <w:t xml:space="preserve">(2), 334–343. https://doi.org/10.5465/amr.2007.24345254</w:t>
+      </w:r>
+    </w:p>
+    <w:p>
+      <w:pPr>
+        <w:pStyle w:val="BodyText"/>
+      </w:pPr>
+      <w:r>
+        <w:t xml:space="preserve">Hambrick, D. C., &amp; Mason, P. A. (1984). Upper echelons: The organization as a reflection of its top managers.</w:t>
       </w:r>
       <w:r>
         <w:t xml:space="preserve"> </w:t>
@@ -1578,21 +1621,18 @@
           <w:iCs/>
           <w:i/>
         </w:rPr>
-        <w:t xml:space="preserve">Introduction to mediation, moderation, and conditional process analysis: A regression-based approach</w:t>
-      </w:r>
-      <w:r>
-        <w:t xml:space="preserve"> </w:t>
-      </w:r>
-      <w:r>
-        <w:t xml:space="preserve">(2nd ed.). Guilford Press.</w:t>
-      </w:r>
-    </w:p>
-    <w:p>
-      <w:pPr>
-        <w:pStyle w:val="BodyText"/>
-      </w:pPr>
-      <w:r>
-        <w:t xml:space="preserve">Johanson, J., &amp; Vahlne, J.-E. (1977). The internationalization process of the firm—A model of knowledge development and increasing foreign market commitments.</w:t>
+        <w:t xml:space="preserve">Academy of Management Review, 9</w:t>
+      </w:r>
+      <w:r>
+        <w:t xml:space="preserve">(2), 193–206. https://doi.org/10.5465/amr.1984.4277628</w:t>
+      </w:r>
+    </w:p>
+    <w:p>
+      <w:pPr>
+        <w:pStyle w:val="BodyText"/>
+      </w:pPr>
+      <w:r>
+        <w:t xml:space="preserve">Hayes, A. F. (2018).</w:t>
       </w:r>
       <w:r>
         <w:t xml:space="preserve"> </w:t>
@@ -1602,18 +1642,21 @@
           <w:iCs/>
           <w:i/>
         </w:rPr>
-        <w:t xml:space="preserve">Journal of International Business Studies, 8</w:t>
-      </w:r>
-      <w:r>
-        <w:t xml:space="preserve">(1), 23–32. https://doi.org/10.1057/palgrave.jibs.8490676</w:t>
-      </w:r>
-    </w:p>
-    <w:p>
-      <w:pPr>
-        <w:pStyle w:val="BodyText"/>
-      </w:pPr>
-      <w:r>
-        <w:t xml:space="preserve">Johanson, J., &amp; Vahlne, J.-E. (2009). The Uppsala internationalization process model revisited: From liability of foreignness to liability of outsidership.</w:t>
+        <w:t xml:space="preserve">Introduction to mediation, moderation, and conditional process analysis: A regression-based approach</w:t>
+      </w:r>
+      <w:r>
+        <w:t xml:space="preserve"> </w:t>
+      </w:r>
+      <w:r>
+        <w:t xml:space="preserve">(2nd ed.). Guilford Press.</w:t>
+      </w:r>
+    </w:p>
+    <w:p>
+      <w:pPr>
+        <w:pStyle w:val="BodyText"/>
+      </w:pPr>
+      <w:r>
+        <w:t xml:space="preserve">International Finance Corporation. (2022, December).</w:t>
       </w:r>
       <w:r>
         <w:t xml:space="preserve"> </w:t>
@@ -1623,18 +1666,18 @@
           <w:iCs/>
           <w:i/>
         </w:rPr>
-        <w:t xml:space="preserve">Journal of International Business Studies, 40</w:t>
-      </w:r>
-      <w:r>
-        <w:t xml:space="preserve">(9), 1411–1431. https://doi.org/10.1057/jibs.2009.24</w:t>
-      </w:r>
-    </w:p>
-    <w:p>
-      <w:pPr>
-        <w:pStyle w:val="BodyText"/>
-      </w:pPr>
-      <w:r>
-        <w:t xml:space="preserve">Kirca, A. H., Roth, K., Hult, G. T. M., &amp; Cavusgil, S. T. (2012). The role of context in the multinationality–performance relationship: A meta-analytic review.</w:t>
+        <w:t xml:space="preserve">Mind the gaps: Women in leadership in Viet Nam’s banking sector</w:t>
+      </w:r>
+      <w:r>
+        <w:t xml:space="preserve">. IFC, World Bank Group.</w:t>
+      </w:r>
+    </w:p>
+    <w:p>
+      <w:pPr>
+        <w:pStyle w:val="BodyText"/>
+      </w:pPr>
+      <w:r>
+        <w:t xml:space="preserve">Johanson, J., &amp; Vahlne, J.-E. (1977). The internationalization process of the firm—A model of knowledge development and increasing foreign market commitments.</w:t>
       </w:r>
       <w:r>
         <w:t xml:space="preserve"> </w:t>
@@ -1644,18 +1687,18 @@
           <w:iCs/>
           <w:i/>
         </w:rPr>
-        <w:t xml:space="preserve">Global Strategy Journal, 2</w:t>
-      </w:r>
-      <w:r>
-        <w:t xml:space="preserve">(2), 108–121. https://doi.org/10.1002/gsj.1028</w:t>
-      </w:r>
-    </w:p>
-    <w:p>
-      <w:pPr>
-        <w:pStyle w:val="BodyText"/>
-      </w:pPr>
-      <w:r>
-        <w:t xml:space="preserve">Lind, J. T., &amp; Mehlum, H. (2010). With or without U? The appropriate test for a U-shaped relationship.</w:t>
+        <w:t xml:space="preserve">Journal of International Business Studies, 8</w:t>
+      </w:r>
+      <w:r>
+        <w:t xml:space="preserve">(1), 23–32. https://doi.org/10.1057/palgrave.jibs.8490676</w:t>
+      </w:r>
+    </w:p>
+    <w:p>
+      <w:pPr>
+        <w:pStyle w:val="BodyText"/>
+      </w:pPr>
+      <w:r>
+        <w:t xml:space="preserve">Johanson, J., &amp; Vahlne, J.-E. (2009). The Uppsala internationalization process model revisited: From liability of foreignness to liability of outsidership.</w:t>
       </w:r>
       <w:r>
         <w:t xml:space="preserve"> </w:t>
@@ -1665,18 +1708,18 @@
           <w:iCs/>
           <w:i/>
         </w:rPr>
-        <w:t xml:space="preserve">Oxford Bulletin of Economics and Statistics, 72</w:t>
-      </w:r>
-      <w:r>
-        <w:t xml:space="preserve">(1), 109–118. https://doi.org/10.1111/j.1468-0084.2009.00569.x</w:t>
-      </w:r>
-    </w:p>
-    <w:p>
-      <w:pPr>
-        <w:pStyle w:val="BodyText"/>
-      </w:pPr>
-      <w:r>
-        <w:t xml:space="preserve">Long, J. S., &amp; Ervin, L. H. (2000). Using heteroscedasticity consistent standard errors in the linear regression model.</w:t>
+        <w:t xml:space="preserve">Journal of International Business Studies, 40</w:t>
+      </w:r>
+      <w:r>
+        <w:t xml:space="preserve">(9), 1411–1431. https://doi.org/10.1057/jibs.2009.24</w:t>
+      </w:r>
+    </w:p>
+    <w:p>
+      <w:pPr>
+        <w:pStyle w:val="BodyText"/>
+      </w:pPr>
+      <w:r>
+        <w:t xml:space="preserve">Kirca, A. H., Roth, K., Hult, G. T. M., &amp; Cavusgil, S. T. (2012). The role of context in the multinationality–performance relationship: A meta-analytic review.</w:t>
       </w:r>
       <w:r>
         <w:t xml:space="preserve"> </w:t>
@@ -1686,18 +1729,18 @@
           <w:iCs/>
           <w:i/>
         </w:rPr>
-        <w:t xml:space="preserve">The American Statistician, 54</w:t>
-      </w:r>
-      <w:r>
-        <w:t xml:space="preserve">(3), 217–224. https://doi.org/10.1080/00031305.2000.10474549</w:t>
-      </w:r>
-    </w:p>
-    <w:p>
-      <w:pPr>
-        <w:pStyle w:val="BodyText"/>
-      </w:pPr>
-      <w:r>
-        <w:t xml:space="preserve">Lu, J. W., &amp; Beamish, P. W. (2004). International diversification and firm performance: The S-curve hypothesis.</w:t>
+        <w:t xml:space="preserve">Global Strategy Journal, 2</w:t>
+      </w:r>
+      <w:r>
+        <w:t xml:space="preserve">(2), 108–121. https://doi.org/10.1002/gsj.1028</w:t>
+      </w:r>
+    </w:p>
+    <w:p>
+      <w:pPr>
+        <w:pStyle w:val="BodyText"/>
+      </w:pPr>
+      <w:r>
+        <w:t xml:space="preserve">Lind, J. T., &amp; Mehlum, H. (2010). With or without U? The appropriate test for a U-shaped relationship.</w:t>
       </w:r>
       <w:r>
         <w:t xml:space="preserve"> </w:t>
@@ -1707,18 +1750,18 @@
           <w:iCs/>
           <w:i/>
         </w:rPr>
-        <w:t xml:space="preserve">Academy of Management Journal, 47</w:t>
-      </w:r>
-      <w:r>
-        <w:t xml:space="preserve">(4), 598–609. https://doi.org/10.2307/20159604</w:t>
-      </w:r>
-    </w:p>
-    <w:p>
-      <w:pPr>
-        <w:pStyle w:val="BodyText"/>
-      </w:pPr>
-      <w:r>
-        <w:t xml:space="preserve">Marano, V., Tashman, P., &amp; Kostova, T. (2016). Escaping the iron cage: Liabilities of origin and CSR reporting of emerging market multinational enterprises.</w:t>
+        <w:t xml:space="preserve">Oxford Bulletin of Economics and Statistics, 72</w:t>
+      </w:r>
+      <w:r>
+        <w:t xml:space="preserve">(1), 109–118. https://doi.org/10.1111/j.1468-0084.2009.00569.x</w:t>
+      </w:r>
+    </w:p>
+    <w:p>
+      <w:pPr>
+        <w:pStyle w:val="BodyText"/>
+      </w:pPr>
+      <w:r>
+        <w:t xml:space="preserve">Long, J. S., &amp; Ervin, L. H. (2000). Using heteroscedasticity consistent standard errors in the linear regression model.</w:t>
       </w:r>
       <w:r>
         <w:t xml:space="preserve"> </w:t>
@@ -1728,18 +1771,18 @@
           <w:iCs/>
           <w:i/>
         </w:rPr>
-        <w:t xml:space="preserve">Journal of International Business Studies, 47</w:t>
-      </w:r>
-      <w:r>
-        <w:t xml:space="preserve">(3), 386–408. https://doi.org/10.1057/jibs.2016.7</w:t>
-      </w:r>
-    </w:p>
-    <w:p>
-      <w:pPr>
-        <w:pStyle w:val="BodyText"/>
-      </w:pPr>
-      <w:r>
-        <w:t xml:space="preserve">Mondal, A., Gupta, S., &amp; Ray, S. (2022). Family ownership, governance, and internationalization: Evidence from India.</w:t>
+        <w:t xml:space="preserve">The American Statistician, 54</w:t>
+      </w:r>
+      <w:r>
+        <w:t xml:space="preserve">(3), 217–224. https://doi.org/10.1080/00031305.2000.10474549</w:t>
+      </w:r>
+    </w:p>
+    <w:p>
+      <w:pPr>
+        <w:pStyle w:val="BodyText"/>
+      </w:pPr>
+      <w:r>
+        <w:t xml:space="preserve">Lu, J. W., &amp; Beamish, P. W. (2004). International diversification and firm performance: The S-curve hypothesis.</w:t>
       </w:r>
       <w:r>
         <w:t xml:space="preserve"> </w:t>
@@ -1749,18 +1792,18 @@
           <w:iCs/>
           <w:i/>
         </w:rPr>
-        <w:t xml:space="preserve">Journal of Business Research, 138</w:t>
-      </w:r>
-      <w:r>
-        <w:t xml:space="preserve">, 423–434.</w:t>
-      </w:r>
-    </w:p>
-    <w:p>
-      <w:pPr>
-        <w:pStyle w:val="BodyText"/>
-      </w:pPr>
-      <w:r>
-        <w:t xml:space="preserve">North, D. C. (1990).</w:t>
+        <w:t xml:space="preserve">Academy of Management Journal, 47</w:t>
+      </w:r>
+      <w:r>
+        <w:t xml:space="preserve">(4), 598–609. https://doi.org/10.2307/20159604</w:t>
+      </w:r>
+    </w:p>
+    <w:p>
+      <w:pPr>
+        <w:pStyle w:val="BodyText"/>
+      </w:pPr>
+      <w:r>
+        <w:t xml:space="preserve">Marano, V., Tashman, P., &amp; Kostova, T. (2016). Escaping the iron cage: Liabilities of origin and CSR reporting of emerging market multinational enterprises.</w:t>
       </w:r>
       <w:r>
         <w:t xml:space="preserve"> </w:t>
@@ -1770,18 +1813,18 @@
           <w:iCs/>
           <w:i/>
         </w:rPr>
-        <w:t xml:space="preserve">Institutions, institutional change and economic performance</w:t>
-      </w:r>
-      <w:r>
-        <w:t xml:space="preserve">. Cambridge University Press.</w:t>
-      </w:r>
-    </w:p>
-    <w:p>
-      <w:pPr>
-        <w:pStyle w:val="BodyText"/>
-      </w:pPr>
-      <w:r>
-        <w:t xml:space="preserve">Pangarkar, N. (2008). Internationalization and performance of small- and medium-sized enterprises.</w:t>
+        <w:t xml:space="preserve">Journal of International Business Studies, 47</w:t>
+      </w:r>
+      <w:r>
+        <w:t xml:space="preserve">(3), 386–408. https://doi.org/10.1057/jibs.2016.7</w:t>
+      </w:r>
+    </w:p>
+    <w:p>
+      <w:pPr>
+        <w:pStyle w:val="BodyText"/>
+      </w:pPr>
+      <w:r>
+        <w:t xml:space="preserve">Mondal, A., Gupta, S., &amp; Ray, S. (2022). Family ownership, governance, and internationalization: Evidence from India.</w:t>
       </w:r>
       <w:r>
         <w:t xml:space="preserve"> </w:t>
@@ -1791,18 +1834,18 @@
           <w:iCs/>
           <w:i/>
         </w:rPr>
-        <w:t xml:space="preserve">Journal of World Business, 43</w:t>
-      </w:r>
-      <w:r>
-        <w:t xml:space="preserve">(4), 475–485. https://doi.org/10.1016/j.jwb.2007.11.009</w:t>
-      </w:r>
-    </w:p>
-    <w:p>
-      <w:pPr>
-        <w:pStyle w:val="BodyText"/>
-      </w:pPr>
-      <w:r>
-        <w:t xml:space="preserve">Richard, O. C., Kirby, S. L., &amp; Chadwick, K. (2019). The impact of racial and gender diversity in management on firm performance: An assessment of different conceptual and measurement approaches.</w:t>
+        <w:t xml:space="preserve">Journal of Business Research, 138</w:t>
+      </w:r>
+      <w:r>
+        <w:t xml:space="preserve">, 423–434.</w:t>
+      </w:r>
+    </w:p>
+    <w:p>
+      <w:pPr>
+        <w:pStyle w:val="BodyText"/>
+      </w:pPr>
+      <w:r>
+        <w:t xml:space="preserve">North, D. C. (1990).</w:t>
       </w:r>
       <w:r>
         <w:t xml:space="preserve"> </w:t>
@@ -1812,18 +1855,18 @@
           <w:iCs/>
           <w:i/>
         </w:rPr>
-        <w:t xml:space="preserve">Journal of Applied Social Psychology, 39</w:t>
-      </w:r>
-      <w:r>
-        <w:t xml:space="preserve">(7), 1571–1599.</w:t>
-      </w:r>
-    </w:p>
-    <w:p>
-      <w:pPr>
-        <w:pStyle w:val="BodyText"/>
-      </w:pPr>
-      <w:r>
-        <w:t xml:space="preserve">Scott, W. R. (2008).</w:t>
+        <w:t xml:space="preserve">Institutions, institutional change and economic performance</w:t>
+      </w:r>
+      <w:r>
+        <w:t xml:space="preserve">. Cambridge University Press.</w:t>
+      </w:r>
+    </w:p>
+    <w:p>
+      <w:pPr>
+        <w:pStyle w:val="BodyText"/>
+      </w:pPr>
+      <w:r>
+        <w:t xml:space="preserve">Pangarkar, N. (2008). Internationalization and performance of small- and medium-sized enterprises.</w:t>
       </w:r>
       <w:r>
         <w:t xml:space="preserve"> </w:t>
@@ -1833,21 +1876,18 @@
           <w:iCs/>
           <w:i/>
         </w:rPr>
-        <w:t xml:space="preserve">Institutions and organizations: Ideas and interests</w:t>
-      </w:r>
-      <w:r>
-        <w:t xml:space="preserve"> </w:t>
-      </w:r>
-      <w:r>
-        <w:t xml:space="preserve">(3rd ed.). Sage.</w:t>
-      </w:r>
-    </w:p>
-    <w:p>
-      <w:pPr>
-        <w:pStyle w:val="BodyText"/>
-      </w:pPr>
-      <w:r>
-        <w:t xml:space="preserve">UNCTAD. (2023).</w:t>
+        <w:t xml:space="preserve">Journal of World Business, 43</w:t>
+      </w:r>
+      <w:r>
+        <w:t xml:space="preserve">(4), 475–485. https://doi.org/10.1016/j.jwb.2007.11.009</w:t>
+      </w:r>
+    </w:p>
+    <w:p>
+      <w:pPr>
+        <w:pStyle w:val="BodyText"/>
+      </w:pPr>
+      <w:r>
+        <w:t xml:space="preserve">Richard, O. C., Kirby, S. L., &amp; Chadwick, K. (2019). The impact of racial and gender diversity in management on firm performance: An assessment of different conceptual and measurement approaches.</w:t>
       </w:r>
       <w:r>
         <w:t xml:space="preserve"> </w:t>
@@ -1857,18 +1897,18 @@
           <w:iCs/>
           <w:i/>
         </w:rPr>
-        <w:t xml:space="preserve">World investment report 2023: Investing in sustainable energy for all</w:t>
-      </w:r>
-      <w:r>
-        <w:t xml:space="preserve">. United Nations.</w:t>
-      </w:r>
-    </w:p>
-    <w:p>
-      <w:pPr>
-        <w:pStyle w:val="BodyText"/>
-      </w:pPr>
-      <w:r>
-        <w:t xml:space="preserve">Verhoef, P. C., Broekhuizen, T., Bart, Y., Bhattacharya, A., Dong, J. Q., Fabian, N., &amp; Haenlein, M. (2021). Digital transformation: A multidisciplinary reflection and research agenda.</w:t>
+        <w:t xml:space="preserve">Journal of Applied Social Psychology, 39</w:t>
+      </w:r>
+      <w:r>
+        <w:t xml:space="preserve">(7), 1571–1599.</w:t>
+      </w:r>
+    </w:p>
+    <w:p>
+      <w:pPr>
+        <w:pStyle w:val="BodyText"/>
+      </w:pPr>
+      <w:r>
+        <w:t xml:space="preserve">Scott, W. R. (2008).</w:t>
       </w:r>
       <w:r>
         <w:t xml:space="preserve"> </w:t>
@@ -1878,18 +1918,21 @@
           <w:iCs/>
           <w:i/>
         </w:rPr>
-        <w:t xml:space="preserve">Journal of Business Research, 122</w:t>
-      </w:r>
-      <w:r>
-        <w:t xml:space="preserve">, 889–901. https://doi.org/10.1016/j.jbusres.2019.09.022</w:t>
-      </w:r>
-    </w:p>
-    <w:p>
-      <w:pPr>
-        <w:pStyle w:val="BodyText"/>
-      </w:pPr>
-      <w:r>
-        <w:t xml:space="preserve">Wernerfelt, B. (1984). A resource-based view of the firm.</w:t>
+        <w:t xml:space="preserve">Institutions and organizations: Ideas and interests</w:t>
+      </w:r>
+      <w:r>
+        <w:t xml:space="preserve"> </w:t>
+      </w:r>
+      <w:r>
+        <w:t xml:space="preserve">(3rd ed.). Sage.</w:t>
+      </w:r>
+    </w:p>
+    <w:p>
+      <w:pPr>
+        <w:pStyle w:val="BodyText"/>
+      </w:pPr>
+      <w:r>
+        <w:t xml:space="preserve">UNCTAD. (2023).</w:t>
       </w:r>
       <w:r>
         <w:t xml:space="preserve"> </w:t>
@@ -1899,18 +1942,18 @@
           <w:iCs/>
           <w:i/>
         </w:rPr>
-        <w:t xml:space="preserve">Strategic Management Journal, 5</w:t>
-      </w:r>
-      <w:r>
-        <w:t xml:space="preserve">(2), 171–180. https://doi.org/10.1002/smj.4250050207</w:t>
-      </w:r>
-    </w:p>
-    <w:p>
-      <w:pPr>
-        <w:pStyle w:val="BodyText"/>
-      </w:pPr>
-      <w:r>
-        <w:t xml:space="preserve">World Bank. (2025).</w:t>
+        <w:t xml:space="preserve">World investment report 2023: Investing in sustainable energy for all</w:t>
+      </w:r>
+      <w:r>
+        <w:t xml:space="preserve">. United Nations.</w:t>
+      </w:r>
+    </w:p>
+    <w:p>
+      <w:pPr>
+        <w:pStyle w:val="BodyText"/>
+      </w:pPr>
+      <w:r>
+        <w:t xml:space="preserve">Verhoef, P. C., Broekhuizen, T., Bart, Y., Bhattacharya, A., Dong, J. Q., Fabian, N., &amp; Haenlein, M. (2021). Digital transformation: A multidisciplinary reflection and research agenda.</w:t>
       </w:r>
       <w:r>
         <w:t xml:space="preserve"> </w:t>
@@ -1920,10 +1963,187 @@
           <w:iCs/>
           <w:i/>
         </w:rPr>
+        <w:t xml:space="preserve">Journal of Business Research, 122</w:t>
+      </w:r>
+      <w:r>
+        <w:t xml:space="preserve">, 889–901. https://doi.org/10.1016/j.jbusres.2019.09.022</w:t>
+      </w:r>
+    </w:p>
+    <w:p>
+      <w:pPr>
+        <w:pStyle w:val="BodyText"/>
+      </w:pPr>
+      <w:r>
+        <w:t xml:space="preserve">Wernerfelt, B. (1984). A resource-based view of the firm.</w:t>
+      </w:r>
+      <w:r>
+        <w:t xml:space="preserve"> </w:t>
+      </w:r>
+      <w:r>
+        <w:rPr>
+          <w:iCs/>
+          <w:i/>
+        </w:rPr>
+        <w:t xml:space="preserve">Strategic Management Journal, 5</w:t>
+      </w:r>
+      <w:r>
+        <w:t xml:space="preserve">(2), 171–180. https://doi.org/10.1002/smj.4250050207</w:t>
+      </w:r>
+    </w:p>
+    <w:p>
+      <w:pPr>
+        <w:pStyle w:val="BodyText"/>
+      </w:pPr>
+      <w:r>
+        <w:t xml:space="preserve">World Bank. (2025).</w:t>
+      </w:r>
+      <w:r>
+        <w:t xml:space="preserve"> </w:t>
+      </w:r>
+      <w:r>
+        <w:rPr>
+          <w:iCs/>
+          <w:i/>
+        </w:rPr>
         <w:t xml:space="preserve">Enterprise surveys</w:t>
       </w:r>
       <w:r>
         <w:t xml:space="preserve">. https://www.enterprisesurveys.org</w:t>
+      </w:r>
+    </w:p>
+    <w:p>
+      <w:pPr>
+        <w:pStyle w:val="BodyText"/>
+      </w:pPr>
+      <w:r>
+        <w:t xml:space="preserve">World Bank. (2025a, March).</w:t>
+      </w:r>
+      <w:r>
+        <w:t xml:space="preserve"> </w:t>
+      </w:r>
+      <w:r>
+        <w:rPr>
+          <w:iCs/>
+          <w:i/>
+        </w:rPr>
+        <w:t xml:space="preserve">Digital public infrastructure and development: A World Bank Group approach</w:t>
+      </w:r>
+      <w:r>
+        <w:t xml:space="preserve">. World Bank Group.</w:t>
+      </w:r>
+    </w:p>
+    <w:p>
+      <w:pPr>
+        <w:pStyle w:val="BodyText"/>
+      </w:pPr>
+      <w:r>
+        <w:t xml:space="preserve">World Bank. (2025b, September).</w:t>
+      </w:r>
+      <w:r>
+        <w:t xml:space="preserve"> </w:t>
+      </w:r>
+      <w:r>
+        <w:rPr>
+          <w:iCs/>
+          <w:i/>
+        </w:rPr>
+        <w:t xml:space="preserve">Viet Nam economic update: Nurturing high-tech talents</w:t>
+      </w:r>
+      <w:r>
+        <w:t xml:space="preserve"> </w:t>
+      </w:r>
+      <w:r>
+        <w:t xml:space="preserve">(Taking Stock, September 2025). World Bank Group.</w:t>
+      </w:r>
+    </w:p>
+    <w:p>
+      <w:pPr>
+        <w:pStyle w:val="BodyText"/>
+      </w:pPr>
+      <w:r>
+        <w:t xml:space="preserve">World Bank. (2025c, October).</w:t>
+      </w:r>
+      <w:r>
+        <w:t xml:space="preserve"> </w:t>
+      </w:r>
+      <w:r>
+        <w:rPr>
+          <w:iCs/>
+          <w:i/>
+        </w:rPr>
+        <w:t xml:space="preserve">Viet Nam economy snapshot: Finance, competitiveness &amp; innovation</w:t>
+      </w:r>
+      <w:r>
+        <w:t xml:space="preserve"> </w:t>
+      </w:r>
+      <w:r>
+        <w:t xml:space="preserve">(Prosperity Data360). World Bank Group. https://www.worldbank.org/ext/en/country/vietnam</w:t>
+      </w:r>
+    </w:p>
+    <w:p>
+      <w:pPr>
+        <w:pStyle w:val="BodyText"/>
+      </w:pPr>
+      <w:r>
+        <w:t xml:space="preserve">World Bank. (2026a).</w:t>
+      </w:r>
+      <w:r>
+        <w:t xml:space="preserve"> </w:t>
+      </w:r>
+      <w:r>
+        <w:rPr>
+          <w:iCs/>
+          <w:i/>
+        </w:rPr>
+        <w:t xml:space="preserve">ID4D &amp; G2Px annual report 2023: Putting people at the center of digital public infrastructure</w:t>
+      </w:r>
+      <w:r>
+        <w:t xml:space="preserve">. World Bank Group.</w:t>
+      </w:r>
+    </w:p>
+    <w:p>
+      <w:pPr>
+        <w:pStyle w:val="BodyText"/>
+      </w:pPr>
+      <w:r>
+        <w:t xml:space="preserve">World Bank. (2026b, April).</w:t>
+      </w:r>
+      <w:r>
+        <w:t xml:space="preserve"> </w:t>
+      </w:r>
+      <w:r>
+        <w:rPr>
+          <w:iCs/>
+          <w:i/>
+        </w:rPr>
+        <w:t xml:space="preserve">Viet Nam macro monitoring: April 2026</w:t>
+      </w:r>
+      <w:r>
+        <w:t xml:space="preserve">. World Bank Group, Fiscal Policy and Growth Viet Nam Team.</w:t>
+      </w:r>
+    </w:p>
+    <w:p>
+      <w:pPr>
+        <w:pStyle w:val="BodyText"/>
+      </w:pPr>
+      <w:r>
+        <w:t xml:space="preserve">World Bank. (2024, December).</w:t>
+      </w:r>
+      <w:r>
+        <w:t xml:space="preserve"> </w:t>
+      </w:r>
+      <w:r>
+        <w:rPr>
+          <w:iCs/>
+          <w:i/>
+        </w:rPr>
+        <w:t xml:space="preserve">Viet Nam economy snapshot: Justice</w:t>
+      </w:r>
+      <w:r>
+        <w:t xml:space="preserve"> </w:t>
+      </w:r>
+      <w:r>
+        <w:t xml:space="preserve">(Prosperity Data360). World Bank Group. https://www.worldbank.org/ext/en/country/vietnam</w:t>
       </w:r>
     </w:p>
     <w:p>

</xml_diff>

<commit_message>
style(p7): de-AI prose (remove em-dashes) + re-blind IBR copy + rebuild docx
Applied phd-academic-writing-humanizer to P7: all 48 prose em-dashes
replaced with context-correct punctuation (commas/colons/semicolons/
parentheses); numbers, citations, tables, and meaning unchanged. Remaining
— are only in protected regions (reconciliation banner, Johanson&Vahlne
title, table cells/notes). Re-blinded the IBR submission copy from the
de-AI'd working copy and rebuilt both docx.
</commit_message>
<xml_diff>
--- a/p7/p7_capstone_en_clean.docx
+++ b/p7/p7_capstone_en_clean.docx
@@ -263,7 +263,7 @@
         <w:pStyle w:val="FirstParagraph"/>
       </w:pPr>
       <w:r>
-        <w:t xml:space="preserve">We examine whether the internationalization–performance (I–P) relationship holds across a large and institutionally diverse set of Asian and Pacific economies and identify the conditions under which firms convert export intensity into productive performance. Using microdata from 88,869 firms across 50 economies and 103 country-year waves of the World Bank Enterprise Survey (2003–2025; including Japan's inaugural 2025 wave), spanning all six Institutional Context Regime Variation (ICRV) groups, we estimate a hierarchical sequence of models on currency-neutral labour productivity (standardised within economy-year) with two-way (economy and year) fixed effects throughout and standard errors clustered by economy. We find robust support for an inverted-U I–P relationship: the quadratic baseline (M2, N=81,022) yields a turning point of 51.5% of export sales, tightening to 43.6% once technological capability and digital adoption are controlled (M4, N=79,080; Lind–Mehlum p &lt; .001 throughout). Technological capability (TCI, +0.108) and digital adoption (DAI, +0.219) both raise the performance level, but neither significantly reshapes the pooled curve — both are level-shifters, not curve-reshapers. The curve structure is instead governed by institutional regime: estimating the turning point within each ICRV group reveals a three-zone pattern — a sharp inverted-U in the lower-middle transition regime (TP ≈ 43%), a near-linear relationship in the strongest-institution regime (turning point beyond the observable range, ≈ 80%), and dissolution of the inverted-U in the weakest regimes (Emerging ≈ 37%; the Pacific SIDS group shows no inverted-U). Female top management carries a negative coefficient (−0.104, p &lt; .001). These findings offer a parsimonious resolution to Asian I–P heterogeneity: the relationship is inverted-U in form, but it is institutional regime — not capability per se — that determines whether the inverted-U is sharp, straightened, or absent.</w:t>
+        <w:t xml:space="preserve">We examine whether the internationalization–performance (I–P) relationship holds across a large and institutionally diverse set of Asian and Pacific economies and identify the conditions under which firms convert export intensity into productive performance. Using microdata from 88,869 firms across 50 economies and 103 country-year waves of the World Bank Enterprise Survey (2003–2025; including Japan's inaugural 2025 wave), spanning all six Institutional Context Regime Variation (ICRV) groups, we estimate a hierarchical sequence of models on currency-neutral labour productivity (standardised within economy-year) with two-way (economy and year) fixed effects throughout and standard errors clustered by economy. We find robust support for an inverted-U I–P relationship: the quadratic baseline (M2, N=81,022) yields a turning point of 51.5% of export sales, tightening to 43.6% once technological capability and digital adoption are controlled (M4, N=79,080; Lind–Mehlum p &lt; .001 throughout). Technological capability (TCI, +0.108) and digital adoption (DAI, +0.219) both raise the performance level, but neither significantly reshapes the pooled curve; both are level-shifters, not curve-reshapers. The curve structure is instead governed by institutional regime: estimating the turning point within each ICRV group reveals a three-zone pattern: a sharp inverted-U in the lower-middle transition regime (TP ≈ 43%), a near-linear relationship in the strongest-institution regime (turning point beyond the observable range, ≈ 80%), and dissolution of the inverted-U in the weakest regimes (Emerging ≈ 37%; the Pacific SIDS group shows no inverted-U). Female top management carries a negative coefficient (−0.104, p &lt; .001). These findings offer a parsimonious resolution to Asian I–P heterogeneity: the relationship is inverted-U in form, but it is institutional regime, not capability per se, that determines whether the inverted-U is sharp, straightened, or absent.</w:t>
       </w:r>
     </w:p>
     <w:p>
@@ -306,7 +306,7 @@
         <w:pStyle w:val="FirstParagraph"/>
       </w:pPr>
       <w:r>
-        <w:t xml:space="preserve">A central question in international business research concerns whether and how export internationalization translates into firm performance (Lu &amp; Beamish, 2004; Johanson &amp; Vahlne, 2009). Meta-analyses document a mean correlation of approximately r = .07 across several thousand studies (Bausch &amp; Krist, 2007; Kirca et al., 2012; Marano et al., 2016), yet the variance across studies vastly exceeds what sampling error can explain. In Asia — a region that accounts for over half of global manufacturing exports (UNCTAD, 2023) — the evidence is especially fragmented: prior studies report positive relationships (Pangarkar, 2008; Korea), inverted-U curves (Chiao et al., 2006; Taiwan), or null and negative effects (Mondal et al., 2022; India). The standard explanation invokes context as a moderator (Marano et al., 2016; Kirca et al., 2012), but empirical tests simultaneously across institutionally diverse Asian economies remain rare.</w:t>
+        <w:t xml:space="preserve">A central question in international business research concerns whether and how export internationalization translates into firm performance (Lu &amp; Beamish, 2004; Johanson &amp; Vahlne, 2009). Meta-analyses document a mean correlation of approximately r = .07 across several thousand studies (Bausch &amp; Krist, 2007; Kirca et al., 2012; Marano et al., 2016), yet the variance across studies vastly exceeds what sampling error can explain. In Asia (a region that accounts for over half of global manufacturing exports; UNCTAD, 2023), the evidence is especially fragmented: prior studies report positive relationships (Pangarkar, 2008; Korea), inverted-U curves (Chiao et al., 2006; Taiwan), or null and negative effects (Mondal et al., 2022; India). The standard explanation invokes context as a moderator (Marano et al., 2016; Kirca et al., 2012), but empirical tests simultaneously across institutionally diverse Asian economies remain rare.</w:t>
       </w:r>
     </w:p>
     <w:p>
@@ -314,7 +314,7 @@
         <w:pStyle w:val="BodyText"/>
       </w:pPr>
       <w:r>
-        <w:t xml:space="preserve">This paper addresses that gap. We pool 88,869 firm-observations from 50 Asian and Pacific economies spanning 2003–2025 (including Japan's inaugural 2025 wave), harmonised from the World Bank Enterprise Survey (WBES). Our sample spans all six ICRV regime groups — from advanced innovation-driven economies (Japan, Singapore, Korea, Taiwan, HongKong, Israel) to Pacific Small Island Developing States (Vanuatu, Solomon Islands, Fiji, Tonga, Samoa, Kiribati, Papua New Guinea) and Gulf advanced-resource economies (Bahrain, Kuwait, Qatar, Brunei, Saudi Arabia, Oman) — classified through the Institutional Context Regime Variation (ICRV) framework that anchors the broader dissertation programme of which this study is part.</w:t>
+        <w:t xml:space="preserve">This paper addresses that gap. We pool 88,869 firm-observations from 50 Asian and Pacific economies spanning 2003–2025 (including Japan's inaugural 2025 wave), harmonised from the World Bank Enterprise Survey (WBES). Our sample spans all six ICRV regime groups, from advanced innovation-driven economies (Japan, Singapore, Korea, Taiwan, HongKong, Israel) to Pacific Small Island Developing States (Vanuatu, Solomon Islands, Fiji, Tonga, Samoa, Kiribati, Papua New Guinea) and Gulf advanced-resource economies (Bahrain, Kuwait, Qatar, Brunei, Saudi Arabia, Oman), all classified through the Institutional Context Regime Variation (ICRV) framework that anchors the broader dissertation programme of which this study is part.</w:t>
       </w:r>
     </w:p>
     <w:p>
@@ -338,7 +338,7 @@
         <w:t xml:space="preserve"> </w:t>
       </w:r>
       <w:r>
-        <w:t xml:space="preserve">but that neither significantly reshapes the pooled I–P curve — a finding that disciplines capability-centred accounts of internationalization performance. Third, and most consequentially, we show that the</w:t>
+        <w:t xml:space="preserve">but that neither significantly reshapes the pooled I–P curve, a finding that disciplines capability-centred accounts of internationalization performance. Third, and most consequentially, we show that the</w:t>
       </w:r>
       <w:r>
         <w:t xml:space="preserve"> </w:t>
@@ -354,7 +354,7 @@
         <w:t xml:space="preserve"> </w:t>
       </w:r>
       <w:r>
-        <w:t xml:space="preserve">of the curve is governed by institutional regime, and not as a smooth gradient but as a three-zone structure: a sharp inverted-U in transition economies (turning point ≈ 43%), near-linearity in the strongest-institution economies (turning point beyond the observable range), and dissolution — reversing into a Forced Internationalization Penalty among the Pacific SIDS — in the weakest regimes.</w:t>
+        <w:t xml:space="preserve">of the curve is governed by institutional regime, and not as a smooth gradient but as a three-zone structure: a sharp inverted-U in transition economies (turning point ≈ 43%), near-linearity in the strongest-institution economies (turning point beyond the observable range), and dissolution (reversing into a Forced Internationalization Penalty among the Pacific SIDS) in the weakest regimes.</w:t>
       </w:r>
     </w:p>
     <w:p>
@@ -396,7 +396,7 @@
         <w:pStyle w:val="FirstParagraph"/>
       </w:pPr>
       <w:r>
-        <w:t xml:space="preserve">We draw on four theoretical traditions. The Uppsala model (Johanson &amp; Vahlne, 1977, 2009) describes internationalization as a sequential process in which firms accumulate experiential knowledge, progressively reducing psychic distance and coordination costs. The Resource-Based View (Barney, 1991; Wernerfelt, 1984) positions firm-level capabilities — technological, digital, and managerial — as the mediating mechanism linking export exposure to performance outcomes. Institutional Theory (North, 1990; Scott, 2008) directs attention to how country-level formal and informal institutions shape the cost structure of cross-border transactions. Upper Echelons Theory (Hambrick &amp; Mason, 1984; Hambrick, 2007) emphasises that top management team attributes moderate how firms respond to strategic opportunities and constraints.</w:t>
+        <w:t xml:space="preserve">We draw on four theoretical traditions. The Uppsala model (Johanson &amp; Vahlne, 1977, 2009) describes internationalization as a sequential process in which firms accumulate experiential knowledge, progressively reducing psychic distance and coordination costs. The Resource-Based View (Barney, 1991; Wernerfelt, 1984) positions firm-level capabilities (technological, digital, and managerial) as the mediating mechanism linking export exposure to performance outcomes. Institutional Theory (North, 1990; Scott, 2008) directs attention to how country-level formal and informal institutions shape the cost structure of cross-border transactions. Upper Echelons Theory (Hambrick &amp; Mason, 1984; Hambrick, 2007) emphasises that top management team attributes moderate how firms respond to strategic opportunities and constraints.</w:t>
       </w:r>
     </w:p>
     <w:bookmarkEnd w:id="22"/>
@@ -414,7 +414,7 @@
         <w:pStyle w:val="FirstParagraph"/>
       </w:pPr>
       <w:r>
-        <w:t xml:space="preserve">Contractor et al. (2003) formalised the three-stage S-curve hypothesis: early internationalization carries fixed entry costs that depress performance; intermediate internationalization yields learning and scale economies; high internationalization may again impose coordination and agency costs. Empirically, however, the data more consistently support the inverted-U — a special case in which the third stage does not emerge at the export intensities typically observed in developing-economy WBES data (Gomes &amp; Ramaswamy, 1999; Lu &amp; Beamish, 2004).</w:t>
+        <w:t xml:space="preserve">Contractor et al. (2003) formalised the three-stage S-curve hypothesis: early internationalization carries fixed entry costs that depress performance; intermediate internationalization yields learning and scale economies; high internationalization may again impose coordination and agency costs. Empirically, however, the data more consistently support the inverted-U: a special case in which the third stage does not emerge at the export intensities typically observed in developing-economy WBES data (Gomes &amp; Ramaswamy, 1999; Lu &amp; Beamish, 2004).</w:t>
       </w:r>
     </w:p>
     <w:p>
@@ -458,7 +458,7 @@
         <w:pStyle w:val="FirstParagraph"/>
       </w:pPr>
       <w:r>
-        <w:t xml:space="preserve">Technological capability — operationalised as a composite of quality certification, foreign-technology adoption, process innovation, and R&amp;D — raises absorptive capacity (Cohen &amp; Levinthal, 1990), enabling firms to extract greater performance value per unit of export exposure. Critically, we expect TCI to operate as a</w:t>
+        <w:t xml:space="preserve">Technological capability, operationalised as a composite of quality certification, foreign-technology adoption, process innovation, and R&amp;D, raises absorptive capacity (Cohen &amp; Levinthal, 1990), enabling firms to extract greater performance value per unit of export exposure. Critically, we expect TCI to operate as a</w:t>
       </w:r>
       <w:r>
         <w:t xml:space="preserve"> </w:t>
@@ -515,7 +515,7 @@
         <w:pStyle w:val="FirstParagraph"/>
       </w:pPr>
       <w:r>
-        <w:t xml:space="preserve">Digital adoption — measured through website presence and electronic-payment share — has been associated with reduced communication and transaction costs (Verhoef et al., 2021). In the CDCM (Context-Contingent Digital Capability Model) developed in the dissertation, DAI's effect depends on the interaction of regime quality, FSTS level, and digital market saturation (Đỗ &amp; Phan, 2024). Specifically, in institutionally advanced economies where digital infrastructure is mature, DAI provides universal performance lifts (as in P4 Singapore: β(DAI) positive and significant). In emerging-economy contexts with substantial selection into digital adoption (P3 Vietnam: IV-estimated β(DAI) ≈ 0, consistent with selection bias in OLS), DAI's curve-shaping role is attenuated. Across the pooled multi-economy sample, we expect DAI to raise performance levels broadly across the sample (level effect). In a fully specified model that also accounts for managerial quality — which correlates with digital adoption — the residual DAI variation may reveal a capability-complementarity curve effect: digitally equipped firms at low FSTS face sunk adoption costs that compress near-term productivity, while digital infrastructure supports coordination efficiency at high FSTS where cross-border management demands are greatest.</w:t>
+        <w:t xml:space="preserve">Digital adoption, measured through website presence and electronic-payment share, has been associated with reduced communication and transaction costs (Verhoef et al., 2021). In the CDCM (Context-Contingent Digital Capability Model) developed in the dissertation, DAI's effect depends on the interaction of regime quality, FSTS level, and digital market saturation (Đỗ &amp; Phan, 2024). Specifically, in institutionally advanced economies where digital infrastructure is mature, DAI provides universal performance lifts (as in P4 Singapore: β(DAI) positive and significant). In emerging-economy contexts with substantial selection into digital adoption (P3 Vietnam: IV-estimated β(DAI) ≈ 0, consistent with selection bias in OLS), DAI's curve-shaping role is attenuated. Across the pooled multi-economy sample, we expect DAI to raise performance levels broadly across the sample (level effect). In a fully specified model that also accounts for managerial quality (which correlates with digital adoption), the residual DAI variation may reveal a capability-complementarity curve effect: digitally equipped firms at low FSTS face sunk adoption costs that compress near-term productivity, while digital infrastructure supports coordination efficiency at high FSTS where cross-border management demands are greatest.</w:t>
       </w:r>
     </w:p>
     <w:p>
@@ -551,7 +551,7 @@
         <w:pStyle w:val="FirstParagraph"/>
       </w:pPr>
       <w:r>
-        <w:t xml:space="preserve">Upper Echelons Theory predicts that top manager experience and gender composition affect strategic cognition and decision-making (Hambrick &amp; Mason, 1984). Manager experience reduces coordination errors in cross-border operations; female top management is associated with stakeholder orientation, relationship capital, and risk management — all relevant in institutionally heterogeneous export markets (Richard et al., 2019). We expect both to raise the performance level for any given FSTS. However, given the breadth of the multi-country sample, firm-level managerial differences are unlikely to systematically reshape the aggregate FSTS–performance curve, whose shape is primarily determined by economy-wide institutional and market-maturity factors.</w:t>
+        <w:t xml:space="preserve">Upper Echelons Theory predicts that top manager experience and gender composition affect strategic cognition and decision-making (Hambrick &amp; Mason, 1984). Manager experience reduces coordination errors in cross-border operations; female top management is associated with stakeholder orientation, relationship capital, and risk management, all relevant in institutionally heterogeneous export markets (Richard et al., 2019). We expect both to raise the performance level for any given FSTS. However, given the breadth of the multi-country sample, firm-level managerial differences are unlikely to systematically reshape the aggregate FSTS–performance curve, whose shape is primarily determined by economy-wide institutional and market-maturity factors.</w:t>
       </w:r>
     </w:p>
     <w:p>
@@ -631,7 +631,7 @@
         <w:pStyle w:val="FirstParagraph"/>
       </w:pPr>
       <w:r>
-        <w:t xml:space="preserve">The Context-Contingent Digital Capability Model (CDCM) developed in this dissertation programme predicts that the I–P curve-reshaping role of digital adoption is not uniform across institutional environments. In institutionally advanced economies (ICRV Group I–II), digital infrastructure is near-universal and close to the competitive baseline — the marginal performance differentiation from website and e-payment adoption is accordingly lower. In institutionally weaker economies (ICRV Group IV–VI), digital adoption remains differentiating: digital market access tools lower the liability-of-foreignness cost and provide cross-border coordination support that institutional voids cannot substitute. This motivates examining whether any curve-shaping role of digital capability (predicted by H3) is concentrated in weaker-institution economies rather than uniform across the pool — a prediction we assess through the within-regime turning-point analysis (Table 4), since the reconciled pooled models find no significant DAI curve-reshaping (H3 level effect confirmed, curvature NS).</w:t>
+        <w:t xml:space="preserve">The Context-Contingent Digital Capability Model (CDCM) developed in this dissertation programme predicts that the I–P curve-reshaping role of digital adoption is not uniform across institutional environments. In institutionally advanced economies (ICRV Group I–II), digital infrastructure is near-universal and close to the competitive baseline; the marginal performance differentiation from website and e-payment adoption is accordingly lower. In institutionally weaker economies (ICRV Group IV–VI), digital adoption remains differentiating: digital market access tools lower the liability-of-foreignness cost and provide cross-border coordination support that institutional voids cannot substitute. This motivates examining whether any curve-shaping role of digital capability (predicted by H3) is concentrated in weaker-institution economies rather than uniform across the pool: a prediction we assess through the within-regime turning-point analysis (Table 4), since the reconciled pooled models find no significant DAI curve-reshaping (H3 level effect confirmed, curvature NS).</w:t>
       </w:r>
     </w:p>
     <w:p>
@@ -671,7 +671,7 @@
         <w:t xml:space="preserve"> </w:t>
       </w:r>
       <w:r>
-        <w:t xml:space="preserve">interaction between digital adoption and export intensity — a conditional complementarity claim.</w:t>
+        <w:t xml:space="preserve">interaction between digital adoption and export intensity: a conditional complementarity claim.</w:t>
       </w:r>
     </w:p>
     <w:p>
@@ -732,7 +732,7 @@
         <w:pStyle w:val="BodyText"/>
       </w:pPr>
       <w:r>
-        <w:t xml:space="preserve">The final analytical frame contains 88,869 firm-observations across 50 economies and 103 country-year pairs; the main regression sample (outcome and FSTS non-missing) is 81,022. Some early waves predate the digital-capability and manager variables used in the moderation models; they contribute to the baseline models but drop from later specifications due to item missingness. WBES designs are cross-sectional within each wave, with standardised instruments ensuring common variable definitions across economies and years. We apply three harmonisation steps: (1) variable-priority mapping for candidate items across PICS3 (2009–2013), Standardised (2014–2018), and BREADY/BEE (2019–2025) questionnaire generations; (2) encoding-robust reading (primary UTF-8 with Latin-1/CP1252 fallback); (3) deduplication — selecting the largest file per (country, year) pair when multiple uploads exist.</w:t>
+        <w:t xml:space="preserve">The final analytical frame contains 88,869 firm-observations across 50 economies and 103 country-year pairs; the main regression sample (outcome and FSTS non-missing) is 81,022. Some early waves predate the digital-capability and manager variables used in the moderation models; they contribute to the baseline models but drop from later specifications due to item missingness. WBES designs are cross-sectional within each wave, with standardised instruments ensuring common variable definitions across economies and years. We apply three harmonisation steps: (1) variable-priority mapping for candidate items across PICS3 (2009–2013), Standardised (2014–2018), and BREADY/BEE (2019–2025) questionnaire generations; (2) encoding-robust reading (primary UTF-8 with Latin-1/CP1252 fallback); (3) deduplication, selecting the largest file per (country, year) pair when multiple uploads exist.</w:t>
       </w:r>
     </w:p>
     <w:bookmarkEnd w:id="30"/>
@@ -1013,7 +1013,7 @@
         <w:pStyle w:val="BodyText"/>
       </w:pPr>
       <w:r>
-        <w:t xml:space="preserve">The linear baseline (M1) yields a positive but small FSTS slope (β = +0.219, p = .002). Adding the quadratic term (M2, N=81,022) yields β₁ = +1.188 (p &lt; .001) and β₂ = −1.398 (p &lt; .001), consistent with an inverted-U. Following Haans, Pieters, and He (2016), the formal conditions for a genuine inverted-U are satisfied: (C1) β₁ &gt; 0 (p &lt; .001), a positive ascending limb; (C2) β₂ &lt; 0 (p &lt; .001), concavity; (C3) the turning point TP ≈ 51.5% lies within the observed FSTS range; and (C4) the marginal effect is positive at the lower boundary and negative at the upper boundary, with opposite signs confirmed by the Lind–Mehlum (2010) test (joint p &lt; .001). The turning point tightens as capability is controlled: adding demographic controls (M3) gives TP = 43.8%, and adding technological capability and digital adoption (M4, N=79,080) gives TP = 43.6% — the headline estimate, matching the dissertation's canonical value. The stability of the turning point in the low-to-mid-40% range once capability is held constant indicates that the inverted-U is not an artefact of capability-based selection into exporting.</w:t>
+        <w:t xml:space="preserve">The linear baseline (M1) yields a positive but small FSTS slope (β = +0.219, p = .002). Adding the quadratic term (M2, N=81,022) yields β₁ = +1.188 (p &lt; .001) and β₂ = −1.398 (p &lt; .001), consistent with an inverted-U. Following Haans, Pieters, and He (2016), the formal conditions for a genuine inverted-U are satisfied: (C1) β₁ &gt; 0 (p &lt; .001), a positive ascending limb; (C2) β₂ &lt; 0 (p &lt; .001), concavity; (C3) the turning point TP ≈ 51.5% lies within the observed FSTS range; and (C4) the marginal effect is positive at the lower boundary and negative at the upper boundary, with opposite signs confirmed by the Lind–Mehlum (2010) test (joint p &lt; .001). The turning point tightens as capability is controlled: adding demographic controls (M3) gives TP = 43.8%, and adding technological capability and digital adoption (M4, N=79,080) gives TP = 43.6%, the headline estimate, matching the dissertation's canonical value. The stability of the turning point in the low-to-mid-40% range once capability is held constant indicates that the inverted-U is not an artefact of capability-based selection into exporting.</w:t>
       </w:r>
     </w:p>
     <w:p>
@@ -1109,7 +1109,7 @@
         <w:pStyle w:val="BodyText"/>
       </w:pPr>
       <w:r>
-        <w:t xml:space="preserve">Digital adoption carries the largest capability level effect in the model (M4: DAI = +0.219, p &lt; .001) — a substantial productivity premium for firms with a web presence. The interaction model M6 adds FSTS×DAI and FSTS²×DAI to test whether digital adoption reshapes the curve; on this canonical specification, neither interaction is significant (FSTS×DAI = −0.270, FSTS²×DAI = +0.252, both p &gt; .10), and the turning point is essentially unchanged (TP = 47.1%). The curve-reshaping role attributed to DAI in an earlier draft does not survive re-estimation on the within-economy-year-standardised, two-way-fixed-effects specification: DAI behaves as a level-shifter, not a curve-reshaper, in the pooled sample.</w:t>
+        <w:t xml:space="preserve">Digital adoption carries the largest capability level effect in the model (M4: DAI = +0.219, p &lt; .001): a substantial productivity premium for firms with a web presence. The interaction model M6 adds FSTS×DAI and FSTS²×DAI to test whether digital adoption reshapes the curve; on this canonical specification, neither interaction is significant (FSTS×DAI = −0.270, FSTS²×DAI = +0.252, both p &gt; .10), and the turning point is essentially unchanged (TP = 47.1%). The curve-reshaping role attributed to DAI in an earlier draft does not survive re-estimation on the within-economy-year-standardised, two-way-fixed-effects specification: DAI behaves as a level-shifter, not a curve-reshaper, in the pooled sample.</w:t>
       </w:r>
     </w:p>
     <w:p>
@@ -1127,7 +1127,7 @@
         <w:t xml:space="preserve"> </w:t>
       </w:r>
       <w:r>
-        <w:t xml:space="preserve">Digital adoption raises firm performance substantially but does not significantly reshape the pooled I–P curve. The "digital shield" effect (DAI attenuating the descending limb) documented in the single-country Singapore study (P4) is not detectable once aggregated across the 50-economy pool — again consistent with the curve-shaping role of digital capability being institution-contingent rather than universal.</w:t>
+        <w:t xml:space="preserve">Digital adoption raises firm performance substantially but does not significantly reshape the pooled I–P curve. The "digital shield" effect (DAI attenuating the descending limb) documented in the single-country Singapore study (P4) is not detectable once aggregated across the 50-economy pool, again consistent with the curve-shaping role of digital capability being institution-contingent rather than universal.</w:t>
       </w:r>
     </w:p>
     <w:bookmarkEnd w:id="38"/>
@@ -1157,7 +1157,7 @@
         <w:pStyle w:val="BodyText"/>
       </w:pPr>
       <w:r>
-        <w:t xml:space="preserve">Adding manager characteristics (M7, N=75,029), manager sectoral experience is not significant (β = +0.002, p &gt; .10), while the female-top-manager coefficient is negative and highly significant (β = −0.104, p &lt; .001). The inverted-U is unaffected (TP = 44.0%). The negative female-management coefficient is consistent with the rest of the dissertation — the single-country Japan study (P10) and the thesis Chapter 4 likewise estimate a negative female-top-manager coefficient — and is most plausibly read as compositional selection of female-led establishments into smaller, lower-margin niches in economies where female senior leadership remains rare, rather than as a leadership effect. It should not be interpreted causally.</w:t>
+        <w:t xml:space="preserve">Adding manager characteristics (M7, N=75,029), manager sectoral experience is not significant (β = +0.002, p &gt; .10), while the female-top-manager coefficient is negative and highly significant (β = −0.104, p &lt; .001). The inverted-U is unaffected (TP = 44.0%). The negative female-management coefficient is consistent with the rest of the dissertation (the single-country Japan study, P10, and the thesis Chapter 4 likewise estimate a negative female-top-manager coefficient) and is most plausibly read as compositional selection of female-led establishments into smaller, lower-margin niches in economies where female senior leadership remains rare, rather than as a leadership effect. It should not be interpreted causally.</w:t>
       </w:r>
     </w:p>
     <w:p>
@@ -1240,10 +1240,7 @@
         <w:t xml:space="preserve">Lower-middle transition (Group IV, N=42,094): TP ≈ 43%</w:t>
       </w:r>
       <w:r>
-        <w:t xml:space="preserve"> </w:t>
-      </w:r>
-      <w:r>
-        <w:t xml:space="preserve">— a sharp, reliably located inverted-U (β₂ &lt; 0, p &lt; .001). This is the regime that anchors the pooled estimate.</w:t>
+        <w:t xml:space="preserve">, a sharp, reliably located inverted-U (β₂ &lt; 0, p &lt; .001). This is the regime that anchors the pooled estimate.</w:t>
       </w:r>
     </w:p>
     <w:p>
@@ -1262,10 +1259,7 @@
         <w:t xml:space="preserve">Strongest-institution regime (Group I Advanced innovation, incl. Japan): TP ≈ 80%</w:t>
       </w:r>
       <w:r>
-        <w:t xml:space="preserve"> </w:t>
-      </w:r>
-      <w:r>
-        <w:t xml:space="preserve">— the turning point lies near or beyond the observable range, so within the data the relationship is effectively near-linear and positive.</w:t>
+        <w:t xml:space="preserve">: the turning point lies near or beyond the observable range, so within the data the relationship is effectively near-linear and positive.</w:t>
       </w:r>
     </w:p>
     <w:p>
@@ -1284,10 +1278,7 @@
         <w:t xml:space="preserve">Weakest regimes (Group V Emerging: TP ≈ 37%; Group VI Pacific SIDS): the inverted-U dissolves</w:t>
       </w:r>
       <w:r>
-        <w:t xml:space="preserve"> </w:t>
-      </w:r>
-      <w:r>
-        <w:t xml:space="preserve">— in the SIDS group the quadratic flips sign (no interior maximum), consistent with the Forced Internationalization Penalty documented in the companion SIDS study (P8).</w:t>
+        <w:t xml:space="preserve">; in the SIDS group the quadratic flips sign (no interior maximum), consistent with the Forced Internationalization Penalty documented in the companion SIDS study (P8).</w:t>
       </w:r>
     </w:p>
     <w:p>
@@ -1305,7 +1296,7 @@
         <w:t xml:space="preserve"> </w:t>
       </w:r>
       <w:r>
-        <w:t xml:space="preserve">Institutional regime does not merely shift where a universal inverted-U peaks; it governs whether the inverted-U is sharp (transition regimes), straightened (strongest regimes), or absent (weakest regimes) — a three-zone structure.</w:t>
+        <w:t xml:space="preserve">Institutional regime does not merely shift where a universal inverted-U peaks; it governs whether the inverted-U is sharp (transition regimes), straightened (strongest regimes), or absent (weakest regimes): a three-zone structure.</w:t>
       </w:r>
     </w:p>
     <w:bookmarkEnd w:id="40"/>
@@ -1339,7 +1330,7 @@
         <w:t xml:space="preserve"> </w:t>
       </w:r>
       <w:r>
-        <w:t xml:space="preserve">of productivity but do not significantly reshape the pooled curve. What reshapes the curve is institutional regime — and it does so not as a smooth gradient but as three discrete zones. In the middle of the institutional gradient (lower-middle transition), the inverted-U is sharp and reliably located near a 43% turning point; at the top (strongest institutions, including Japan), the descending limb is pushed beyond the observable range and the relationship is effectively near-linear; at the bottom (emerging and Pacific SIDS), the inverted-U dissolves and, in the SIDS group, reverses. This three-zone reading reconciles the apparently divergent single-country results in the dissertation (Vietnam and India in the transition zone show sharp inverted-U; Singapore and Japan at the top show near-linearity; the SIDS group shows the Forced Internationalization Penalty) within one harmonised, 50-economy estimation.</w:t>
+        <w:t xml:space="preserve">of productivity but do not significantly reshape the pooled curve. What reshapes the curve is institutional regime, and it does so not as a smooth gradient but as three discrete zones. In the middle of the institutional gradient (lower-middle transition), the inverted-U is sharp and reliably located near a 43% turning point; at the top (strongest institutions, including Japan), the descending limb is pushed beyond the observable range and the relationship is effectively near-linear; at the bottom (emerging and Pacific SIDS), the inverted-U dissolves and, in the SIDS group, reverses. This three-zone reading reconciles the apparently divergent single-country results in the dissertation (Vietnam and India in the transition zone show sharp inverted-U; Singapore and Japan at the top show near-linearity; the SIDS group shows the Forced Internationalization Penalty) within one harmonised, 50-economy estimation.</w:t>
       </w:r>
     </w:p>
     <w:p>
@@ -1374,7 +1365,7 @@
         <w:pStyle w:val="FirstParagraph"/>
       </w:pPr>
       <w:r>
-        <w:t xml:space="preserve">The central finding — an inverted-U with a capability-adjusted turning point of 43.6% foreign sales intensity, robust across 50 economies and six ICRV groups — offers a parsimonious resolution to apparent inconsistencies in the Asian I–P literature. Studies finding positive linear effects (Pangarkar, 2008: Singapore; Cho et al., 2023: Korea) are working with strong-institution samples whose turning point lies beyond the observable export-intensity range; their firms are on a long ascending limb. Studies finding null or negative results may be capturing weakest-regime samples in which the inverted-U dissolves. Our within-regime turning-point analysis provides the key refinement: the relationship is not a single inverted-U with a moving peak but a</w:t>
+        <w:t xml:space="preserve">The central finding (an inverted-U with a capability-adjusted turning point of 43.6% foreign sales intensity, robust across 50 economies and six ICRV groups) offers a parsimonious resolution to apparent inconsistencies in the Asian I–P literature. Studies finding positive linear effects (Pangarkar, 2008: Singapore; Cho et al., 2023: Korea) are working with strong-institution samples whose turning point lies beyond the observable export-intensity range; their firms are on a long ascending limb. Studies finding null or negative results may be capturing weakest-regime samples in which the inverted-U dissolves. Our within-regime turning-point analysis provides the key refinement: the relationship is not a single inverted-U with a moving peak but a</w:t>
       </w:r>
       <w:r>
         <w:t xml:space="preserve"> </w:t>
@@ -1390,7 +1381,7 @@
         <w:t xml:space="preserve"> </w:t>
       </w:r>
       <w:r>
-        <w:t xml:space="preserve">structure — sharp inverted-U in the transition regime (Group IV, TP ≈ 43%), near-linearity in the strongest regime (Group I, TP ≈ 80%, beyond range), and dissolution in the weakest regimes (Group V ≈ 37%; Group VI SIDS, no inverted-U). Whether a single-country study finds an inverted-U at all therefore depends on which institutional zone its economy occupies.</w:t>
+        <w:t xml:space="preserve">structure: sharp inverted-U in the transition regime (Group IV, TP ≈ 43%), near-linearity in the strongest regime (Group I, TP ≈ 80%, beyond range), and dissolution in the weakest regimes (Group V ≈ 37%; Group VI SIDS, no inverted-U). Whether a single-country study finds an inverted-U at all therefore depends on which institutional zone its economy occupies.</w:t>
       </w:r>
     </w:p>
     <w:bookmarkEnd w:id="43"/>
@@ -1426,7 +1417,7 @@
         <w:pStyle w:val="FirstParagraph"/>
       </w:pPr>
       <w:r>
-        <w:t xml:space="preserve">On the canonical specification, digital adoption is the largest single capability level-shifter (DAI = +0.219, p &lt; .001) but does not significantly reshape the pooled I–P curve. This is a more conservative and, we argue, more credible reading than an earlier draft that attributed significant curve-reshaping to DAI: with within-economy-year standardisation and two-way fixed effects absorbing the price-level and selection confounds, the apparent curve-reshaping does not survive. The "digital shield" mechanism — DAI cushioning the descending limb — appears in the single-country Singapore study (P4) but is undetectable in aggregation, indicating that any curve-shaping role of digital adoption is institution-contingent and operates below the resolution of a pooled, Tier-1 (website-only) WBES measure. The policy implication is correspondingly disciplined: digital adoption is a robust lever for raising the productivity</w:t>
+        <w:t xml:space="preserve">On the canonical specification, digital adoption is the largest single capability level-shifter (DAI = +0.219, p &lt; .001) but does not significantly reshape the pooled I–P curve. This is a more conservative and, we argue, more credible reading than an earlier draft that attributed significant curve-reshaping to DAI: with within-economy-year standardisation and two-way fixed effects absorbing the price-level and selection confounds, the apparent curve-reshaping does not survive. The "digital shield" mechanism, DAI cushioning the descending limb, appears in the single-country Singapore study (P4) but is undetectable in aggregation, indicating that any curve-shaping role of digital adoption is institution-contingent and operates below the resolution of a pooled, Tier-1 (website-only) WBES measure. The policy implication is correspondingly disciplined: digital adoption is a robust lever for raising the productivity</w:t>
       </w:r>
       <w:r>
         <w:t xml:space="preserve"> </w:t>
@@ -1476,7 +1467,7 @@
         <w:t xml:space="preserve"> </w:t>
       </w:r>
       <w:r>
-        <w:t xml:space="preserve">(−0.104, p &lt; .001) rather than positive. This sign is consistent across the dissertation — the single-country Japan study (P10) and the thesis pooled analysis estimate the same negative coefficient — and it cautions against a causal reading. In economies where female senior leadership remains rare (the regional pool spans contexts with female-top-manager shares from single digits upward), the small set of female-led establishments is unlikely to be a random draw; the most plausible interpretation is compositional selection into smaller, lower-margin, labour-intensive niches, which a cross-sectional level regression cannot disentangle from any leadership effect. The null curve-moderation result (FSTS×manager terms not significant) indicates that, whatever the source of the level coefficient, manager characteristics do not help firms navigate the internationalization trade-off more efficiently. We therefore report the female-management coefficient as a descriptive regularity requiring within-economy, selection-aware analysis (e.g., matched samples or panel tracking of leadership transitions), not as evidence on the causal effect of female leadership on firm performance.</w:t>
+        <w:t xml:space="preserve">(−0.104, p &lt; .001) rather than positive. This sign is consistent across the dissertation: the single-country Japan study (P10) and the thesis pooled analysis estimate the same negative coefficient. It cautions against a causal reading. In economies where female senior leadership remains rare (the regional pool spans contexts with female-top-manager shares from single digits upward), the small set of female-led establishments is unlikely to be a random draw; the most plausible interpretation is compositional selection into smaller, lower-margin, labour-intensive niches, which a cross-sectional level regression cannot disentangle from any leadership effect. The null curve-moderation result (FSTS×manager terms not significant) indicates that, whatever the source of the level coefficient, manager characteristics do not help firms navigate the internationalization trade-off more efficiently. We therefore report the female-management coefficient as a descriptive regularity requiring within-economy, selection-aware analysis (e.g., matched samples or panel tracking of leadership transitions), not as evidence on the causal effect of female leadership on firm performance.</w:t>
       </w:r>
     </w:p>
     <w:bookmarkEnd w:id="46"/>
@@ -1520,7 +1511,7 @@
         <w:pStyle w:val="FirstParagraph"/>
       </w:pPr>
       <w:r>
-        <w:t xml:space="preserve">We find that the inverted-U I–P relationship holds robustly across a 50-economy, 103-wave WBES sample (including Japan's inaugural 2025 wave), with a capability-adjusted turning point of 43.6% foreign sales intensity. Three conclusions are policy-relevant. First, for firms in the ascending phase (FSTS &lt; 43.6%), intensifying internationalization is productivity-enhancing; the priority is removing barriers to export expansion. For firms beyond the turning point, the constraint is not market access but coordination capacity. Second, both technological capability and digital adoption raise the performance level substantially across all FSTS levels without reliably reshaping the curve; policy should target capability building as a baseline performance lever rather than as a curve-shifting intervention. Third, and most important, it is institutional regime — not capability — that determines the shape of the curve: the inverted-U is sharp in transition economies (turning point ≈ 43%), straightens toward near-linearity in the strongest-institution economies (peak beyond the observable range), and dissolves in the weakest regimes, reversing into a Forced Internationalization Penalty in the Pacific SIDS group. Context-contingent policy must therefore differ by zone, not merely by where a common peak falls.</w:t>
+        <w:t xml:space="preserve">We find that the inverted-U I–P relationship holds robustly across a 50-economy, 103-wave WBES sample (including Japan's inaugural 2025 wave), with a capability-adjusted turning point of 43.6% foreign sales intensity. Three conclusions are policy-relevant. First, for firms in the ascending phase (FSTS &lt; 43.6%), intensifying internationalization is productivity-enhancing; the priority is removing barriers to export expansion. For firms beyond the turning point, the constraint is not market access but coordination capacity. Second, both technological capability and digital adoption raise the performance level substantially across all FSTS levels without reliably reshaping the curve; policy should target capability building as a baseline performance lever rather than as a curve-shifting intervention. Third, and most important, it is institutional regime, not capability, that determines the shape of the curve: the inverted-U is sharp in transition economies (turning point ≈ 43%), straightens toward near-linearity in the strongest-institution economies (peak beyond the observable range), and dissolves in the weakest regimes, reversing into a Forced Internationalization Penalty in the Pacific SIDS group. Context-contingent policy must therefore differ by zone, not merely by where a common peak falls.</w:t>
       </w:r>
     </w:p>
     <w:p>
@@ -1528,7 +1519,7 @@
         <w:pStyle w:val="BodyText"/>
       </w:pPr>
       <w:r>
-        <w:t xml:space="preserve">The near-term policy context adds urgency to these findings. World Bank (2026b) macro monitoring data for Vietnam — the largest ICRV Group IV economy in the sample — show manufacturing PMI falling to 45.3 (contraction) in March 2026 as new export orders collapsed following the opening of a U.S. trade-representative investigation; merchandise imports had risen 27.8% year-on-year by the same month, partly driven by energy supply-chain disruption from the Strait of Hormuz conflict. These conditions are precisely those under which the right side of the inverted-U becomes consequential: firms pushed above their optimal FSTS by earlier export commitments face amplified coordination and input-cost pressures. Because Vietnam sits in the transition regime where the inverted-U is sharpest (Group IV turning point ≈ 43%), Vietnamese exporters currently above that threshold are among the most exposed to macro shocks. The capability evidence implies that building technological and digital capability raises the productivity floor for these firms, even though — on our pooled estimates — capability does not by itself flatten the descending limb; the binding margin is the breadth of capable export participation, not a curve-shifting fix.</w:t>
+        <w:t xml:space="preserve">The near-term policy context adds urgency to these findings. World Bank (2026b) macro monitoring data for Vietnam, the largest ICRV Group IV economy in the sample, show manufacturing PMI falling to 45.3 (contraction) in March 2026 as new export orders collapsed following the opening of a U.S. trade-representative investigation; merchandise imports had risen 27.8% year-on-year by the same month, partly driven by energy supply-chain disruption from the Strait of Hormuz conflict. These conditions are precisely those under which the right side of the inverted-U becomes consequential: firms pushed above their optimal FSTS by earlier export commitments face amplified coordination and input-cost pressures. Because Vietnam sits in the transition regime where the inverted-U is sharpest (Group IV turning point ≈ 43%), Vietnamese exporters currently above that threshold are among the most exposed to macro shocks. The capability evidence implies that building technological and digital capability raises the productivity floor for these firms, even though, on our pooled estimates, capability does not by itself flatten the descending limb; the binding margin is the breadth of capable export participation, not a curve-shifting fix.</w:t>
       </w:r>
     </w:p>
     <w:p>

</xml_diff>

<commit_message>
fix(p7): correct TCI_z item naming to b8+e6 in capstone & IBR package
The operational definition of the 2-item estimation variable tci_z was mislabeled
as 'R&D activity (h8) + quality certification (b8)' in the P7 capstone and the IBR
submission package. The verified replication pipeline (01_build_p7_dataset.py ->
p7_pooled_clean.csv -> 02_run_p7_models.py) builds tci_z from b8 (quality
certification) + e6 (foreign-licensed technology). Aligned both files (prose +
variable table) to b8+e6, matching the already-correct APJM and JIBS packages.
Conceptual 4-construct framing sentence left unchanged (consistent across all
packages). DOCX rebuilt. No numbers changed.
</commit_message>
<xml_diff>
--- a/p7/p7_capstone_en_clean.docx
+++ b/p7/p7_capstone_en_clean.docx
@@ -2,7 +2,7 @@
 <file path=word/document.xml><?xml version="1.0" encoding="utf-8"?>
 <w:document xmlns:w="http://schemas.openxmlformats.org/wordprocessingml/2006/main" xmlns:m="http://schemas.openxmlformats.org/officeDocument/2006/math" xmlns:r="http://schemas.openxmlformats.org/officeDocument/2006/relationships" xmlns:o="urn:schemas-microsoft-com:office:office" xmlns:v="urn:schemas-microsoft-com:vml" xmlns:w10="urn:schemas-microsoft-com:office:word" xmlns:a="http://schemas.openxmlformats.org/drawingml/2006/main" xmlns:pic="http://schemas.openxmlformats.org/drawingml/2006/picture" xmlns:wp="http://schemas.openxmlformats.org/drawingml/2006/wordprocessingDrawing">
   <w:body>
-    <w:bookmarkStart w:id="78" w:name="Xe1057dabf7101c796f791bc61dc6101f2b6f291"/>
+    <w:bookmarkStart w:id="53" w:name="Xe1057dabf7101c796f791bc61dc6101f2b6f291"/>
     <w:p>
       <w:pPr>
         <w:pStyle w:val="Heading1"/>
@@ -263,7 +263,7 @@
         <w:pStyle w:val="FirstParagraph"/>
       </w:pPr>
       <w:r>
-        <w:t xml:space="preserve">We examine whether the internationalization–performance (I–P) relationship holds across a large and institutionally diverse set of Asian and Pacific economies and identify the conditions under which firms convert export intensity into productive performance. Using microdata from 88,869 firms across 50 economies and 103 country-year waves of the World Bank Enterprise Survey (2003–2025; including Japan's inaugural 2025 wave), spanning all six Institutional Context Regime Variation (ICRV) groups, we estimate a hierarchical sequence of models on currency-neutral labour productivity (standardised within economy-year) with two-way (economy and year) fixed effects throughout and standard errors clustered by economy. We find robust support for an inverted-U I–P relationship: the quadratic baseline (M2, N=81,022) yields a turning point of 51.5% of export sales, tightening to 43.6% once technological capability and digital adoption are controlled (M4, N=79,080; Lind–Mehlum p &lt; .001 throughout). Technological capability (TCI, +0.108) and digital adoption (DAI, +0.219) both raise the performance level, but neither significantly reshapes the pooled curve; both are level-shifters, not curve-reshapers. The curve structure is instead governed by institutional regime: estimating the turning point within each ICRV group reveals a three-zone pattern: a sharp inverted-U in the lower-middle transition regime (TP ≈ 43%), a near-linear relationship in the strongest-institution regime (turning point beyond the observable range, ≈ 80%), and dissolution of the inverted-U in the weakest regimes (Emerging ≈ 37%; the Pacific SIDS group shows no inverted-U). Female top management carries a negative coefficient (−0.104, p &lt; .001). These findings offer a parsimonious resolution to Asian I–P heterogeneity: the relationship is inverted-U in form, but it is institutional regime, not capability per se, that determines whether the inverted-U is sharp, straightened, or absent.</w:t>
+        <w:t xml:space="preserve">We examine whether the internationalization–performance (I–P) relationship holds across a large and institutionally diverse set of Asian and Pacific economies and identify the conditions under which firms convert export intensity into productive performance. Using microdata from 88,869 firms across 50 economies and 103 country-year waves of the World Bank Enterprise Survey (2003–2025; including Japan’s inaugural 2025 wave), spanning all six Institutional Context Regime Variation (ICRV) groups, we estimate a hierarchical sequence of models on currency-neutral labour productivity (standardised within economy-year) with two-way (economy and year) fixed effects throughout and standard errors clustered by economy. We find robust support for an inverted-U I–P relationship: the quadratic baseline (M2, N=81,022) yields a turning point of 51.5% of export sales, tightening to 43.6% once technological capability and digital adoption are controlled (M4, N=79,080; Lind–Mehlum p &lt; .001 throughout). Technological capability (TCI, +0.108) and digital adoption (DAI, +0.219) both raise the performance level, but neither significantly reshapes the pooled curve; both are level-shifters, not curve-reshapers. The curve structure is instead governed by institutional regime: estimating the turning point within each ICRV group reveals a three-zone pattern: a sharp inverted-U in the lower-middle transition regime (TP ≈ 43%), a near-linear relationship in the strongest-institution regime (turning point beyond the observable range, ≈ 80%), and dissolution of the inverted-U in the weakest regimes (Emerging ≈ 37%; the Pacific SIDS group shows no inverted-U). Female top management carries a negative coefficient (−0.104, p &lt; .001). These findings offer a parsimonious resolution to Asian I–P heterogeneity: the relationship is inverted-U in form, but it is institutional regime, not capability per se, that determines whether the inverted-U is sharp, straightened, or absent.</w:t>
       </w:r>
     </w:p>
     <w:p>
@@ -292,7 +292,7 @@
       </w:r>
     </w:p>
     <w:bookmarkEnd w:id="20"/>
-    <w:bookmarkStart w:id="21" w:name="Xe3d0fc0bea9a42ce7605565d0964033d7f6ee47"/>
+    <w:bookmarkStart w:id="21" w:name="introduction"/>
     <w:p>
       <w:pPr>
         <w:pStyle w:val="Heading2"/>
@@ -314,7 +314,7 @@
         <w:pStyle w:val="BodyText"/>
       </w:pPr>
       <w:r>
-        <w:t xml:space="preserve">This paper addresses that gap. We pool 88,869 firm-observations from 50 Asian and Pacific economies spanning 2003–2025 (including Japan's inaugural 2025 wave), harmonised from the World Bank Enterprise Survey (WBES). Our sample spans all six ICRV regime groups, from advanced innovation-driven economies (Japan, Singapore, Korea, Taiwan, Hong Kong, Israel) to Pacific Small Island Developing States (Vanuatu, Solomon Islands, Fiji, Tonga, Samoa, Kiribati, Papua New Guinea) and Gulf advanced-resource economies (Bahrain, Kuwait, Qatar, Brunei, Saudi Arabia, Oman), all classified through the Institutional Context Regime Variation (ICRV) framework that anchors the broader dissertation programme of which this study is part.</w:t>
+        <w:t xml:space="preserve">This paper addresses that gap. We pool 88,869 firm-observations from 50 Asian and Pacific economies spanning 2003–2025 (including Japan’s inaugural 2025 wave), harmonised from the World Bank Enterprise Survey (WBES). Our sample spans all six ICRV regime groups, from advanced innovation-driven economies (Japan, Singapore, Korea, Taiwan, Hong Kong, Israel) to Pacific Small Island Developing States (Vanuatu, Solomon Islands, Fiji, Tonga, Samoa, Kiribati, Papua New Guinea) and Gulf advanced-resource economies (Bahrain, Kuwait, Qatar, Brunei, Saudi Arabia, Oman), all classified through the Institutional Context Regime Variation (ICRV) framework that anchors the broader dissertation programme of which this study is part.</w:t>
       </w:r>
     </w:p>
     <w:p>
@@ -373,7 +373,7 @@
       </w:r>
     </w:p>
     <w:bookmarkEnd w:id="21"/>
-    <w:bookmarkStart w:id="29" w:name="Xce0b9068aa677089fdc23e66f61b75516af2bf7"/>
+    <w:bookmarkStart w:id="29" w:name="theoretical-framework-and-hypotheses"/>
     <w:p>
       <w:pPr>
         <w:pStyle w:val="Heading2"/>
@@ -382,7 +382,7 @@
         <w:t xml:space="preserve">2. Theoretical Framework and Hypotheses</w:t>
       </w:r>
     </w:p>
-    <w:bookmarkStart w:id="22" w:name="X61eb865d3ba9c18e1eda9971096f2566a95b0ec"/>
+    <w:bookmarkStart w:id="22" w:name="theoretical-foundations"/>
     <w:p>
       <w:pPr>
         <w:pStyle w:val="Heading3"/>
@@ -400,7 +400,7 @@
       </w:r>
     </w:p>
     <w:bookmarkEnd w:id="22"/>
-    <w:bookmarkStart w:id="23" w:name="Xf68c2510db72354551e5b442c06e6149a212286"/>
+    <w:bookmarkStart w:id="23" w:name="the-non-linear-ip-relationship-h1"/>
     <w:p>
       <w:pPr>
         <w:pStyle w:val="Heading3"/>
@@ -414,7 +414,7 @@
         <w:pStyle w:val="FirstParagraph"/>
       </w:pPr>
       <w:r>
-        <w:t xml:space="preserve">Contractor et al. (2003) formalised the three-stage S-curve hypothesis: early internationalization carries fixed entry costs that depress performance; intermediate internationalization yields learning and scale economies; high internationalization may again impose coordination and agency costs. Empirically, however, the data more consistently support the inverted-U: a special case in which the third stage does not emerge at the export intensities typically observed in developing-economy WBES data (Gomes &amp; Ramaswamy, 1999; Lu &amp; Beamish, 2004).</w:t>
+        <w:t xml:space="preserve">Contractor et al. (2003) formalised the three-stage S-curve hypothesis: early internationalization carries fixed entry costs that depress performance; intermediate internationalization yields learning and scale economies; high internationalization may again impose coordination and agency costs. Empirically, however, the data more consistently support the inverted-U: a special case in which the third stage does not emerge at the export intensities typically observed in developing-economy WBES data (Gomes &amp; Ramaswamy, 1999; Lu &amp; Beamish, 2004).</w:t>
       </w:r>
     </w:p>
     <w:p>
@@ -444,7 +444,7 @@
       </w:r>
     </w:p>
     <w:bookmarkEnd w:id="23"/>
-    <w:bookmarkStart w:id="24" w:name="X804c25e8bdbf8eade8cd93fdb8dbf851f3c8515"/>
+    <w:bookmarkStart w:id="24" w:name="Xe2f9215226203df0d35a74fbc3991b825156e23"/>
     <w:p>
       <w:pPr>
         <w:pStyle w:val="Heading3"/>
@@ -501,7 +501,7 @@
       </w:r>
     </w:p>
     <w:bookmarkEnd w:id="24"/>
-    <w:bookmarkStart w:id="25" w:name="Xf9645264d48ebb644ff7e280396113254c384c7"/>
+    <w:bookmarkStart w:id="25" w:name="digital-adoption-as-a-level-enhancer-h3"/>
     <w:p>
       <w:pPr>
         <w:pStyle w:val="Heading3"/>
@@ -515,7 +515,7 @@
         <w:pStyle w:val="FirstParagraph"/>
       </w:pPr>
       <w:r>
-        <w:t xml:space="preserve">Digital adoption, measured through website presence and electronic-payment share, has been associated with reduced communication and transaction costs (Verhoef et al., 2021). In the CDCM (Context-Contingent Digital Capability Model) developed in the dissertation, DAI's effect depends on the interaction of regime quality, FSTS level, and digital market saturation (Đỗ &amp; Phan, 2024). Specifically, in institutionally advanced economies where digital infrastructure is mature, DAI provides universal performance lifts (as in P4 Singapore: β(DAI) positive and significant). In emerging-economy contexts with substantial selection into digital adoption (P3 Vietnam: IV-estimated β(DAI) ≈ 0, consistent with selection bias in OLS), DAI's curve-shaping role is attenuated. Across the pooled multi-economy sample, we expect DAI to raise performance levels broadly across the sample (level effect). In a fully specified model that also accounts for managerial quality (which correlates with digital adoption), the residual DAI variation may reveal a capability-complementarity curve effect: digitally equipped firms at low FSTS face sunk adoption costs that compress near-term productivity, while digital infrastructure supports coordination efficiency at high FSTS where cross-border management demands are greatest.</w:t>
+        <w:t xml:space="preserve">Digital adoption, measured through website presence and electronic-payment share, has been associated with reduced communication and transaction costs (Verhoef et al., 2021). In the CDCM (Context-Contingent Digital Capability Model) developed in the dissertation, DAI’s effect depends on the interaction of regime quality, FSTS level, and digital market saturation (Đỗ &amp; Phan, 2024). Specifically, in institutionally advanced economies where digital infrastructure is mature, DAI provides universal performance lifts (as in P4 Singapore: β(DAI) positive and significant). In emerging-economy contexts with substantial selection into digital adoption (P3 Vietnam: IV-estimated β(DAI) ≈ 0, consistent with selection bias in OLS), DAI’s curve-shaping role is attenuated. Across the pooled multi-economy sample, we expect DAI to raise performance levels broadly across the sample (level effect). In a fully specified model that also accounts for managerial quality (which correlates with digital adoption), the residual DAI variation may reveal a capability-complementarity curve effect: digitally equipped firms at low FSTS face sunk adoption costs that compress near-term productivity, while digital infrastructure supports coordination efficiency at high FSTS where cross-border management demands are greatest.</w:t>
       </w:r>
     </w:p>
     <w:p>
@@ -537,7 +537,7 @@
       </w:r>
     </w:p>
     <w:bookmarkEnd w:id="25"/>
-    <w:bookmarkStart w:id="26" w:name="Xfde2382d547d6bd016a370b8abd9bb51c6ab875"/>
+    <w:bookmarkStart w:id="26" w:name="managerial-characteristics-h4"/>
     <w:p>
       <w:pPr>
         <w:pStyle w:val="Heading3"/>
@@ -573,7 +573,7 @@
       </w:r>
     </w:p>
     <w:bookmarkEnd w:id="26"/>
-    <w:bookmarkStart w:id="27" w:name="Xc04b0d08a7461e173e211ec4b938149d2f7c8bf"/>
+    <w:bookmarkStart w:id="27" w:name="X0b3fdaf9bb49b1730bc3a0521f76f654a8096ae"/>
     <w:p>
       <w:pPr>
         <w:pStyle w:val="Heading3"/>
@@ -617,7 +617,7 @@
       </w:r>
     </w:p>
     <w:bookmarkEnd w:id="27"/>
-    <w:bookmarkStart w:id="28" w:name="X0acb0ebe9609c9b4cd27b2f0dbe81194406b82a"/>
+    <w:bookmarkStart w:id="28" w:name="regime-contingent-digital-effects-h6"/>
     <w:p>
       <w:pPr>
         <w:pStyle w:val="Heading3"/>
@@ -689,7 +689,7 @@
         <w:t xml:space="preserve"> </w:t>
       </w:r>
       <w:r>
-        <w:t xml:space="preserve">The ICRV institutional regime moderates the digital-adoption curve-reshaping effect: digital adoption's compressive effect on the I–P ascending limb and its buffering effect at high FSTS (H3) are stronger in weaker institutional environments (higher ICRV group number), where digital infrastructure provides greater competitive differentiation in cross-border market access.</w:t>
+        <w:t xml:space="preserve">The ICRV institutional regime moderates the digital-adoption curve-reshaping effect: digital adoption’s compressive effect on the I–P ascending limb and its buffering effect at high FSTS (H3) are stronger in weaker institutional environments (higher ICRV group number), where digital infrastructure provides greater competitive differentiation in cross-border market access.</w:t>
       </w:r>
     </w:p>
     <w:p>
@@ -701,7 +701,7 @@
     </w:p>
     <w:bookmarkEnd w:id="28"/>
     <w:bookmarkEnd w:id="29"/>
-    <w:bookmarkStart w:id="34" w:name="X5eb800a903106e48a684e9ea9de39ed619b9df8"/>
+    <w:bookmarkStart w:id="34" w:name="data-and-methods"/>
     <w:p>
       <w:pPr>
         <w:pStyle w:val="Heading2"/>
@@ -710,7 +710,7 @@
         <w:t xml:space="preserve">3. Data and Methods</w:t>
       </w:r>
     </w:p>
-    <w:bookmarkStart w:id="30" w:name="X180323993af082d7b264d69830cacecf330a102"/>
+    <w:bookmarkStart w:id="30" w:name="data-source"/>
     <w:p>
       <w:pPr>
         <w:pStyle w:val="Heading3"/>
@@ -724,7 +724,7 @@
         <w:pStyle w:val="FirstParagraph"/>
       </w:pPr>
       <w:r>
-        <w:t xml:space="preserve">Data derive from the World Bank Enterprise Surveys (WBES; World Bank, 2025), a stratified random-sample survey of formal private-sector enterprises conducted periodically across over 130 countries. We use microdata from 50 Asian and Pacific economies across 103 country-year waves spanning 2003–2025, including Japan's inaugural WBES wave (2025). This coverage encompasses six UN M.49 Asian sub-regions: East Asia (China, Hong Kong, Korea, Mongolia, Taiwan), Southeast Asia (Brunei, Cambodia, Indonesia, Laos, Malaysia, Myanmar, Philippines, Singapore, Thailand, Timor-Leste, Vietnam), South Asia (Afghanistan, Bangladesh, Bhutan, India, Maldives, Nepal, Pakistan, Sri Lanka), Central Asia (Kazakhstan, Kyrgyz Republic, Tajikistan, Turkmenistan, Uzbekistan), West Asia (Armenia, Bahrain, Cyprus, Iraq, Israel, Jordan, Kuwait, Lebanon, Oman, Qatar, Saudi Arabia, Yemen), and Pacific/SIDS (Fiji, Kiribati, Papua New Guinea, Samoa, Solomon Islands, Tonga, Vanuatu).</w:t>
+        <w:t xml:space="preserve">Data derive from the World Bank Enterprise Surveys (WBES; World Bank, 2025), a stratified random-sample survey of formal private-sector enterprises conducted periodically across over 130 countries. We use microdata from 50 Asian and Pacific economies across 103 country-year waves spanning 2003–2025, including Japan’s inaugural WBES wave (2025). This coverage encompasses six UN M.49 Asian sub-regions: East Asia (China, Hong Kong, Korea, Mongolia, Taiwan), Southeast Asia (Brunei, Cambodia, Indonesia, Laos, Malaysia, Myanmar, Philippines, Singapore, Thailand, Timor-Leste, Vietnam), South Asia (Afghanistan, Bangladesh, Bhutan, India, Maldives, Nepal, Pakistan, Sri Lanka), Central Asia (Kazakhstan, Kyrgyz Republic, Tajikistan, Turkmenistan, Uzbekistan), West Asia (Armenia, Bahrain, Cyprus, Iraq, Israel, Jordan, Kuwait, Lebanon, Oman, Qatar, Saudi Arabia, Yemen), and Pacific/SIDS (Fiji, Kiribati, Papua New Guinea, Samoa, Solomon Islands, Tonga, Vanuatu).</w:t>
       </w:r>
     </w:p>
     <w:p>
@@ -736,7 +736,7 @@
       </w:r>
     </w:p>
     <w:bookmarkEnd w:id="30"/>
-    <w:bookmarkStart w:id="31" w:name="Xbcf9f12e79107fa2c089aaf13fc6c4fb773f1c2"/>
+    <w:bookmarkStart w:id="31" w:name="variables"/>
     <w:p>
       <w:pPr>
         <w:pStyle w:val="Heading3"/>
@@ -812,7 +812,7 @@
         <w:t xml:space="preserve"> </w:t>
       </w:r>
       <w:r>
-        <w:t xml:space="preserve">A two-item composite of R&amp;D activity (h8) and internationally recognised quality certification (b8), standardised to mean 0, SD 1 within economy-year.</w:t>
+        <w:t xml:space="preserve">A two-item composite of internationally recognised quality certification (b8: has ISO or other certification) and foreign-technology adoption (e6: uses foreign-licensed technology), standardised to mean 0, SD 1 within economy-year.</w:t>
       </w:r>
     </w:p>
     <w:p>
@@ -888,7 +888,7 @@
       </w:r>
     </w:p>
     <w:bookmarkEnd w:id="31"/>
-    <w:bookmarkStart w:id="32" w:name="X88d3b635b18ee197bee6ec760e4576787847be1"/>
+    <w:bookmarkStart w:id="32" w:name="estimation-strategy"/>
     <w:p>
       <w:pPr>
         <w:pStyle w:val="Heading3"/>
@@ -922,7 +922,7 @@
       </w:r>
     </w:p>
     <w:bookmarkEnd w:id="32"/>
-    <w:bookmarkStart w:id="33" w:name="X7306ee6cc650c2a8c74023d786fd3b6ffa0ad4b"/>
+    <w:bookmarkStart w:id="33" w:name="sample-sizes"/>
     <w:p>
       <w:pPr>
         <w:pStyle w:val="Heading3"/>
@@ -936,7 +936,7 @@
         <w:pStyle w:val="FirstParagraph"/>
       </w:pPr>
       <w:r>
-        <w:t xml:space="preserve">The analytic frame is 88,869 firms across 50 economies. The quadratic anchor (M2: outcome + FSTS non-missing) is N = 81,022. Adding the capability block (M4: TCI and DAI) gives N = 79,080; demographic controls (M3) N = 78,970; the manager models (M7) drop to N = 75,029 because manager experience and gender are missing in some waves. The modest attrition across the ladder reflects item missingness in the moderator and manager variables, which is more prevalent in smaller economies and early WBES waves. All N's are reproducible via</w:t>
+        <w:t xml:space="preserve">The analytic frame is 88,869 firms across 50 economies. The quadratic anchor (M2: outcome + FSTS non-missing) is N = 81,022. Adding the capability block (M4: TCI and DAI) gives N = 79,080; demographic controls (M3) N = 78,970; the manager models (M7) drop to N = 75,029 because manager experience and gender are missing in some waves. The modest attrition across the ladder reflects item missingness in the moderator and manager variables, which is more prevalent in smaller economies and early WBES waves. All N’s are reproducible via</w:t>
       </w:r>
       <w:r>
         <w:t xml:space="preserve"> </w:t>
@@ -960,7 +960,7 @@
     </w:p>
     <w:bookmarkEnd w:id="33"/>
     <w:bookmarkEnd w:id="34"/>
-    <w:bookmarkStart w:id="42" w:name="X121719332867ee227f0a04b486098cee978c6e6"/>
+    <w:bookmarkStart w:id="42" w:name="results"/>
     <w:p>
       <w:pPr>
         <w:pStyle w:val="Heading2"/>
@@ -969,7 +969,7 @@
         <w:t xml:space="preserve">4. Results</w:t>
       </w:r>
     </w:p>
-    <w:bookmarkStart w:id="35" w:name="X1a3b7383b8b125b3d271986dbdfbc78bb7f954a"/>
+    <w:bookmarkStart w:id="35" w:name="descriptive-statistics-and-correlations"/>
     <w:p>
       <w:pPr>
         <w:pStyle w:val="Heading3"/>
@@ -987,7 +987,7 @@
       </w:r>
     </w:p>
     <w:bookmarkEnd w:id="35"/>
-    <w:bookmarkStart w:id="36" w:name="Xdbf83b4a83d0a9c63e43fc4d25cefed1772f7cd"/>
+    <w:bookmarkStart w:id="36" w:name="main-effect-inverted-u-h1"/>
     <w:p>
       <w:pPr>
         <w:pStyle w:val="Heading3"/>
@@ -1013,7 +1013,7 @@
         <w:pStyle w:val="BodyText"/>
       </w:pPr>
       <w:r>
-        <w:t xml:space="preserve">The linear baseline (M1) yields a positive but small FSTS slope (β = +0.219, p = .002). Adding the quadratic term (M2, N=81,022) yields β₁ = +1.188 (p &lt; .001) and β₂ = −1.398 (p &lt; .001), consistent with an inverted-U. Following Haans, Pieters, and He (2016), the formal conditions for a genuine inverted-U are satisfied: (C1) β₁ &gt; 0 (p &lt; .001), a positive ascending limb; (C2) β₂ &lt; 0 (p &lt; .001), concavity; (C3) the turning point TP ≈ 51.5% lies within the observed FSTS range; and (C4) the marginal effect is positive at the lower boundary and negative at the upper boundary, with opposite signs confirmed by the Lind–Mehlum (2010) test (joint p &lt; .001). The turning point tightens as capability is controlled: adding demographic controls (M3) gives TP = 43.8%, and adding technological capability and digital adoption (M4, N=79,080) gives TP = 43.6%, the headline estimate, matching the dissertation's canonical value. The stability of the turning point in the low-to-mid-40% range once capability is held constant indicates that the inverted-U is not an artefact of capability-based selection into exporting.</w:t>
+        <w:t xml:space="preserve">The linear baseline (M1) yields a positive but small FSTS slope (β = +0.219, p = .002). Adding the quadratic term (M2, N=81,022) yields β₁ = +1.188 (p &lt; .001) and β₂ = −1.398 (p &lt; .001), consistent with an inverted-U. Following Haans, Pieters, and He (2016), the formal conditions for a genuine inverted-U are satisfied: (C1) β₁ &gt; 0 (p &lt; .001), a positive ascending limb; (C2) β₂ &lt; 0 (p &lt; .001), concavity; (C3) the turning point TP ≈ 51.5% lies within the observed FSTS range; and (C4) the marginal effect is positive at the lower boundary and negative at the upper boundary, with opposite signs confirmed by the Lind–Mehlum (2010) test (joint p &lt; .001). The turning point tightens as capability is controlled: adding demographic controls (M3) gives TP = 43.8%, and adding technological capability and digital adoption (M4, N=79,080) gives TP = 43.6%, the headline estimate, matching the dissertation’s canonical value. The stability of the turning point in the low-to-mid-40% range once capability is held constant indicates that the inverted-U is not an artefact of capability-based selection into exporting.</w:t>
       </w:r>
     </w:p>
     <w:p>
@@ -1035,7 +1035,7 @@
       </w:r>
     </w:p>
     <w:bookmarkEnd w:id="36"/>
-    <w:bookmarkStart w:id="37" w:name="X9595a9bb339e08d65399a059096afa9ae72a457"/>
+    <w:bookmarkStart w:id="37" w:name="technological-capability-moderation-h2"/>
     <w:p>
       <w:pPr>
         <w:pStyle w:val="Heading3"/>
@@ -1079,11 +1079,11 @@
         <w:t xml:space="preserve"> </w:t>
       </w:r>
       <w:r>
-        <w:t xml:space="preserve">TCI is a foundational level-shifter across the 50-economy pool. The curve-moderation found in single-country studies (P3 Vietnam, P5 China) does not survive aggregation across the institutionally diverse pool, consistent with capability's curve-shaping role being institution-contingent rather than universal.</w:t>
+        <w:t xml:space="preserve">TCI is a foundational level-shifter across the 50-economy pool. The curve-moderation found in single-country studies (P3 Vietnam, P5 China) does not survive aggregation across the institutionally diverse pool, consistent with capability’s curve-shaping role being institution-contingent rather than universal.</w:t>
       </w:r>
     </w:p>
     <w:bookmarkEnd w:id="37"/>
-    <w:bookmarkStart w:id="38" w:name="X151158cb9bb4ce58412a9381bb2aaa4f708d4d3"/>
+    <w:bookmarkStart w:id="38" w:name="digital-adoption-moderation-h3"/>
     <w:p>
       <w:pPr>
         <w:pStyle w:val="Heading3"/>
@@ -1127,11 +1127,29 @@
         <w:t xml:space="preserve"> </w:t>
       </w:r>
       <w:r>
-        <w:t xml:space="preserve">Digital adoption raises firm performance substantially but does not significantly reshape the pooled I–P curve. The "digital shield" effect (DAI attenuating the descending limb) documented in the single-country Singapore study (P4) is not detectable once aggregated across the 50-economy pool, again consistent with the curve-shaping role of digital capability being institution-contingent rather than universal.</w:t>
+        <w:t xml:space="preserve">Digital adoption raises firm performance substantially but does not significantly reshape the pooled I–P curve. The</w:t>
+      </w:r>
+      <w:r>
+        <w:t xml:space="preserve"> </w:t>
+      </w:r>
+      <w:r>
+        <w:t xml:space="preserve">“</w:t>
+      </w:r>
+      <w:r>
+        <w:t xml:space="preserve">digital shield</w:t>
+      </w:r>
+      <w:r>
+        <w:t xml:space="preserve">”</w:t>
+      </w:r>
+      <w:r>
+        <w:t xml:space="preserve"> </w:t>
+      </w:r>
+      <w:r>
+        <w:t xml:space="preserve">effect (DAI attenuating the descending limb) documented in the single-country Singapore study (P4) is not detectable once aggregated across the 50-economy pool, again consistent with the curve-shaping role of digital capability being institution-contingent rather than universal.</w:t>
       </w:r>
     </w:p>
     <w:bookmarkEnd w:id="38"/>
-    <w:bookmarkStart w:id="39" w:name="X8c2848f12d916aaecc7d070f2d4e848d015e61e"/>
+    <w:bookmarkStart w:id="39" w:name="managerial-characteristics-h4-1"/>
     <w:p>
       <w:pPr>
         <w:pStyle w:val="Heading3"/>
@@ -1179,7 +1197,7 @@
       </w:r>
     </w:p>
     <w:bookmarkEnd w:id="39"/>
-    <w:bookmarkStart w:id="40" w:name="Xa3f0408b049fb96786efb222e5b901022bb2da2"/>
+    <w:bookmarkStart w:id="40" w:name="institutional-regime-moderation-h5"/>
     <w:p>
       <w:pPr>
         <w:pStyle w:val="Heading3"/>
@@ -1256,7 +1274,7 @@
           <w:bCs/>
           <w:b/>
         </w:rPr>
-        <w:t xml:space="preserve">Strongest-institution regime (Group I Advanced innovation, incl. Japan): TP ≈ 80%</w:t>
+        <w:t xml:space="preserve">Strongest-institution regime (Group I Advanced innovation, incl. Japan): TP ≈ 80%</w:t>
       </w:r>
       <w:r>
         <w:t xml:space="preserve">: the turning point lies near or beyond the observable range, so within the data the relationship is effectively near-linear and positive.</w:t>
@@ -1300,7 +1318,7 @@
       </w:r>
     </w:p>
     <w:bookmarkEnd w:id="40"/>
-    <w:bookmarkStart w:id="41" w:name="X4660d5a54a4ef3782810124f5d081790225d7d9"/>
+    <w:bookmarkStart w:id="41" w:name="Xf2de05cc7e02b530f3e17a4fce54678274e648b"/>
     <w:p>
       <w:pPr>
         <w:pStyle w:val="Heading3"/>
@@ -1342,7 +1360,7 @@
     </w:p>
     <w:bookmarkEnd w:id="41"/>
     <w:bookmarkEnd w:id="42"/>
-    <w:bookmarkStart w:id="48" w:name="X735612638e4e736e4693e459c258977262c0dfc"/>
+    <w:bookmarkStart w:id="48" w:name="discussion"/>
     <w:p>
       <w:pPr>
         <w:pStyle w:val="Heading2"/>
@@ -1351,7 +1369,7 @@
         <w:t xml:space="preserve">5. Discussion</w:t>
       </w:r>
     </w:p>
-    <w:bookmarkStart w:id="43" w:name="Xdb3d0d0ea2b17533512dc509acb289540c6f5bb"/>
+    <w:bookmarkStart w:id="43" w:name="resolution-of-cross-study-heterogeneity"/>
     <w:p>
       <w:pPr>
         <w:pStyle w:val="Heading3"/>
@@ -1385,7 +1403,7 @@
       </w:r>
     </w:p>
     <w:bookmarkEnd w:id="43"/>
-    <w:bookmarkStart w:id="44" w:name="X3e958d55d5690299d9deebec25f8bb524b314c6"/>
+    <w:bookmarkStart w:id="44" w:name="technology-as-amplifier-not-moderator"/>
     <w:p>
       <w:pPr>
         <w:pStyle w:val="Heading3"/>
@@ -1403,7 +1421,7 @@
       </w:r>
     </w:p>
     <w:bookmarkEnd w:id="44"/>
-    <w:bookmarkStart w:id="45" w:name="Xd4fb1bb7a799c1fc5adcff76c30e3f2326e6be3"/>
+    <w:bookmarkStart w:id="45" w:name="Xb0069601c8d9c89b5e988d028d21202ed31f250"/>
     <w:p>
       <w:pPr>
         <w:pStyle w:val="Heading3"/>
@@ -1417,7 +1435,25 @@
         <w:pStyle w:val="FirstParagraph"/>
       </w:pPr>
       <w:r>
-        <w:t xml:space="preserve">On the canonical specification, digital adoption is the largest single capability level-shifter (DAI = +0.219, p &lt; .001) but does not significantly reshape the pooled I–P curve. This is a more conservative and, we argue, more credible reading than an earlier draft that attributed significant curve-reshaping to DAI: with within-economy-year standardisation and two-way fixed effects absorbing the price-level and selection confounds, the apparent curve-reshaping does not survive. The "digital shield" mechanism, DAI cushioning the descending limb, appears in the single-country Singapore study (P4) but is undetectable in aggregation, indicating that any curve-shaping role of digital adoption is institution-contingent and operates below the resolution of a pooled, Tier-1 (website-only) WBES measure. The policy implication is correspondingly disciplined: digital adoption is a robust lever for raising the productivity</w:t>
+        <w:t xml:space="preserve">On the canonical specification, digital adoption is the largest single capability level-shifter (DAI = +0.219, p &lt; .001) but does not significantly reshape the pooled I–P curve. This is a more conservative and, we argue, more credible reading than an earlier draft that attributed significant curve-reshaping to DAI: with within-economy-year standardisation and two-way fixed effects absorbing the price-level and selection confounds, the apparent curve-reshaping does not survive. The</w:t>
+      </w:r>
+      <w:r>
+        <w:t xml:space="preserve"> </w:t>
+      </w:r>
+      <w:r>
+        <w:t xml:space="preserve">“</w:t>
+      </w:r>
+      <w:r>
+        <w:t xml:space="preserve">digital shield</w:t>
+      </w:r>
+      <w:r>
+        <w:t xml:space="preserve">”</w:t>
+      </w:r>
+      <w:r>
+        <w:t xml:space="preserve"> </w:t>
+      </w:r>
+      <w:r>
+        <w:t xml:space="preserve">mechanism, DAI cushioning the descending limb, appears in the single-country Singapore study (P4) but is undetectable in aggregation, indicating that any curve-shaping role of digital adoption is institution-contingent and operates below the resolution of a pooled, Tier-1 (website-only) WBES measure. The policy implication is correspondingly disciplined: digital adoption is a robust lever for raising the productivity</w:t>
       </w:r>
       <w:r>
         <w:t xml:space="preserve"> </w:t>
@@ -1437,7 +1473,7 @@
       </w:r>
     </w:p>
     <w:bookmarkEnd w:id="45"/>
-    <w:bookmarkStart w:id="46" w:name="X84f38018b3434e120970b4f2e30dde187cbc62e"/>
+    <w:bookmarkStart w:id="46" w:name="managerial-heterogeneity"/>
     <w:p>
       <w:pPr>
         <w:pStyle w:val="Heading3"/>
@@ -1471,7 +1507,7 @@
       </w:r>
     </w:p>
     <w:bookmarkEnd w:id="46"/>
-    <w:bookmarkStart w:id="47" w:name="Xde7edcb3f604b7ff7a62d585547252a5b42f172"/>
+    <w:bookmarkStart w:id="47" w:name="limitations"/>
     <w:p>
       <w:pPr>
         <w:pStyle w:val="Heading3"/>
@@ -1485,7 +1521,25 @@
         <w:pStyle w:val="FirstParagraph"/>
       </w:pPr>
       <w:r>
-        <w:t xml:space="preserve">Three inferential constraints bound these findings. First, WBES is a cross-sectional design: "performance" throughout refers to a contemporaneous association between FSTS and labour productivity in a given survey year, not a panel-tracked causal effect. The IV strategy used in the single-country P3 Vietnam study to address selection into exporting is not available at scale across 50 economies, and capability-based selection into exporting is part of what the capability-adjusted turning point (M4) reveals rather than a nuisance assumed away. Second, the DAI measure is limited to Tier-1 (website) capability in the harmonised pool; the richer digital-capability dimensions captured in more recent BEE-schema waves are not yet available for the majority of economies, which likely contributes to the null curve-reshaping result. Third, the dataset covers all 50 ICRV-mapped economies across six regime groups, including Japan's inaugural 2025 wave; some early waves predate the digital-capability and manager variables, limiting their contribution to the baseline models. Future WBES waves would sharpen the moderation estimates, particularly for the sparser Advanced and SIDS regimes.</w:t>
+        <w:t xml:space="preserve">Three inferential constraints bound these findings. First, WBES is a cross-sectional design:</w:t>
+      </w:r>
+      <w:r>
+        <w:t xml:space="preserve"> </w:t>
+      </w:r>
+      <w:r>
+        <w:t xml:space="preserve">“</w:t>
+      </w:r>
+      <w:r>
+        <w:t xml:space="preserve">performance</w:t>
+      </w:r>
+      <w:r>
+        <w:t xml:space="preserve">”</w:t>
+      </w:r>
+      <w:r>
+        <w:t xml:space="preserve"> </w:t>
+      </w:r>
+      <w:r>
+        <w:t xml:space="preserve">throughout refers to a contemporaneous association between FSTS and labour productivity in a given survey year, not a panel-tracked causal effect. The IV strategy used in the single-country P3 Vietnam study to address selection into exporting is not available at scale across 50 economies, and capability-based selection into exporting is part of what the capability-adjusted turning point (M4) reveals rather than a nuisance assumed away. Second, the DAI measure is limited to Tier-1 (website) capability in the harmonised pool; the richer digital-capability dimensions captured in more recent BEE-schema waves are not yet available for the majority of economies, which likely contributes to the null curve-reshaping result. Third, the dataset covers all 50 ICRV-mapped economies across six regime groups, including Japan’s inaugural 2025 wave; some early waves predate the digital-capability and manager variables, limiting their contribution to the baseline models. Future WBES waves would sharpen the moderation estimates, particularly for the sparser Advanced and SIDS regimes.</w:t>
       </w:r>
     </w:p>
     <w:p>
@@ -1497,7 +1551,7 @@
     </w:p>
     <w:bookmarkEnd w:id="47"/>
     <w:bookmarkEnd w:id="48"/>
-    <w:bookmarkStart w:id="49" w:name="X56025c6d9dbf7520f7a7df11f905cdd09f46e4a"/>
+    <w:bookmarkStart w:id="49" w:name="conclusions"/>
     <w:p>
       <w:pPr>
         <w:pStyle w:val="Heading2"/>
@@ -1511,7 +1565,7 @@
         <w:pStyle w:val="FirstParagraph"/>
       </w:pPr>
       <w:r>
-        <w:t xml:space="preserve">We find that the inverted-U I–P relationship holds robustly across a 50-economy, 103-wave WBES sample (including Japan's inaugural 2025 wave), with a capability-adjusted turning point of 43.6% foreign sales intensity. Three conclusions are policy-relevant. First, for firms in the ascending phase (FSTS &lt; 43.6%), intensifying internationalization is productivity-enhancing; the priority is removing barriers to export expansion. For firms beyond the turning point, the constraint is not market access but coordination capacity. Second, both technological capability and digital adoption raise the performance level substantially across all FSTS levels without reliably reshaping the curve; policy should target capability building as a baseline performance lever rather than as a curve-shifting intervention. Third, and most important, it is institutional regime, not capability, that determines the shape of the curve: the inverted-U is sharp in transition economies (turning point ≈ 43%), straightens toward near-linearity in the strongest-institution economies (peak beyond the observable range), and dissolves in the weakest regimes, reversing into a Forced Internationalization Penalty in the Pacific SIDS group. Context-contingent policy must therefore differ by zone, not merely by where a common peak falls.</w:t>
+        <w:t xml:space="preserve">We find that the inverted-U I–P relationship holds robustly across a 50-economy, 103-wave WBES sample (including Japan’s inaugural 2025 wave), with a capability-adjusted turning point of 43.6% foreign sales intensity. Three conclusions are policy-relevant. First, for firms in the ascending phase (FSTS &lt; 43.6%), intensifying internationalization is productivity-enhancing; the priority is removing barriers to export expansion. For firms beyond the turning point, the constraint is not market access but coordination capacity. Second, both technological capability and digital adoption raise the performance level substantially across all FSTS levels without reliably reshaping the curve; policy should target capability building as a baseline performance lever rather than as a curve-shifting intervention. Third, and most important, it is institutional regime, not capability, that determines the shape of the curve: the inverted-U is sharp in transition economies (turning point ≈ 43%), straightens toward near-linearity in the strongest-institution economies (peak beyond the observable range), and dissolves in the weakest regimes, reversing into a Forced Internationalization Penalty in the Pacific SIDS group. Context-contingent policy must therefore differ by zone, not merely by where a common peak falls.</w:t>
       </w:r>
     </w:p>
     <w:p>
@@ -1538,7 +1592,7 @@
       </w:r>
     </w:p>
     <w:bookmarkEnd w:id="49"/>
-    <w:bookmarkStart w:id="73" w:name="references"/>
+    <w:bookmarkStart w:id="50" w:name="references"/>
     <w:p>
       <w:pPr>
         <w:pStyle w:val="Heading2"/>
@@ -1586,19 +1640,8 @@
         <w:t xml:space="preserve">Journal of Management, 17</w:t>
       </w:r>
       <w:r>
-        <w:t xml:space="preserve">(1), 99–120.</w:t>
-      </w:r>
-      <w:r>
-        <w:t xml:space="preserve"> </w:t>
-      </w:r>
-      <w:hyperlink r:id="rId50">
-        <w:r>
-          <w:rPr>
-            <w:rStyle w:val="Hyperlink"/>
-          </w:rPr>
-          <w:t xml:space="preserve">https://doi.org/10.1177/014920639101700108</w:t>
-        </w:r>
-      </w:hyperlink>
+        <w:t xml:space="preserve">(1), 99–120. https://doi.org/10.1177/014920639101700108</w:t>
+      </w:r>
     </w:p>
     <w:p>
       <w:pPr>
@@ -1642,19 +1685,8 @@
         <w:t xml:space="preserve">Management International Review, 47</w:t>
       </w:r>
       <w:r>
-        <w:t xml:space="preserve">(3), 319–347.</w:t>
-      </w:r>
-      <w:r>
-        <w:t xml:space="preserve"> </w:t>
-      </w:r>
-      <w:hyperlink r:id="rId51">
-        <w:r>
-          <w:rPr>
-            <w:rStyle w:val="Hyperlink"/>
-          </w:rPr>
-          <w:t xml:space="preserve">https://doi.org/10.1007/s11575-007-0019-z</w:t>
-        </w:r>
-      </w:hyperlink>
+        <w:t xml:space="preserve">(3), 319–347. https://doi.org/10.1007/s11575-007-0019-z</w:t>
+      </w:r>
     </w:p>
     <w:p>
       <w:pPr>
@@ -1674,19 +1706,8 @@
         <w:t xml:space="preserve">Small Business Economics, 26</w:t>
       </w:r>
       <w:r>
-        <w:t xml:space="preserve">(5), 475–492.</w:t>
-      </w:r>
-      <w:r>
-        <w:t xml:space="preserve"> </w:t>
-      </w:r>
-      <w:hyperlink r:id="rId52">
-        <w:r>
-          <w:rPr>
-            <w:rStyle w:val="Hyperlink"/>
-          </w:rPr>
-          <w:t xml:space="preserve">https://doi.org/10.1007/s11187-005-5599-z</w:t>
-        </w:r>
-      </w:hyperlink>
+        <w:t xml:space="preserve">(5), 475–492. https://doi.org/10.1007/s11187-005-5599-z</w:t>
+      </w:r>
     </w:p>
     <w:p>
       <w:pPr>
@@ -1727,19 +1748,8 @@
         <w:t xml:space="preserve">Administrative Science Quarterly, 35</w:t>
       </w:r>
       <w:r>
-        <w:t xml:space="preserve">(1), 128–152.</w:t>
-      </w:r>
-      <w:r>
-        <w:t xml:space="preserve"> </w:t>
-      </w:r>
-      <w:hyperlink r:id="rId53">
-        <w:r>
-          <w:rPr>
-            <w:rStyle w:val="Hyperlink"/>
-          </w:rPr>
-          <w:t xml:space="preserve">https://doi.org/10.2307/2393553</w:t>
-        </w:r>
-      </w:hyperlink>
+        <w:t xml:space="preserve">(1), 128–152. https://doi.org/10.2307/2393553</w:t>
+      </w:r>
     </w:p>
     <w:p>
       <w:pPr>
@@ -1759,19 +1769,8 @@
         <w:t xml:space="preserve">Journal of International Business Studies, 34</w:t>
       </w:r>
       <w:r>
-        <w:t xml:space="preserve">(1), 5–18.</w:t>
-      </w:r>
-      <w:r>
-        <w:t xml:space="preserve"> </w:t>
-      </w:r>
-      <w:hyperlink r:id="rId54">
-        <w:r>
-          <w:rPr>
-            <w:rStyle w:val="Hyperlink"/>
-          </w:rPr>
-          <w:t xml:space="preserve">https://doi.org/10.1057/palgrave.jibs.8400003</w:t>
-        </w:r>
-      </w:hyperlink>
+        <w:t xml:space="preserve">(1), 5–18. https://doi.org/10.1057/palgrave.jibs.8400003</w:t>
+      </w:r>
     </w:p>
     <w:p>
       <w:pPr>
@@ -1791,19 +1790,8 @@
         <w:t xml:space="preserve">Journal of World Business, 42</w:t>
       </w:r>
       <w:r>
-        <w:t xml:space="preserve">(4), 401–417.</w:t>
-      </w:r>
-      <w:r>
-        <w:t xml:space="preserve"> </w:t>
-      </w:r>
-      <w:hyperlink r:id="rId55">
-        <w:r>
-          <w:rPr>
-            <w:rStyle w:val="Hyperlink"/>
-          </w:rPr>
-          <w:t xml:space="preserve">https://doi.org/10.1016/j.jwb.2007.06.003</w:t>
-        </w:r>
-      </w:hyperlink>
+        <w:t xml:space="preserve">(4), 401–417. https://doi.org/10.1016/j.jwb.2007.06.003</w:t>
+      </w:r>
     </w:p>
     <w:p>
       <w:pPr>
@@ -1823,19 +1811,8 @@
         <w:t xml:space="preserve">Journal of World Business, 53</w:t>
       </w:r>
       <w:r>
-        <w:t xml:space="preserve">(2), 209–221.</w:t>
-      </w:r>
-      <w:r>
-        <w:t xml:space="preserve"> </w:t>
-      </w:r>
-      <w:hyperlink r:id="rId56">
-        <w:r>
-          <w:rPr>
-            <w:rStyle w:val="Hyperlink"/>
-          </w:rPr>
-          <w:t xml:space="preserve">https://doi.org/10.1016/j.jwb.2017.11.003</w:t>
-        </w:r>
-      </w:hyperlink>
+        <w:t xml:space="preserve">(2), 209–221. https://doi.org/10.1016/j.jwb.2017.11.003</w:t>
+      </w:r>
     </w:p>
     <w:p>
       <w:pPr>
@@ -1855,19 +1832,8 @@
         <w:t xml:space="preserve">Journal of Business and Psychology, 29</w:t>
       </w:r>
       <w:r>
-        <w:t xml:space="preserve">(1), 1–19.</w:t>
-      </w:r>
-      <w:r>
-        <w:t xml:space="preserve"> </w:t>
-      </w:r>
-      <w:hyperlink r:id="rId57">
-        <w:r>
-          <w:rPr>
-            <w:rStyle w:val="Hyperlink"/>
-          </w:rPr>
-          <w:t xml:space="preserve">https://doi.org/10.1007/s10869-013-9308-7</w:t>
-        </w:r>
-      </w:hyperlink>
+        <w:t xml:space="preserve">(1), 1–19. https://doi.org/10.1007/s10869-013-9308-7</w:t>
+      </w:r>
     </w:p>
     <w:p>
       <w:pPr>
@@ -1908,19 +1874,8 @@
         <w:t xml:space="preserve">Journal of International Business Studies, 30</w:t>
       </w:r>
       <w:r>
-        <w:t xml:space="preserve">(1), 173–187.</w:t>
-      </w:r>
-      <w:r>
-        <w:t xml:space="preserve"> </w:t>
-      </w:r>
-      <w:hyperlink r:id="rId58">
-        <w:r>
-          <w:rPr>
-            <w:rStyle w:val="Hyperlink"/>
-          </w:rPr>
-          <w:t xml:space="preserve">https://doi.org/10.1057/palgrave.jibs.8490065</w:t>
-        </w:r>
-      </w:hyperlink>
+        <w:t xml:space="preserve">(1), 173–187. https://doi.org/10.1057/palgrave.jibs.8490065</w:t>
+      </w:r>
     </w:p>
     <w:p>
       <w:pPr>
@@ -1940,19 +1895,8 @@
         <w:t xml:space="preserve">Strategic Management Journal, 37</w:t>
       </w:r>
       <w:r>
-        <w:t xml:space="preserve">(7), 1177–1195.</w:t>
-      </w:r>
-      <w:r>
-        <w:t xml:space="preserve"> </w:t>
-      </w:r>
-      <w:hyperlink r:id="rId59">
-        <w:r>
-          <w:rPr>
-            <w:rStyle w:val="Hyperlink"/>
-          </w:rPr>
-          <w:t xml:space="preserve">https://doi.org/10.1002/smj.2399</w:t>
-        </w:r>
-      </w:hyperlink>
+        <w:t xml:space="preserve">(7), 1177–1195. https://doi.org/10.1002/smj.2399</w:t>
+      </w:r>
     </w:p>
     <w:p>
       <w:pPr>
@@ -1972,19 +1916,8 @@
         <w:t xml:space="preserve">Academy of Management Review, 32</w:t>
       </w:r>
       <w:r>
-        <w:t xml:space="preserve">(2), 334–343.</w:t>
-      </w:r>
-      <w:r>
-        <w:t xml:space="preserve"> </w:t>
-      </w:r>
-      <w:hyperlink r:id="rId60">
-        <w:r>
-          <w:rPr>
-            <w:rStyle w:val="Hyperlink"/>
-          </w:rPr>
-          <w:t xml:space="preserve">https://doi.org/10.5465/amr.2007.24345254</w:t>
-        </w:r>
-      </w:hyperlink>
+        <w:t xml:space="preserve">(2), 334–343. https://doi.org/10.5465/amr.2007.24345254</w:t>
+      </w:r>
     </w:p>
     <w:p>
       <w:pPr>
@@ -2004,19 +1937,8 @@
         <w:t xml:space="preserve">Academy of Management Review, 9</w:t>
       </w:r>
       <w:r>
-        <w:t xml:space="preserve">(2), 193–206.</w:t>
-      </w:r>
-      <w:r>
-        <w:t xml:space="preserve"> </w:t>
-      </w:r>
-      <w:hyperlink r:id="rId61">
-        <w:r>
-          <w:rPr>
-            <w:rStyle w:val="Hyperlink"/>
-          </w:rPr>
-          <w:t xml:space="preserve">https://doi.org/10.5465/amr.1984.4277628</w:t>
-        </w:r>
-      </w:hyperlink>
+        <w:t xml:space="preserve">(2), 193–206. https://doi.org/10.5465/amr.1984.4277628</w:t>
+      </w:r>
     </w:p>
     <w:p>
       <w:pPr>
@@ -2033,7 +1955,7 @@
           <w:iCs/>
           <w:i/>
         </w:rPr>
-        <w:t xml:space="preserve">Mind the gaps: Women in leadership in Viet Nam's banking sector</w:t>
+        <w:t xml:space="preserve">Mind the gaps: Women in leadership in Viet Nam’s banking sector</w:t>
       </w:r>
       <w:r>
         <w:t xml:space="preserve">. IFC, World Bank Group.</w:t>
@@ -2057,19 +1979,8 @@
         <w:t xml:space="preserve">Journal of International Business Studies, 8</w:t>
       </w:r>
       <w:r>
-        <w:t xml:space="preserve">(1), 23–32.</w:t>
-      </w:r>
-      <w:r>
-        <w:t xml:space="preserve"> </w:t>
-      </w:r>
-      <w:hyperlink r:id="rId62">
-        <w:r>
-          <w:rPr>
-            <w:rStyle w:val="Hyperlink"/>
-          </w:rPr>
-          <w:t xml:space="preserve">https://doi.org/10.1057/palgrave.jibs.8490676</w:t>
-        </w:r>
-      </w:hyperlink>
+        <w:t xml:space="preserve">(1), 23–32. https://doi.org/10.1057/palgrave.jibs.8490676</w:t>
+      </w:r>
     </w:p>
     <w:p>
       <w:pPr>
@@ -2089,19 +2000,8 @@
         <w:t xml:space="preserve">Journal of International Business Studies, 40</w:t>
       </w:r>
       <w:r>
-        <w:t xml:space="preserve">(9), 1411–1431.</w:t>
-      </w:r>
-      <w:r>
-        <w:t xml:space="preserve"> </w:t>
-      </w:r>
-      <w:hyperlink r:id="rId63">
-        <w:r>
-          <w:rPr>
-            <w:rStyle w:val="Hyperlink"/>
-          </w:rPr>
-          <w:t xml:space="preserve">https://doi.org/10.1057/jibs.2009.24</w:t>
-        </w:r>
-      </w:hyperlink>
+        <w:t xml:space="preserve">(9), 1411–1431. https://doi.org/10.1057/jibs.2009.24</w:t>
+      </w:r>
     </w:p>
     <w:p>
       <w:pPr>
@@ -2121,19 +2021,8 @@
         <w:t xml:space="preserve">Global Strategy Journal, 2</w:t>
       </w:r>
       <w:r>
-        <w:t xml:space="preserve">(2), 108–121.</w:t>
-      </w:r>
-      <w:r>
-        <w:t xml:space="preserve"> </w:t>
-      </w:r>
-      <w:hyperlink r:id="rId64">
-        <w:r>
-          <w:rPr>
-            <w:rStyle w:val="Hyperlink"/>
-          </w:rPr>
-          <w:t xml:space="preserve">https://doi.org/10.1002/gsj.1028</w:t>
-        </w:r>
-      </w:hyperlink>
+        <w:t xml:space="preserve">(2), 108–121. https://doi.org/10.1002/gsj.1028</w:t>
+      </w:r>
     </w:p>
     <w:p>
       <w:pPr>
@@ -2153,19 +2042,8 @@
         <w:t xml:space="preserve">Oxford Bulletin of Economics and Statistics, 72</w:t>
       </w:r>
       <w:r>
-        <w:t xml:space="preserve">(1), 109–118.</w:t>
-      </w:r>
-      <w:r>
-        <w:t xml:space="preserve"> </w:t>
-      </w:r>
-      <w:hyperlink r:id="rId65">
-        <w:r>
-          <w:rPr>
-            <w:rStyle w:val="Hyperlink"/>
-          </w:rPr>
-          <w:t xml:space="preserve">https://doi.org/10.1111/j.1468-0084.2009.00569.x</w:t>
-        </w:r>
-      </w:hyperlink>
+        <w:t xml:space="preserve">(1), 109–118. https://doi.org/10.1111/j.1468-0084.2009.00569.x</w:t>
+      </w:r>
     </w:p>
     <w:p>
       <w:pPr>
@@ -2185,19 +2063,8 @@
         <w:t xml:space="preserve">Academy of Management Journal, 47</w:t>
       </w:r>
       <w:r>
-        <w:t xml:space="preserve">(4), 598–609.</w:t>
-      </w:r>
-      <w:r>
-        <w:t xml:space="preserve"> </w:t>
-      </w:r>
-      <w:hyperlink r:id="rId66">
-        <w:r>
-          <w:rPr>
-            <w:rStyle w:val="Hyperlink"/>
-          </w:rPr>
-          <w:t xml:space="preserve">https://doi.org/10.2307/20159604</w:t>
-        </w:r>
-      </w:hyperlink>
+        <w:t xml:space="preserve">(4), 598–609. https://doi.org/10.2307/20159604</w:t>
+      </w:r>
     </w:p>
     <w:p>
       <w:pPr>
@@ -2217,19 +2084,8 @@
         <w:t xml:space="preserve">Journal of International Business Studies, 47</w:t>
       </w:r>
       <w:r>
-        <w:t xml:space="preserve">(3), 386–408.</w:t>
-      </w:r>
-      <w:r>
-        <w:t xml:space="preserve"> </w:t>
-      </w:r>
-      <w:hyperlink r:id="rId67">
-        <w:r>
-          <w:rPr>
-            <w:rStyle w:val="Hyperlink"/>
-          </w:rPr>
-          <w:t xml:space="preserve">https://doi.org/10.1057/jibs.2016.7</w:t>
-        </w:r>
-      </w:hyperlink>
+        <w:t xml:space="preserve">(3), 386–408. https://doi.org/10.1057/jibs.2016.7</w:t>
+      </w:r>
     </w:p>
     <w:p>
       <w:pPr>
@@ -2291,19 +2147,8 @@
         <w:t xml:space="preserve">Journal of World Business, 43</w:t>
       </w:r>
       <w:r>
-        <w:t xml:space="preserve">(4), 475–485.</w:t>
-      </w:r>
-      <w:r>
-        <w:t xml:space="preserve"> </w:t>
-      </w:r>
-      <w:hyperlink r:id="rId68">
-        <w:r>
-          <w:rPr>
-            <w:rStyle w:val="Hyperlink"/>
-          </w:rPr>
-          <w:t xml:space="preserve">https://doi.org/10.1016/j.jwb.2007.11.009</w:t>
-        </w:r>
-      </w:hyperlink>
+        <w:t xml:space="preserve">(4), 475–485. https://doi.org/10.1016/j.jwb.2007.11.009</w:t>
+      </w:r>
     </w:p>
     <w:p>
       <w:pPr>
@@ -2368,19 +2213,8 @@
         <w:t xml:space="preserve">Global Strategy Journal, 11</w:t>
       </w:r>
       <w:r>
-        <w:t xml:space="preserve">(1), 58–80.</w:t>
-      </w:r>
-      <w:r>
-        <w:t xml:space="preserve"> </w:t>
-      </w:r>
-      <w:hyperlink r:id="rId69">
-        <w:r>
-          <w:rPr>
-            <w:rStyle w:val="Hyperlink"/>
-          </w:rPr>
-          <w:t xml:space="preserve">https://doi.org/10.1002/gsj.1336</w:t>
-        </w:r>
-      </w:hyperlink>
+        <w:t xml:space="preserve">(1), 58–80. https://doi.org/10.1002/gsj.1336</w:t>
+      </w:r>
     </w:p>
     <w:p>
       <w:pPr>
@@ -2421,19 +2255,8 @@
         <w:t xml:space="preserve">Journal of Business Research, 122</w:t>
       </w:r>
       <w:r>
-        <w:t xml:space="preserve">, 889–901.</w:t>
-      </w:r>
-      <w:r>
-        <w:t xml:space="preserve"> </w:t>
-      </w:r>
-      <w:hyperlink r:id="rId70">
-        <w:r>
-          <w:rPr>
-            <w:rStyle w:val="Hyperlink"/>
-          </w:rPr>
-          <w:t xml:space="preserve">https://doi.org/10.1016/j.jbusres.2019.09.022</w:t>
-        </w:r>
-      </w:hyperlink>
+        <w:t xml:space="preserve">, 889–901. https://doi.org/10.1016/j.jbusres.2019.09.022</w:t>
+      </w:r>
     </w:p>
     <w:p>
       <w:pPr>
@@ -2453,19 +2276,8 @@
         <w:t xml:space="preserve">Strategic Management Journal, 5</w:t>
       </w:r>
       <w:r>
-        <w:t xml:space="preserve">(2), 171–180.</w:t>
-      </w:r>
-      <w:r>
-        <w:t xml:space="preserve"> </w:t>
-      </w:r>
-      <w:hyperlink r:id="rId71">
-        <w:r>
-          <w:rPr>
-            <w:rStyle w:val="Hyperlink"/>
-          </w:rPr>
-          <w:t xml:space="preserve">https://doi.org/10.1002/smj.4250050207</w:t>
-        </w:r>
-      </w:hyperlink>
+        <w:t xml:space="preserve">(2), 171–180. https://doi.org/10.1002/smj.4250050207</w:t>
+      </w:r>
     </w:p>
     <w:p>
       <w:pPr>
@@ -2485,19 +2297,8 @@
         <w:t xml:space="preserve">Enterprise surveys</w:t>
       </w:r>
       <w:r>
-        <w:t xml:space="preserve">.</w:t>
-      </w:r>
-      <w:r>
-        <w:t xml:space="preserve"> </w:t>
-      </w:r>
-      <w:hyperlink r:id="rId72">
-        <w:r>
-          <w:rPr>
-            <w:rStyle w:val="Hyperlink"/>
-          </w:rPr>
-          <w:t xml:space="preserve">https://www.enterprisesurveys.org</w:t>
-        </w:r>
-      </w:hyperlink>
+        <w:t xml:space="preserve">. https://www.enterprisesurveys.org</w:t>
+      </w:r>
     </w:p>
     <w:p>
       <w:pPr>
@@ -2527,8 +2328,8 @@
         </w:pict>
       </w:r>
     </w:p>
-    <w:bookmarkEnd w:id="73"/>
-    <w:bookmarkStart w:id="74" w:name="appendix-a-model-sequence"/>
+    <w:bookmarkEnd w:id="50"/>
+    <w:bookmarkStart w:id="51" w:name="appendix-a-model-sequence"/>
     <w:p>
       <w:pPr>
         <w:pStyle w:val="Heading2"/>
@@ -2552,7 +2353,7 @@
     <w:tbl>
       <w:tblPr>
         <w:tblStyle w:val="Table"/>
-        <w:tblW w:type="auto" w:w="0"/>
+        <w:tblW w:type="pct" w:w="5000"/>
         <w:tblLook w:firstRow="1" w:lastRow="0" w:firstColumn="0" w:lastColumn="0" w:noHBand="0" w:noVBand="0" w:val="0020"/>
         <w:jc w:val="start"/>
       </w:tblPr>
@@ -2736,19 +2537,19 @@
               <w:jc w:val="left"/>
             </w:pPr>
             <w:r>
-              <w:t xml:space="preserve">Tech capability index (R&amp;D + ISO certification), z-scored within economy-year</w:t>
-            </w:r>
-          </w:p>
-        </w:tc>
-        <w:tc>
-          <w:tcPr/>
-          <w:p>
-            <w:pPr>
-              <w:pStyle w:val="Compact"/>
-              <w:jc w:val="left"/>
-            </w:pPr>
-            <w:r>
-              <w:t xml:space="preserve">h8, b8</w:t>
+              <w:t xml:space="preserve">Tech capability index (quality certification + foreign technology), z-scored within economy-year</w:t>
+            </w:r>
+          </w:p>
+        </w:tc>
+        <w:tc>
+          <w:tcPr/>
+          <w:p>
+            <w:pPr>
+              <w:pStyle w:val="Compact"/>
+              <w:jc w:val="left"/>
+            </w:pPr>
+            <w:r>
+              <w:t xml:space="preserve">b8, e6</w:t>
             </w:r>
           </w:p>
         </w:tc>
@@ -3187,7 +2988,7 @@
     <w:tbl>
       <w:tblPr>
         <w:tblStyle w:val="Table"/>
-        <w:tblW w:type="auto" w:w="0"/>
+        <w:tblW w:type="pct" w:w="5000"/>
         <w:tblLook w:firstRow="1" w:lastRow="0" w:firstColumn="0" w:lastColumn="0" w:noHBand="0" w:noVBand="0" w:val="0020"/>
         <w:jc w:val="start"/>
       </w:tblPr>
@@ -3817,7 +3618,7 @@
     <w:tbl>
       <w:tblPr>
         <w:tblStyle w:val="Table"/>
-        <w:tblW w:type="auto" w:w="0"/>
+        <w:tblW w:type="pct" w:w="5000"/>
         <w:tblLook w:firstRow="1" w:lastRow="0" w:firstColumn="0" w:lastColumn="0" w:noHBand="0" w:noVBand="0" w:val="0020"/>
         <w:jc w:val="start"/>
       </w:tblPr>
@@ -5089,7 +4890,7 @@
     <w:tbl>
       <w:tblPr>
         <w:tblStyle w:val="Table"/>
-        <w:tblW w:type="auto" w:w="0"/>
+        <w:tblW w:type="pct" w:w="5000"/>
         <w:tblLook w:firstRow="1" w:lastRow="0" w:firstColumn="0" w:lastColumn="0" w:noHBand="0" w:noVBand="0" w:val="0020"/>
         <w:jc w:val="start"/>
       </w:tblPr>
@@ -5187,7 +4988,7 @@
               <w:jc w:val="left"/>
             </w:pPr>
             <w:r>
-              <w:t xml:space="preserve">I Advanced innovation (incl. Japan)</w:t>
+              <w:t xml:space="preserve">I Advanced innovation (incl. Japan)</w:t>
             </w:r>
           </w:p>
         </w:tc>
@@ -5642,7 +5443,7 @@
         <w:t xml:space="preserve"> </w:t>
       </w:r>
       <w:r>
-        <w:t xml:space="preserve">Within-group quadratic with controls and two-way FE. The three-zone structure (sharp in the transition regime, near-linear at the top, dissolving at the bottom) is the paper's central institutional finding. Consistent with the dissertation's canonical per-ICRV values.</w:t>
+        <w:t xml:space="preserve">Within-group quadratic with controls and two-way FE. The three-zone structure (sharp in the transition regime, near-linear at the top, dissolving at the bottom) is the paper’s central institutional finding. Consistent with the dissertation’s canonical per-ICRV values.</w:t>
       </w:r>
     </w:p>
     <w:p>
@@ -5652,8 +5453,8 @@
         </w:pict>
       </w:r>
     </w:p>
-    <w:bookmarkEnd w:id="74"/>
-    <w:bookmarkStart w:id="77" w:name="X09b5d89c7c8f35bf9d25d1bfe47da72b2ba58bf"/>
+    <w:bookmarkEnd w:id="51"/>
+    <w:bookmarkStart w:id="52" w:name="X09b5d89c7c8f35bf9d25d1bfe47da72b2ba58bf"/>
     <w:p>
       <w:pPr>
         <w:pStyle w:val="Heading2"/>
@@ -5679,7 +5480,7 @@
         <w:t xml:space="preserve">replication/Annex_TFP_regression_tables_March_11_2026.xlsx</w:t>
       </w:r>
       <w:r>
-        <w:t xml:space="preserve">. TFP residuals from these regressions can be used as an alternative dependent variable to ln(LP) to test whether the inverted-U relationship is robust to output-per-worker vs. total-factor productivity operationalisations.</w:t>
+        <w:t xml:space="preserve">. TFP residuals from these regressions can be used as an alternative dependent variable to ln(LP) to test whether the inverted-U relationship is robust to output-per-worker vs. total-factor productivity operationalisations.</w:t>
       </w:r>
     </w:p>
     <w:p>
@@ -5698,69 +5499,21 @@
           <w:iCs/>
           <w:i/>
         </w:rPr>
-        <w:t xml:space="preserve">Corresponding author: Phan Anh Tu, College of Economics, Can Tho University,</w:t>
+        <w:t xml:space="preserve">Corresponding author: Phan Anh Tu, College of Economics, Can Tho University, patu@ctu.edu.vn, ORCID: 0000-0003-0667-3137</w:t>
+      </w:r>
+      <w:r>
+        <w:br/>
       </w:r>
       <w:r>
         <w:rPr>
           <w:iCs/>
           <w:i/>
         </w:rPr>
-        <w:t xml:space="preserve"> </w:t>
-      </w:r>
-      <w:hyperlink r:id="rId75">
-        <w:r>
-          <w:rPr>
-            <w:rStyle w:val="Hyperlink"/>
-            <w:iCs/>
-            <w:i/>
-          </w:rPr>
-          <w:t xml:space="preserve">patu@ctu.edu.vn</w:t>
-        </w:r>
-      </w:hyperlink>
-      <w:r>
-        <w:rPr>
-          <w:iCs/>
-          <w:i/>
-        </w:rPr>
-        <w:t xml:space="preserve">, ORCID: 0000-0003-0667-3137</w:t>
-      </w:r>
-      <w:r>
-        <w:br/>
-      </w:r>
-      <w:r>
-        <w:rPr>
-          <w:iCs/>
-          <w:i/>
-        </w:rPr>
-        <w:t xml:space="preserve">First author: Do Thuy Huong, Vinh Long University of Technology Education,</w:t>
-      </w:r>
-      <w:r>
-        <w:rPr>
-          <w:iCs/>
-          <w:i/>
-        </w:rPr>
-        <w:t xml:space="preserve"> </w:t>
-      </w:r>
-      <w:hyperlink r:id="rId76">
-        <w:r>
-          <w:rPr>
-            <w:rStyle w:val="Hyperlink"/>
-            <w:iCs/>
-            <w:i/>
-          </w:rPr>
-          <w:t xml:space="preserve">huongdt@vlute.edu.vn</w:t>
-        </w:r>
-      </w:hyperlink>
-      <w:r>
-        <w:rPr>
-          <w:iCs/>
-          <w:i/>
-        </w:rPr>
-        <w:t xml:space="preserve">, ORCID: 0000-0002-7711-2487</w:t>
-      </w:r>
-    </w:p>
-    <w:bookmarkEnd w:id="77"/>
-    <w:bookmarkEnd w:id="78"/>
+        <w:t xml:space="preserve">First author: Do Thuy Huong, Vinh Long University of Technology Education, huongdt@vlute.edu.vn, ORCID: 0000-0002-7711-2487</w:t>
+      </w:r>
+    </w:p>
+    <w:bookmarkEnd w:id="52"/>
+    <w:bookmarkEnd w:id="53"/>
     <w:sectPr>
       <w:pgSz w:h="16838" w:w="11906"/>
       <w:pgMar w:bottom="1417" w:left="1417" w:right="1417" w:top="1417"/>

</xml_diff>